<commit_message>
feat: implementación de generación de informes técnicos de anuncios en Word
</commit_message>
<xml_diff>
--- a/app/Filament/Clusters/Sil/Resources/Anuncios/Template/template_informe_anuncio.docx
+++ b/app/Filament/Clusters/Sil/Resources/Anuncios/Template/template_informe_anuncio.docx
@@ -149,7 +149,7 @@
           <w:u w:val="single"/>
           <w:lang w:val="en-US"/>
         </w:rPr>
-        <w:t>{{N_INFORME_TECNICO}}</w:t>
+        <w:t>${</w:t>
       </w:r>
       <w:r>
         <w:rPr>
@@ -160,7 +160,7 @@
           <w:u w:val="single"/>
           <w:lang w:val="en-US"/>
         </w:rPr>
-        <w:t xml:space="preserve"> </w:t>
+        <w:t>N_INFORME_TECNICO</w:t>
       </w:r>
       <w:r>
         <w:rPr>
@@ -171,7 +171,7 @@
           <w:u w:val="single"/>
           <w:lang w:val="en-US"/>
         </w:rPr>
-        <w:t>-MDLM-GDEIP-SPEA-</w:t>
+        <w:t>}</w:t>
       </w:r>
       <w:r>
         <w:rPr>
@@ -182,7 +182,18 @@
           <w:u w:val="single"/>
           <w:lang w:val="en-US"/>
         </w:rPr>
-        <w:t>APBD</w:t>
+        <w:t xml:space="preserve"> </w:t>
+      </w:r>
+      <w:r>
+        <w:rPr>
+          <w:rFonts w:ascii="Arial" w:hAnsi="Arial" w:cs="Arial"/>
+          <w:b/>
+          <w:sz w:val="20"/>
+          <w:szCs w:val="20"/>
+          <w:u w:val="single"/>
+          <w:lang w:val="en-US"/>
+        </w:rPr>
+        <w:t>-MDLM-GDEIP-SPEA-APBD</w:t>
       </w:r>
     </w:p>
     <w:p>
@@ -330,16 +341,7 @@
                 <w:sz w:val="20"/>
                 <w:szCs w:val="20"/>
               </w:rPr>
-              <w:t xml:space="preserve">DIANA PATRICIA REYES </w:t>
-            </w:r>
-            <w:r>
-              <w:rPr>
-                <w:rFonts w:ascii="Arial Narrow" w:eastAsia="Arial" w:hAnsi="Arial Narrow" w:cs="Arial"/>
-                <w:b/>
-                <w:sz w:val="20"/>
-                <w:szCs w:val="20"/>
-              </w:rPr>
-              <w:t>CAMPOS</w:t>
+              <w:t>DIANA PATRICIA REYES CAMPOS</w:t>
             </w:r>
             <w:r>
               <w:rPr>
@@ -817,7 +819,25 @@
                 <w:sz w:val="20"/>
                 <w:szCs w:val="20"/>
               </w:rPr>
-              <w:t xml:space="preserve"> {{N_EXPEDIENTE}}</w:t>
+              <w:t xml:space="preserve"> </w:t>
+            </w:r>
+            <w:r>
+              <w:rPr>
+                <w:rFonts w:ascii="Arial Narrow" w:eastAsia="Arial" w:hAnsi="Arial Narrow" w:cs="Arial"/>
+                <w:color w:val="000000"/>
+                <w:sz w:val="20"/>
+                <w:szCs w:val="20"/>
+              </w:rPr>
+              <w:t>$</w:t>
+            </w:r>
+            <w:r>
+              <w:rPr>
+                <w:rFonts w:ascii="Arial Narrow" w:eastAsia="Arial" w:hAnsi="Arial Narrow" w:cs="Arial"/>
+                <w:color w:val="000000"/>
+                <w:sz w:val="20"/>
+                <w:szCs w:val="20"/>
+              </w:rPr>
+              <w:t>{N_EXPEDIENTE}</w:t>
             </w:r>
           </w:p>
           <w:p>
@@ -844,7 +864,25 @@
                 <w:sz w:val="20"/>
                 <w:szCs w:val="20"/>
               </w:rPr>
-              <w:t>{{EXPEDIENTE}}</w:t>
+              <w:t>${</w:t>
+            </w:r>
+            <w:r>
+              <w:rPr>
+                <w:rFonts w:ascii="Arial Narrow" w:eastAsia="Arial" w:hAnsi="Arial Narrow" w:cs="Arial"/>
+                <w:color w:val="000000"/>
+                <w:sz w:val="20"/>
+                <w:szCs w:val="20"/>
+              </w:rPr>
+              <w:t>SOLICITANTE</w:t>
+            </w:r>
+            <w:r>
+              <w:rPr>
+                <w:rFonts w:ascii="Arial Narrow" w:eastAsia="Arial" w:hAnsi="Arial Narrow" w:cs="Arial"/>
+                <w:color w:val="000000"/>
+                <w:sz w:val="20"/>
+                <w:szCs w:val="20"/>
+              </w:rPr>
+              <w:t>}</w:t>
             </w:r>
             <w:r>
               <w:rPr>
@@ -1004,25 +1042,7 @@
                 <w:sz w:val="20"/>
                 <w:szCs w:val="20"/>
               </w:rPr>
-              <w:t xml:space="preserve">Molina, </w:t>
-            </w:r>
-            <w:r>
-              <w:rPr>
-                <w:rFonts w:ascii="Arial Narrow" w:eastAsia="Arial" w:hAnsi="Arial Narrow" w:cs="Arial"/>
-                <w:color w:val="000000"/>
-                <w:sz w:val="20"/>
-                <w:szCs w:val="20"/>
-              </w:rPr>
-              <w:t>1</w:t>
-            </w:r>
-            <w:r>
-              <w:rPr>
-                <w:rFonts w:ascii="Arial Narrow" w:eastAsia="Arial" w:hAnsi="Arial Narrow" w:cs="Arial"/>
-                <w:color w:val="000000"/>
-                <w:sz w:val="20"/>
-                <w:szCs w:val="20"/>
-              </w:rPr>
-              <w:t>7</w:t>
+              <w:t>Molina, 17</w:t>
             </w:r>
             <w:r>
               <w:rPr>
@@ -1040,25 +1060,7 @@
                 <w:sz w:val="20"/>
                 <w:szCs w:val="20"/>
               </w:rPr>
-              <w:t>febrero</w:t>
-            </w:r>
-            <w:r>
-              <w:rPr>
-                <w:rFonts w:ascii="Arial Narrow" w:eastAsia="Arial" w:hAnsi="Arial Narrow" w:cs="Arial"/>
-                <w:color w:val="4472C4" w:themeColor="accent5"/>
-                <w:sz w:val="20"/>
-                <w:szCs w:val="20"/>
-              </w:rPr>
-              <w:t xml:space="preserve"> de 202</w:t>
-            </w:r>
-            <w:r>
-              <w:rPr>
-                <w:rFonts w:ascii="Arial Narrow" w:eastAsia="Arial" w:hAnsi="Arial Narrow" w:cs="Arial"/>
-                <w:color w:val="4472C4" w:themeColor="accent5"/>
-                <w:sz w:val="20"/>
-                <w:szCs w:val="20"/>
-              </w:rPr>
-              <w:t>6</w:t>
+              <w:t>febrero de 2026</w:t>
             </w:r>
           </w:p>
         </w:tc>
@@ -1131,7 +1133,23 @@
           <w:sz w:val="20"/>
           <w:szCs w:val="20"/>
         </w:rPr>
-        <w:t>{{SOLICITANTE}}</w:t>
+        <w:t>${</w:t>
+      </w:r>
+      <w:r>
+        <w:rPr>
+          <w:rFonts w:ascii="Arial Narrow" w:eastAsia="Arial" w:hAnsi="Arial Narrow" w:cs="Arial"/>
+          <w:sz w:val="20"/>
+          <w:szCs w:val="20"/>
+        </w:rPr>
+        <w:t>SOLICITANTE</w:t>
+      </w:r>
+      <w:r>
+        <w:rPr>
+          <w:rFonts w:ascii="Arial Narrow" w:eastAsia="Arial" w:hAnsi="Arial Narrow" w:cs="Arial"/>
+          <w:sz w:val="20"/>
+          <w:szCs w:val="20"/>
+        </w:rPr>
+        <w:t>}</w:t>
       </w:r>
       <w:r>
         <w:rPr>
@@ -1196,15 +1214,7 @@
           <w:sz w:val="20"/>
           <w:szCs w:val="20"/>
         </w:rPr>
-        <w:t xml:space="preserve">con local comercial ubicado </w:t>
-      </w:r>
-      <w:r>
-        <w:rPr>
-          <w:rFonts w:ascii="Arial Narrow" w:eastAsia="Arial" w:hAnsi="Arial Narrow" w:cs="Arial"/>
-          <w:sz w:val="20"/>
-          <w:szCs w:val="20"/>
-        </w:rPr>
-        <w:t>en</w:t>
+        <w:t>con local comercial ubicado en</w:t>
       </w:r>
       <w:r>
         <w:rPr>
@@ -1213,7 +1223,7 @@
           <w:sz w:val="20"/>
           <w:szCs w:val="20"/>
         </w:rPr>
-        <w:t xml:space="preserve"> {{</w:t>
+        <w:t xml:space="preserve"> </w:t>
       </w:r>
       <w:r>
         <w:rPr>
@@ -1222,6 +1232,15 @@
           <w:sz w:val="20"/>
           <w:szCs w:val="20"/>
         </w:rPr>
+        <w:t>${</w:t>
+      </w:r>
+      <w:r>
+        <w:rPr>
+          <w:rFonts w:ascii="Arial Narrow" w:eastAsia="Arial" w:hAnsi="Arial Narrow" w:cs="Arial"/>
+          <w:color w:val="FF0000"/>
+          <w:sz w:val="20"/>
+          <w:szCs w:val="20"/>
+        </w:rPr>
         <w:t>DIRECCION_DEL_PREDIO_MATERIA_A_EVALUAR</w:t>
       </w:r>
       <w:r>
@@ -1231,23 +1250,15 @@
           <w:sz w:val="20"/>
           <w:szCs w:val="20"/>
         </w:rPr>
-        <w:t>}}</w:t>
-      </w:r>
-      <w:r>
-        <w:rPr>
-          <w:rFonts w:ascii="Arial Narrow" w:eastAsia="Arial" w:hAnsi="Arial Narrow" w:cs="Arial"/>
-          <w:sz w:val="20"/>
-          <w:szCs w:val="20"/>
-        </w:rPr>
-        <w:t xml:space="preserve"> Distrit</w:t>
-      </w:r>
-      <w:r>
-        <w:rPr>
-          <w:rFonts w:ascii="Arial Narrow" w:eastAsia="Arial" w:hAnsi="Arial Narrow" w:cs="Arial"/>
-          <w:sz w:val="20"/>
-          <w:szCs w:val="20"/>
-        </w:rPr>
-        <w:t xml:space="preserve">o de La Molina, representado por </w:t>
+        <w:t>}</w:t>
+      </w:r>
+      <w:r>
+        <w:rPr>
+          <w:rFonts w:ascii="Arial Narrow" w:eastAsia="Arial" w:hAnsi="Arial Narrow" w:cs="Arial"/>
+          <w:sz w:val="20"/>
+          <w:szCs w:val="20"/>
+        </w:rPr>
+        <w:t xml:space="preserve"> Distrito de La Molina, representado por </w:t>
       </w:r>
       <w:r>
         <w:rPr>
@@ -1257,7 +1268,7 @@
           <w:sz w:val="20"/>
           <w:szCs w:val="20"/>
         </w:rPr>
-        <w:t>{{</w:t>
+        <w:t>${</w:t>
       </w:r>
       <w:r>
         <w:rPr>
@@ -1277,7 +1288,27 @@
           <w:sz w:val="20"/>
           <w:szCs w:val="20"/>
         </w:rPr>
-        <w:t xml:space="preserve">O}} </w:t>
+        <w:t>O</w:t>
+      </w:r>
+      <w:r>
+        <w:rPr>
+          <w:rFonts w:ascii="Arial Narrow" w:eastAsia="Arial" w:hAnsi="Arial Narrow" w:cs="Arial"/>
+          <w:b/>
+          <w:color w:val="FF0000"/>
+          <w:sz w:val="20"/>
+          <w:szCs w:val="20"/>
+        </w:rPr>
+        <w:t>}</w:t>
+      </w:r>
+      <w:r>
+        <w:rPr>
+          <w:rFonts w:ascii="Arial Narrow" w:eastAsia="Arial" w:hAnsi="Arial Narrow" w:cs="Arial"/>
+          <w:b/>
+          <w:color w:val="FF0000"/>
+          <w:sz w:val="20"/>
+          <w:szCs w:val="20"/>
+        </w:rPr>
+        <w:t xml:space="preserve"> </w:t>
       </w:r>
       <w:r>
         <w:rPr>
@@ -1303,15 +1334,23 @@
           <w:sz w:val="20"/>
           <w:szCs w:val="20"/>
         </w:rPr>
-        <w:t xml:space="preserve"> {{</w:t>
-      </w:r>
-      <w:r>
-        <w:rPr>
-          <w:rFonts w:ascii="Arial Narrow" w:eastAsia="Arial" w:hAnsi="Arial Narrow" w:cs="Arial"/>
-          <w:sz w:val="20"/>
-          <w:szCs w:val="20"/>
-        </w:rPr>
-        <w:t>DNI_RUC</w:t>
+        <w:t xml:space="preserve"> </w:t>
+      </w:r>
+      <w:r>
+        <w:rPr>
+          <w:rFonts w:ascii="Arial Narrow" w:eastAsia="Arial" w:hAnsi="Arial Narrow" w:cs="Arial"/>
+          <w:sz w:val="20"/>
+          <w:szCs w:val="20"/>
+        </w:rPr>
+        <w:t>${</w:t>
+      </w:r>
+      <w:r>
+        <w:rPr>
+          <w:rFonts w:ascii="Arial Narrow" w:eastAsia="Arial" w:hAnsi="Arial Narrow" w:cs="Arial"/>
+          <w:sz w:val="20"/>
+          <w:szCs w:val="20"/>
+        </w:rPr>
+        <w:t>DNI_</w:t>
       </w:r>
       <w:proofErr w:type="gramStart"/>
       <w:r>
@@ -1320,7 +1359,23 @@
           <w:sz w:val="20"/>
           <w:szCs w:val="20"/>
         </w:rPr>
-        <w:t>}}/</w:t>
+        <w:t>RUC</w:t>
+      </w:r>
+      <w:r>
+        <w:rPr>
+          <w:rFonts w:ascii="Arial Narrow" w:eastAsia="Arial" w:hAnsi="Arial Narrow" w:cs="Arial"/>
+          <w:sz w:val="20"/>
+          <w:szCs w:val="20"/>
+        </w:rPr>
+        <w:t>}</w:t>
+      </w:r>
+      <w:r>
+        <w:rPr>
+          <w:rFonts w:ascii="Arial Narrow" w:eastAsia="Arial" w:hAnsi="Arial Narrow" w:cs="Arial"/>
+          <w:sz w:val="20"/>
+          <w:szCs w:val="20"/>
+        </w:rPr>
+        <w:t>/</w:t>
       </w:r>
       <w:proofErr w:type="gramEnd"/>
       <w:r>
@@ -1329,7 +1384,7 @@
           <w:sz w:val="20"/>
           <w:szCs w:val="20"/>
         </w:rPr>
-        <w:t>{{</w:t>
+        <w:t>${</w:t>
       </w:r>
       <w:r>
         <w:rPr>
@@ -1345,7 +1400,7 @@
           <w:sz w:val="20"/>
           <w:szCs w:val="20"/>
         </w:rPr>
-        <w:t>}}</w:t>
+        <w:t>}</w:t>
       </w:r>
       <w:r>
         <w:rPr>
@@ -1813,15 +1868,7 @@
           <w:sz w:val="20"/>
           <w:szCs w:val="20"/>
         </w:rPr>
-        <w:t xml:space="preserve">mientos Administrativos – Tupa de la </w:t>
-      </w:r>
-      <w:r>
-        <w:rPr>
-          <w:rFonts w:ascii="Arial Narrow" w:hAnsi="Arial Narrow" w:cs="Arial"/>
-          <w:sz w:val="20"/>
-          <w:szCs w:val="20"/>
-        </w:rPr>
-        <w:t>Municipalidad Distrital d</w:t>
+        <w:t>mientos Administrativos – Tupa de la Municipalidad Distrital d</w:t>
       </w:r>
       <w:r>
         <w:rPr>
@@ -1953,7 +2000,7 @@
           <w:sz w:val="20"/>
           <w:szCs w:val="20"/>
         </w:rPr>
-        <w:t>{{</w:t>
+        <w:t>${</w:t>
       </w:r>
       <w:r>
         <w:rPr>
@@ -1969,7 +2016,7 @@
           <w:sz w:val="20"/>
           <w:szCs w:val="20"/>
         </w:rPr>
-        <w:t>}}</w:t>
+        <w:t>}</w:t>
       </w:r>
     </w:p>
     <w:p>
@@ -2041,7 +2088,7 @@
           <w:sz w:val="20"/>
           <w:szCs w:val="20"/>
         </w:rPr>
-        <w:t>{{</w:t>
+        <w:t>${</w:t>
       </w:r>
       <w:r>
         <w:rPr>
@@ -2057,7 +2104,7 @@
           <w:sz w:val="20"/>
           <w:szCs w:val="20"/>
         </w:rPr>
-        <w:t>}}</w:t>
+        <w:t>}</w:t>
       </w:r>
     </w:p>
     <w:p>
@@ -2109,7 +2156,7 @@
           <w:sz w:val="20"/>
           <w:szCs w:val="20"/>
         </w:rPr>
-        <w:t>{{</w:t>
+        <w:t>${</w:t>
       </w:r>
       <w:r>
         <w:rPr>
@@ -2129,7 +2176,7 @@
           <w:sz w:val="20"/>
           <w:szCs w:val="20"/>
         </w:rPr>
-        <w:t>}}</w:t>
+        <w:t>}</w:t>
       </w:r>
     </w:p>
     <w:p>
@@ -2191,7 +2238,7 @@
           <w:sz w:val="20"/>
           <w:szCs w:val="20"/>
         </w:rPr>
-        <w:t>{{</w:t>
+        <w:t>${</w:t>
       </w:r>
       <w:r>
         <w:rPr>
@@ -2207,7 +2254,7 @@
           <w:sz w:val="20"/>
           <w:szCs w:val="20"/>
         </w:rPr>
-        <w:t>}}</w:t>
+        <w:t>}</w:t>
       </w:r>
     </w:p>
     <w:p>
@@ -2277,7 +2324,7 @@
           <w:sz w:val="20"/>
           <w:szCs w:val="20"/>
         </w:rPr>
-        <w:t>{{</w:t>
+        <w:t>${</w:t>
       </w:r>
       <w:r>
         <w:rPr>
@@ -2293,7 +2340,7 @@
           <w:sz w:val="20"/>
           <w:szCs w:val="20"/>
         </w:rPr>
-        <w:t>}}</w:t>
+        <w:t>}</w:t>
       </w:r>
     </w:p>
     <w:p>
@@ -2432,7 +2479,7 @@
           <w:sz w:val="20"/>
           <w:szCs w:val="20"/>
         </w:rPr>
-        <w:t>{{</w:t>
+        <w:t>${</w:t>
       </w:r>
       <w:r>
         <w:rPr>
@@ -2448,7 +2495,7 @@
           <w:sz w:val="20"/>
           <w:szCs w:val="20"/>
         </w:rPr>
-        <w:t>}}</w:t>
+        <w:t>}</w:t>
       </w:r>
     </w:p>
     <w:p>
@@ -2527,7 +2574,7 @@
           <w:sz w:val="20"/>
           <w:szCs w:val="20"/>
         </w:rPr>
-        <w:t>{{</w:t>
+        <w:t>${</w:t>
       </w:r>
       <w:r>
         <w:rPr>
@@ -2543,7 +2590,7 @@
           <w:sz w:val="20"/>
           <w:szCs w:val="20"/>
         </w:rPr>
-        <w:t>}}</w:t>
+        <w:t>}</w:t>
       </w:r>
       <w:r>
         <w:rPr>
@@ -2660,7 +2707,7 @@
           <w:sz w:val="20"/>
           <w:szCs w:val="20"/>
         </w:rPr>
-        <w:t>{{</w:t>
+        <w:t>${</w:t>
       </w:r>
       <w:r>
         <w:rPr>
@@ -2676,7 +2723,7 @@
           <w:sz w:val="20"/>
           <w:szCs w:val="20"/>
         </w:rPr>
-        <w:t>}}</w:t>
+        <w:t>}</w:t>
       </w:r>
       <w:r>
         <w:rPr>
@@ -2692,7 +2739,7 @@
           <w:sz w:val="20"/>
           <w:szCs w:val="20"/>
         </w:rPr>
-        <w:t>{{</w:t>
+        <w:t>${</w:t>
       </w:r>
       <w:r>
         <w:rPr>
@@ -2708,7 +2755,7 @@
           <w:sz w:val="20"/>
           <w:szCs w:val="20"/>
         </w:rPr>
-        <w:t>}}</w:t>
+        <w:t>}</w:t>
       </w:r>
     </w:p>
     <w:p>
@@ -2771,16 +2818,7 @@
           <w:sz w:val="20"/>
           <w:szCs w:val="20"/>
         </w:rPr>
-        <w:t>2</w:t>
-      </w:r>
-      <w:r>
-        <w:rPr>
-          <w:rFonts w:ascii="Arial Narrow" w:hAnsi="Arial Narrow" w:cs="Arial"/>
-          <w:bCs/>
-          <w:sz w:val="20"/>
-          <w:szCs w:val="20"/>
-        </w:rPr>
-        <w:t>7</w:t>
+        <w:t>27</w:t>
       </w:r>
       <w:r>
         <w:rPr>
@@ -2866,7 +2904,16 @@
           <w:sz w:val="20"/>
           <w:szCs w:val="20"/>
         </w:rPr>
-        <w:t>{{N</w:t>
+        <w:t>${</w:t>
+      </w:r>
+      <w:r>
+        <w:rPr>
+          <w:rFonts w:ascii="Arial Narrow" w:hAnsi="Arial Narrow" w:cs="Arial"/>
+          <w:bCs/>
+          <w:sz w:val="20"/>
+          <w:szCs w:val="20"/>
+        </w:rPr>
+        <w:t>N</w:t>
       </w:r>
       <w:r>
         <w:rPr>
@@ -2884,7 +2931,7 @@
           <w:sz w:val="20"/>
           <w:szCs w:val="20"/>
         </w:rPr>
-        <w:t>}}</w:t>
+        <w:t>}</w:t>
       </w:r>
       <w:r>
         <w:rPr>
@@ -2911,7 +2958,7 @@
           <w:sz w:val="20"/>
           <w:szCs w:val="20"/>
         </w:rPr>
-        <w:t>{{</w:t>
+        <w:t>${</w:t>
       </w:r>
       <w:r>
         <w:rPr>
@@ -2929,7 +2976,7 @@
           <w:sz w:val="20"/>
           <w:szCs w:val="20"/>
         </w:rPr>
-        <w:t>}}</w:t>
+        <w:t>}</w:t>
       </w:r>
       <w:r>
         <w:rPr>
@@ -2956,7 +3003,7 @@
           <w:sz w:val="20"/>
           <w:szCs w:val="20"/>
         </w:rPr>
-        <w:t>{{</w:t>
+        <w:t>${</w:t>
       </w:r>
       <w:r>
         <w:rPr>
@@ -2974,7 +3021,16 @@
           <w:sz w:val="20"/>
           <w:szCs w:val="20"/>
         </w:rPr>
-        <w:t xml:space="preserve">}} </w:t>
+        <w:t>}</w:t>
+      </w:r>
+      <w:r>
+        <w:rPr>
+          <w:rFonts w:ascii="Arial Narrow" w:hAnsi="Arial Narrow" w:cs="Arial"/>
+          <w:bCs/>
+          <w:sz w:val="20"/>
+          <w:szCs w:val="20"/>
+        </w:rPr>
+        <w:t xml:space="preserve"> </w:t>
       </w:r>
       <w:r>
         <w:rPr>
@@ -3003,7 +3059,16 @@
           <w:sz w:val="20"/>
           <w:szCs w:val="20"/>
         </w:rPr>
-        <w:t xml:space="preserve"> {{</w:t>
+        <w:t xml:space="preserve"> </w:t>
+      </w:r>
+      <w:r>
+        <w:rPr>
+          <w:rFonts w:ascii="Arial Narrow" w:hAnsi="Arial Narrow" w:cs="Arial"/>
+          <w:bCs/>
+          <w:sz w:val="20"/>
+          <w:szCs w:val="20"/>
+        </w:rPr>
+        <w:t>${</w:t>
       </w:r>
       <w:r>
         <w:rPr>
@@ -3021,7 +3086,7 @@
           <w:sz w:val="20"/>
           <w:szCs w:val="20"/>
         </w:rPr>
-        <w:t>}}</w:t>
+        <w:t>}</w:t>
       </w:r>
       <w:r>
         <w:rPr>
@@ -3038,15 +3103,7 @@
           <w:sz w:val="20"/>
           <w:szCs w:val="20"/>
         </w:rPr>
-        <w:t xml:space="preserve">solicita la autorización para la ubicación e </w:t>
-      </w:r>
-      <w:r>
-        <w:rPr>
-          <w:rFonts w:ascii="Arial Narrow" w:eastAsia="Arial" w:hAnsi="Arial Narrow" w:cs="Arial"/>
-          <w:sz w:val="20"/>
-          <w:szCs w:val="20"/>
-        </w:rPr>
-        <w:t>instalación de un (</w:t>
+        <w:t>solicita la autorización para la ubicación e instalación de un (</w:t>
       </w:r>
       <w:r>
         <w:rPr>
@@ -3099,7 +3156,7 @@
           <w:szCs w:val="20"/>
         </w:rPr>
         <w:lastRenderedPageBreak/>
-        <w:t>{{</w:t>
+        <w:t>${</w:t>
       </w:r>
       <w:r>
         <w:rPr>
@@ -3117,7 +3174,7 @@
           <w:sz w:val="20"/>
           <w:szCs w:val="20"/>
         </w:rPr>
-        <w:t>}}</w:t>
+        <w:t>}</w:t>
       </w:r>
       <w:r>
         <w:rPr>
@@ -3447,14 +3504,7 @@
           <w:rFonts w:ascii="Arial Narrow" w:hAnsi="Arial Narrow" w:cs="Arial"/>
           <w:sz w:val="20"/>
         </w:rPr>
-        <w:t xml:space="preserve">Ordenanza N°2348-2021-MML, Ordenanza que regula las disposiciones técnicas </w:t>
-      </w:r>
-      <w:r>
-        <w:rPr>
-          <w:rFonts w:ascii="Arial Narrow" w:hAnsi="Arial Narrow" w:cs="Arial"/>
-          <w:sz w:val="20"/>
-        </w:rPr>
-        <w:t>y procedimientos administrativos de autorización para la ubicación de elementos de publicidad exterior en los dis</w:t>
+        <w:t>Ordenanza N°2348-2021-MML, Ordenanza que regula las disposiciones técnicas y procedimientos administrativos de autorización para la ubicación de elementos de publicidad exterior en los dis</w:t>
       </w:r>
       <w:r>
         <w:rPr>
@@ -3491,17 +3541,7 @@
           <w:szCs w:val="20"/>
           <w:lang w:eastAsia="es-PE"/>
         </w:rPr>
-        <w:t xml:space="preserve">Ordenanza Nº1703, así como todas aquellas </w:t>
-      </w:r>
-      <w:r>
-        <w:rPr>
-          <w:rFonts w:ascii="Arial Narrow" w:eastAsia="Times New Roman" w:hAnsi="Arial Narrow" w:cs="Arial-BoldMT"/>
-          <w:bCs/>
-          <w:sz w:val="20"/>
-          <w:szCs w:val="20"/>
-          <w:lang w:eastAsia="es-PE"/>
-        </w:rPr>
-        <w:t>disposiciones que se oponen a la presente normativa; en tal sentido, en el art. 1 señala “La presente ordenanza tiene por objeto regular la ubicación de elementos de publicidad exterior (EPE) en la</w:t>
+        <w:t>Ordenanza Nº1703, así como todas aquellas disposiciones que se oponen a la presente normativa; en tal sentido, en el art. 1 señala “La presente ordenanza tiene por objeto regular la ubicación de elementos de publicidad exterior (EPE) en la</w:t>
       </w:r>
       <w:r>
         <w:rPr>
@@ -3798,15 +3838,7 @@
           <w:sz w:val="20"/>
           <w:lang w:val="es-PE"/>
         </w:rPr>
-        <w:t xml:space="preserve">Texto </w:t>
-      </w:r>
-      <w:r>
-        <w:rPr>
-          <w:rFonts w:ascii="Arial Narrow" w:hAnsi="Arial Narrow" w:cs="Arial"/>
-          <w:sz w:val="20"/>
-          <w:lang w:val="es-PE"/>
-        </w:rPr>
-        <w:t>suscrito por el propietario del bien de dominio privado que autoriza la ubicación del elemento de publicidad</w:t>
+        <w:t>Texto suscrito por el propietario del bien de dominio privado que autoriza la ubicación del elemento de publicidad</w:t>
       </w:r>
     </w:p>
     <w:p>
@@ -3830,15 +3862,7 @@
           <w:sz w:val="20"/>
           <w:lang w:val="es-PE"/>
         </w:rPr>
-        <w:t xml:space="preserve">Vistas: Arte o diseño del anuncio o aviso publicitario con sus dimensiones. Fotografía en el cual se debe apreciar el entorno urbano y el bien o </w:t>
-      </w:r>
-      <w:r>
-        <w:rPr>
-          <w:rFonts w:ascii="Arial Narrow" w:hAnsi="Arial Narrow" w:cs="Arial"/>
-          <w:sz w:val="20"/>
-          <w:lang w:val="es-PE"/>
-        </w:rPr>
-        <w:t>edificación, donde se ubicará El anuncio o aviso publicitario, así como el fotomontaje del mismo.</w:t>
+        <w:t>Vistas: Arte o diseño del anuncio o aviso publicitario con sus dimensiones. Fotografía en el cual se debe apreciar el entorno urbano y el bien o edificación, donde se ubicará El anuncio o aviso publicitario, así como el fotomontaje del mismo.</w:t>
       </w:r>
     </w:p>
     <w:p>
@@ -3904,7 +3928,7 @@
           <w:sz w:val="20"/>
           <w:lang w:val="es-PE"/>
         </w:rPr>
-        <w:t>{{</w:t>
+        <w:t>${</w:t>
       </w:r>
       <w:r>
         <w:rPr>
@@ -3920,7 +3944,7 @@
           <w:sz w:val="20"/>
           <w:lang w:val="es-PE"/>
         </w:rPr>
-        <w:t>}}</w:t>
+        <w:t>}</w:t>
       </w:r>
       <w:r>
         <w:rPr>
@@ -4042,7 +4066,7 @@
           <w:sz w:val="20"/>
           <w:lang w:val="es-PE"/>
         </w:rPr>
-        <w:t>{{</w:t>
+        <w:t>${</w:t>
       </w:r>
       <w:r>
         <w:rPr>
@@ -4060,7 +4084,7 @@
           <w:sz w:val="20"/>
           <w:lang w:val="es-PE"/>
         </w:rPr>
-        <w:t>}}</w:t>
+        <w:t>}</w:t>
       </w:r>
       <w:r>
         <w:rPr>
@@ -4076,7 +4100,7 @@
           <w:sz w:val="20"/>
           <w:lang w:val="es-PE"/>
         </w:rPr>
-        <w:t>{{</w:t>
+        <w:t>${</w:t>
       </w:r>
       <w:r>
         <w:rPr>
@@ -4092,7 +4116,7 @@
           <w:sz w:val="20"/>
           <w:lang w:val="es-PE"/>
         </w:rPr>
-        <w:t>}}</w:t>
+        <w:t>}</w:t>
       </w:r>
       <w:r>
         <w:rPr>
@@ -4133,7 +4157,7 @@
           <w:sz w:val="20"/>
           <w:lang w:val="es-PE"/>
         </w:rPr>
-        <w:t>{{</w:t>
+        <w:t>${</w:t>
       </w:r>
       <w:r>
         <w:rPr>
@@ -4149,7 +4173,7 @@
           <w:sz w:val="20"/>
           <w:lang w:val="es-PE"/>
         </w:rPr>
-        <w:t>}}</w:t>
+        <w:t>}</w:t>
       </w:r>
       <w:r>
         <w:rPr>
@@ -4322,7 +4346,7 @@
           <w:bCs/>
           <w:sz w:val="20"/>
         </w:rPr>
-        <w:t>{{</w:t>
+        <w:t>${</w:t>
       </w:r>
       <w:r>
         <w:rPr>
@@ -4338,7 +4362,7 @@
           <w:bCs/>
           <w:sz w:val="20"/>
         </w:rPr>
-        <w:t>}}</w:t>
+        <w:t>}</w:t>
       </w:r>
       <w:r>
         <w:rPr>
@@ -4440,7 +4464,7 @@
           <w:sz w:val="20"/>
           <w:szCs w:val="20"/>
         </w:rPr>
-        <w:t>{{</w:t>
+        <w:t>${</w:t>
       </w:r>
       <w:r>
         <w:rPr>
@@ -4458,7 +4482,7 @@
           <w:sz w:val="20"/>
           <w:szCs w:val="20"/>
         </w:rPr>
-        <w:t>}}</w:t>
+        <w:t>}</w:t>
       </w:r>
       <w:r>
         <w:rPr>
@@ -4514,7 +4538,7 @@
           <w:sz w:val="20"/>
           <w:szCs w:val="20"/>
         </w:rPr>
-        <w:t>{{</w:t>
+        <w:t>${</w:t>
       </w:r>
       <w:r>
         <w:rPr>
@@ -4532,7 +4556,7 @@
           <w:sz w:val="20"/>
           <w:szCs w:val="20"/>
         </w:rPr>
-        <w:t>}}</w:t>
+        <w:t>}</w:t>
       </w:r>
     </w:p>
     <w:p>
@@ -4594,7 +4618,7 @@
           <w:sz w:val="20"/>
           <w:szCs w:val="20"/>
         </w:rPr>
-        <w:t>{{</w:t>
+        <w:t>${</w:t>
       </w:r>
       <w:r>
         <w:rPr>
@@ -4610,7 +4634,7 @@
           <w:sz w:val="20"/>
           <w:szCs w:val="20"/>
         </w:rPr>
-        <w:t>}}</w:t>
+        <w:t>}</w:t>
       </w:r>
     </w:p>
     <w:p>
@@ -4676,7 +4700,7 @@
           <w:sz w:val="20"/>
           <w:szCs w:val="20"/>
         </w:rPr>
-        <w:t>{{</w:t>
+        <w:t>${</w:t>
       </w:r>
       <w:r>
         <w:rPr>
@@ -4694,7 +4718,7 @@
           <w:sz w:val="20"/>
           <w:szCs w:val="20"/>
         </w:rPr>
-        <w:t>}}</w:t>
+        <w:t>}</w:t>
       </w:r>
     </w:p>
     <w:p>
@@ -4746,7 +4770,7 @@
           <w:sz w:val="20"/>
           <w:szCs w:val="20"/>
         </w:rPr>
-        <w:t>{{</w:t>
+        <w:t>${</w:t>
       </w:r>
       <w:r>
         <w:rPr>
@@ -4764,7 +4788,7 @@
           <w:sz w:val="20"/>
           <w:szCs w:val="20"/>
         </w:rPr>
-        <w:t>}}</w:t>
+        <w:t>}</w:t>
       </w:r>
       <w:r>
         <w:rPr>
@@ -4817,7 +4841,7 @@
           <w:sz w:val="20"/>
           <w:szCs w:val="20"/>
         </w:rPr>
-        <w:t>{{</w:t>
+        <w:t>${</w:t>
       </w:r>
       <w:r>
         <w:rPr>
@@ -4833,7 +4857,7 @@
           <w:sz w:val="20"/>
           <w:szCs w:val="20"/>
         </w:rPr>
-        <w:t>}}</w:t>
+        <w:t>}</w:t>
       </w:r>
     </w:p>
     <w:p>
@@ -4861,16 +4885,7 @@
           <w:sz w:val="20"/>
           <w:szCs w:val="20"/>
         </w:rPr>
-        <w:t xml:space="preserve">CLASIFICACIÓN POR </w:t>
-      </w:r>
-      <w:r>
-        <w:rPr>
-          <w:rFonts w:ascii="Arial Narrow" w:eastAsia="Arial" w:hAnsi="Arial Narrow" w:cs="Arial"/>
-          <w:b/>
-          <w:sz w:val="20"/>
-          <w:szCs w:val="20"/>
-        </w:rPr>
-        <w:t>CARACTERÍSTICAS TÉCNICAS:</w:t>
+        <w:t>CLASIFICACIÓN POR CARACTERÍSTICAS TÉCNICAS:</w:t>
       </w:r>
       <w:r>
         <w:rPr>
@@ -4886,7 +4901,7 @@
           <w:sz w:val="20"/>
           <w:szCs w:val="20"/>
         </w:rPr>
-        <w:t>{{</w:t>
+        <w:t>${</w:t>
       </w:r>
       <w:r>
         <w:rPr>
@@ -4902,7 +4917,7 @@
           <w:sz w:val="20"/>
           <w:szCs w:val="20"/>
         </w:rPr>
-        <w:t>}}</w:t>
+        <w:t>}</w:t>
       </w:r>
       <w:r>
         <w:rPr>
@@ -4974,7 +4989,7 @@
           <w:sz w:val="20"/>
           <w:szCs w:val="20"/>
         </w:rPr>
-        <w:t>{{</w:t>
+        <w:t>${</w:t>
       </w:r>
       <w:r>
         <w:rPr>
@@ -4990,7 +5005,7 @@
           <w:sz w:val="20"/>
           <w:szCs w:val="20"/>
         </w:rPr>
-        <w:t>}}</w:t>
+        <w:t>}</w:t>
       </w:r>
     </w:p>
     <w:p>
@@ -5048,7 +5063,7 @@
           <w:sz w:val="20"/>
           <w:szCs w:val="20"/>
         </w:rPr>
-        <w:t>{{</w:t>
+        <w:t>${</w:t>
       </w:r>
       <w:r>
         <w:rPr>
@@ -5066,7 +5081,7 @@
           <w:sz w:val="20"/>
           <w:szCs w:val="20"/>
         </w:rPr>
-        <w:t>}}</w:t>
+        <w:t>}</w:t>
       </w:r>
       <w:r>
         <w:rPr>
@@ -5260,7 +5275,7 @@
                         <w:color w:val="000000" w:themeColor="text1"/>
                         <w:sz w:val="22"/>
                       </w:rPr>
-                      <w:t>{{</w:t>
+                      <w:t>${</w:t>
                     </w:r>
                     <w:r>
                       <w:rPr>
@@ -5276,7 +5291,7 @@
                         <w:color w:val="000000" w:themeColor="text1"/>
                         <w:sz w:val="22"/>
                       </w:rPr>
-                      <w:t>}}</w:t>
+                      <w:t>}</w:t>
                     </w:r>
                   </w:p>
                 </w:txbxContent>
@@ -5386,7 +5401,7 @@
                         <w:sz w:val="16"/>
                         <w:szCs w:val="16"/>
                       </w:rPr>
-                      <w:t>{{</w:t>
+                      <w:t>${</w:t>
                     </w:r>
                     <w:r>
                       <w:rPr>
@@ -5404,7 +5419,7 @@
                         <w:sz w:val="16"/>
                         <w:szCs w:val="16"/>
                       </w:rPr>
-                      <w:t>}}</w:t>
+                      <w:t>}</w:t>
                     </w:r>
                     <w:r>
                       <w:rPr>
@@ -5422,7 +5437,7 @@
                         <w:sz w:val="16"/>
                         <w:szCs w:val="16"/>
                       </w:rPr>
-                      <w:t>{{</w:t>
+                      <w:t>${</w:t>
                     </w:r>
                     <w:r>
                       <w:rPr>
@@ -5440,7 +5455,7 @@
                         <w:sz w:val="16"/>
                         <w:szCs w:val="16"/>
                       </w:rPr>
-                      <w:t>}}</w:t>
+                      <w:t>}</w:t>
                     </w:r>
                     <w:r>
                       <w:rPr>
@@ -5734,7 +5749,7 @@
           <w:sz w:val="20"/>
           <w:lang w:val="es-PE"/>
         </w:rPr>
-        <w:t>{{</w:t>
+        <w:t>${</w:t>
       </w:r>
       <w:r>
         <w:rPr>
@@ -5750,7 +5765,7 @@
           <w:sz w:val="20"/>
           <w:lang w:val="es-PE"/>
         </w:rPr>
-        <w:t>}}</w:t>
+        <w:t>}</w:t>
       </w:r>
       <w:r>
         <w:rPr>
@@ -5792,15 +5807,7 @@
           <w:sz w:val="20"/>
           <w:lang w:val="es-PE"/>
         </w:rPr>
-        <w:t xml:space="preserve"> 2682-2024-MML, Ordenanza que regula la ubicación de elementos de publicidad exterior en la </w:t>
-      </w:r>
-      <w:r>
-        <w:rPr>
-          <w:rFonts w:ascii="Arial Narrow" w:hAnsi="Arial Narrow" w:cs="Arial"/>
-          <w:sz w:val="20"/>
-          <w:lang w:val="es-PE"/>
-        </w:rPr>
-        <w:t>provincia de Lima (…)”;</w:t>
+        <w:t xml:space="preserve"> 2682-2024-MML, Ordenanza que regula la ubicación de elementos de publicidad exterior en la provincia de Lima (…)”;</w:t>
       </w:r>
     </w:p>
     <w:p>
@@ -5945,16 +5952,7 @@
           <w:color w:val="000000" w:themeColor="text1"/>
           <w:sz w:val="20"/>
         </w:rPr>
-        <w:t xml:space="preserve">LM y </w:t>
-      </w:r>
-      <w:r>
-        <w:rPr>
-          <w:rFonts w:ascii="Arial Narrow" w:hAnsi="Arial Narrow" w:cs="Arial"/>
-          <w:bCs/>
-          <w:color w:val="000000" w:themeColor="text1"/>
-          <w:sz w:val="20"/>
-        </w:rPr>
-        <w:t>modificatorias del TUPA</w:t>
+        <w:t>LM y modificatorias del TUPA</w:t>
       </w:r>
       <w:r>
         <w:rPr>
@@ -6091,15 +6089,7 @@
           <w:sz w:val="20"/>
           <w:szCs w:val="20"/>
         </w:rPr>
-        <w:t xml:space="preserve">autorización municipal de la publicidad </w:t>
-      </w:r>
-      <w:r>
-        <w:rPr>
-          <w:rFonts w:ascii="Arial Narrow" w:eastAsia="Arial" w:hAnsi="Arial Narrow" w:cs="Arial"/>
-          <w:sz w:val="20"/>
-          <w:szCs w:val="20"/>
-        </w:rPr>
-        <w:t>exterior</w:t>
+        <w:t>autorización municipal de la publicidad exterior</w:t>
       </w:r>
       <w:r>
         <w:rPr>

</xml_diff>

<commit_message>
feat: actualizar gestión de snapshots y generación de informes en anuncios
</commit_message>
<xml_diff>
--- a/app/Filament/Clusters/Sil/Resources/Anuncios/Template/template_informe_anuncio.docx
+++ b/app/Filament/Clusters/Sil/Resources/Anuncios/Template/template_informe_anuncio.docx
@@ -213,7 +213,6 @@
         <w:rPr>
           <w:rFonts w:ascii="Arial Narrow" w:eastAsia="Arial" w:hAnsi="Arial Narrow" w:cs="Arial"/>
           <w:b/>
-          <w:color w:val="000000"/>
           <w:sz w:val="20"/>
           <w:szCs w:val="20"/>
           <w:lang w:val="en-US"/>
@@ -256,7 +255,6 @@
               <w:rPr>
                 <w:rFonts w:ascii="Arial Narrow" w:eastAsia="Arial" w:hAnsi="Arial Narrow" w:cs="Arial"/>
                 <w:b/>
-                <w:color w:val="000000"/>
                 <w:sz w:val="20"/>
                 <w:szCs w:val="20"/>
               </w:rPr>
@@ -265,7 +263,6 @@
               <w:rPr>
                 <w:rFonts w:ascii="Arial Narrow" w:eastAsia="Arial" w:hAnsi="Arial Narrow" w:cs="Arial"/>
                 <w:b/>
-                <w:color w:val="000000"/>
                 <w:sz w:val="20"/>
                 <w:szCs w:val="20"/>
               </w:rPr>
@@ -296,7 +293,6 @@
               <w:rPr>
                 <w:rFonts w:ascii="Arial Narrow" w:eastAsia="Arial" w:hAnsi="Arial Narrow" w:cs="Arial"/>
                 <w:b/>
-                <w:color w:val="000000"/>
                 <w:sz w:val="20"/>
                 <w:szCs w:val="20"/>
               </w:rPr>
@@ -305,7 +301,6 @@
               <w:rPr>
                 <w:rFonts w:ascii="Arial Narrow" w:eastAsia="Arial" w:hAnsi="Arial Narrow" w:cs="Arial"/>
                 <w:b/>
-                <w:color w:val="000000"/>
                 <w:sz w:val="20"/>
                 <w:szCs w:val="20"/>
               </w:rPr>
@@ -403,7 +398,6 @@
               <w:rPr>
                 <w:rFonts w:ascii="Arial Narrow" w:eastAsia="Arial" w:hAnsi="Arial Narrow" w:cs="Arial"/>
                 <w:b/>
-                <w:color w:val="000000"/>
                 <w:sz w:val="20"/>
                 <w:szCs w:val="20"/>
               </w:rPr>
@@ -412,7 +406,6 @@
               <w:rPr>
                 <w:rFonts w:ascii="Arial Narrow" w:eastAsia="Arial" w:hAnsi="Arial Narrow" w:cs="Arial"/>
                 <w:b/>
-                <w:color w:val="000000"/>
                 <w:sz w:val="20"/>
                 <w:szCs w:val="20"/>
               </w:rPr>
@@ -443,7 +436,6 @@
               <w:rPr>
                 <w:rFonts w:ascii="Arial Narrow" w:eastAsia="Arial" w:hAnsi="Arial Narrow" w:cs="Arial"/>
                 <w:b/>
-                <w:color w:val="000000"/>
                 <w:sz w:val="20"/>
                 <w:szCs w:val="20"/>
               </w:rPr>
@@ -452,7 +444,6 @@
               <w:rPr>
                 <w:rFonts w:ascii="Arial Narrow" w:eastAsia="Arial" w:hAnsi="Arial Narrow" w:cs="Arial"/>
                 <w:b/>
-                <w:color w:val="000000"/>
                 <w:sz w:val="20"/>
                 <w:szCs w:val="20"/>
               </w:rPr>
@@ -505,7 +496,6 @@
               <w:ind w:right="-38"/>
               <w:rPr>
                 <w:rFonts w:ascii="Arial Narrow" w:eastAsia="Arial" w:hAnsi="Arial Narrow" w:cs="Arial"/>
-                <w:color w:val="000000"/>
                 <w:sz w:val="20"/>
                 <w:szCs w:val="20"/>
               </w:rPr>
@@ -513,38 +503,10 @@
             <w:r>
               <w:rPr>
                 <w:rFonts w:ascii="Arial Narrow" w:eastAsia="Arial" w:hAnsi="Arial Narrow" w:cs="Arial"/>
-                <w:color w:val="000000" w:themeColor="text1"/>
                 <w:sz w:val="20"/>
                 <w:szCs w:val="20"/>
               </w:rPr>
-              <w:t>Especialista e</w:t>
-            </w:r>
-            <w:r>
-              <w:rPr>
-                <w:rFonts w:ascii="Arial Narrow" w:eastAsia="Arial" w:hAnsi="Arial Narrow" w:cs="Arial"/>
-                <w:color w:val="000000" w:themeColor="text1"/>
-                <w:sz w:val="20"/>
-                <w:szCs w:val="20"/>
-              </w:rPr>
-              <w:t xml:space="preserve">n Procedimientos Comerciales </w:t>
-            </w:r>
-            <w:r>
-              <w:rPr>
-                <w:rFonts w:ascii="Arial Narrow" w:eastAsia="Arial" w:hAnsi="Arial Narrow" w:cs="Arial"/>
-                <w:color w:val="000000" w:themeColor="text1"/>
-                <w:sz w:val="20"/>
-                <w:szCs w:val="20"/>
-              </w:rPr>
-              <w:t>y</w:t>
-            </w:r>
-            <w:r>
-              <w:rPr>
-                <w:rFonts w:ascii="Arial Narrow" w:eastAsia="Arial" w:hAnsi="Arial Narrow" w:cs="Arial"/>
-                <w:color w:val="000000" w:themeColor="text1"/>
-                <w:sz w:val="20"/>
-                <w:szCs w:val="20"/>
-              </w:rPr>
-              <w:t xml:space="preserve"> Publicidad Exterior</w:t>
+              <w:t>Especialista en Procedimientos Comerciales y Publicidad Exterior</w:t>
             </w:r>
           </w:p>
         </w:tc>
@@ -570,7 +532,6 @@
               </w:pBdr>
               <w:rPr>
                 <w:rFonts w:ascii="Arial Narrow" w:eastAsia="Arial" w:hAnsi="Arial Narrow" w:cs="Arial"/>
-                <w:color w:val="000000"/>
                 <w:sz w:val="20"/>
                 <w:szCs w:val="20"/>
               </w:rPr>
@@ -579,7 +540,6 @@
               <w:rPr>
                 <w:rFonts w:ascii="Arial Narrow" w:eastAsia="Arial" w:hAnsi="Arial Narrow" w:cs="Arial"/>
                 <w:b/>
-                <w:color w:val="000000"/>
                 <w:sz w:val="20"/>
                 <w:szCs w:val="20"/>
               </w:rPr>
@@ -609,7 +569,6 @@
               <w:rPr>
                 <w:rFonts w:ascii="Arial Narrow" w:eastAsia="Arial" w:hAnsi="Arial Narrow" w:cs="Arial"/>
                 <w:b/>
-                <w:color w:val="000000"/>
                 <w:sz w:val="20"/>
                 <w:szCs w:val="20"/>
               </w:rPr>
@@ -618,7 +577,6 @@
               <w:rPr>
                 <w:rFonts w:ascii="Arial Narrow" w:eastAsia="Arial" w:hAnsi="Arial Narrow" w:cs="Arial"/>
                 <w:b/>
-                <w:color w:val="000000"/>
                 <w:sz w:val="20"/>
                 <w:szCs w:val="20"/>
               </w:rPr>
@@ -656,7 +614,6 @@
             <w:r>
               <w:rPr>
                 <w:rFonts w:ascii="Arial Narrow" w:eastAsia="Arial" w:hAnsi="Arial Narrow" w:cs="Arial"/>
-                <w:color w:val="000000"/>
                 <w:sz w:val="20"/>
                 <w:szCs w:val="20"/>
               </w:rPr>
@@ -670,18 +627,7 @@
                 <w:szCs w:val="20"/>
                 <w:lang w:eastAsia="en-US" w:bidi="ar-SA"/>
               </w:rPr>
-              <w:t xml:space="preserve">Autorización para la ubicación de elemento de publicidad exterior - tipo: panel simple, paleta publicitaria, rótulo adhesivo, valla, volumétrico, bandera, banderola, plancheta publicitaria, afiches, panel monumental, panel monumental unipolar y tótem. </w:t>
-            </w:r>
-            <w:r>
-              <w:rPr>
-                <w:rFonts w:ascii="Arial Narrow" w:eastAsiaTheme="minorHAnsi" w:hAnsi="Arial Narrow" w:cs="Arial"/>
-                <w:color w:val="2E74B5" w:themeColor="accent1" w:themeShade="BF"/>
-                <w:kern w:val="0"/>
-                <w:sz w:val="20"/>
-                <w:szCs w:val="20"/>
-                <w:lang w:eastAsia="en-US" w:bidi="ar-SA"/>
-              </w:rPr>
-              <w:t>En bienes de dominio privado</w:t>
+              <w:t>Autorización para la ubicación de elemento de publicidad exterior - tipo: panel simple, paleta publicitaria, rótulo adhesivo, valla, volumétrico, bandera, banderola, plancheta publicitaria, afiches, panel monumental, panel monumental unipolar y tótem. En bienes de dominio privado</w:t>
             </w:r>
             <w:bookmarkEnd w:id="2"/>
           </w:p>
@@ -709,7 +655,6 @@
               <w:rPr>
                 <w:rFonts w:ascii="Arial Narrow" w:eastAsia="Arial" w:hAnsi="Arial Narrow" w:cs="Arial"/>
                 <w:b/>
-                <w:color w:val="000000"/>
                 <w:sz w:val="20"/>
                 <w:szCs w:val="20"/>
               </w:rPr>
@@ -718,7 +663,6 @@
               <w:rPr>
                 <w:rFonts w:ascii="Arial Narrow" w:eastAsia="Arial" w:hAnsi="Arial Narrow" w:cs="Arial"/>
                 <w:b/>
-                <w:color w:val="000000"/>
                 <w:sz w:val="20"/>
                 <w:szCs w:val="20"/>
               </w:rPr>
@@ -748,7 +692,6 @@
               <w:rPr>
                 <w:rFonts w:ascii="Arial Narrow" w:eastAsia="Arial" w:hAnsi="Arial Narrow" w:cs="Arial"/>
                 <w:b/>
-                <w:color w:val="000000"/>
                 <w:sz w:val="20"/>
                 <w:szCs w:val="20"/>
               </w:rPr>
@@ -757,7 +700,6 @@
               <w:rPr>
                 <w:rFonts w:ascii="Arial Narrow" w:eastAsia="Arial" w:hAnsi="Arial Narrow" w:cs="Arial"/>
                 <w:b/>
-                <w:color w:val="000000"/>
                 <w:sz w:val="20"/>
                 <w:szCs w:val="20"/>
               </w:rPr>
@@ -787,7 +729,6 @@
               <w:ind w:right="25"/>
               <w:rPr>
                 <w:rFonts w:ascii="Arial Narrow" w:eastAsia="Arial" w:hAnsi="Arial Narrow" w:cs="Arial"/>
-                <w:color w:val="000000"/>
                 <w:sz w:val="20"/>
                 <w:szCs w:val="20"/>
               </w:rPr>
@@ -795,7 +736,6 @@
             <w:r>
               <w:rPr>
                 <w:rFonts w:ascii="Arial Narrow" w:eastAsia="Arial" w:hAnsi="Arial Narrow" w:cs="Arial"/>
-                <w:color w:val="000000"/>
                 <w:sz w:val="20"/>
                 <w:szCs w:val="20"/>
               </w:rPr>
@@ -805,7 +745,6 @@
             <w:r>
               <w:rPr>
                 <w:rFonts w:ascii="Arial Narrow" w:eastAsia="Arial" w:hAnsi="Arial Narrow" w:cs="Arial"/>
-                <w:color w:val="000000"/>
                 <w:sz w:val="20"/>
                 <w:szCs w:val="20"/>
               </w:rPr>
@@ -815,7 +754,6 @@
             <w:r>
               <w:rPr>
                 <w:rFonts w:ascii="Arial Narrow" w:eastAsia="Arial" w:hAnsi="Arial Narrow" w:cs="Arial"/>
-                <w:color w:val="000000"/>
                 <w:sz w:val="20"/>
                 <w:szCs w:val="20"/>
               </w:rPr>
@@ -824,7 +762,6 @@
             <w:r>
               <w:rPr>
                 <w:rFonts w:ascii="Arial Narrow" w:eastAsia="Arial" w:hAnsi="Arial Narrow" w:cs="Arial"/>
-                <w:color w:val="000000"/>
                 <w:sz w:val="20"/>
                 <w:szCs w:val="20"/>
               </w:rPr>
@@ -833,7 +770,6 @@
             <w:r>
               <w:rPr>
                 <w:rFonts w:ascii="Arial Narrow" w:eastAsia="Arial" w:hAnsi="Arial Narrow" w:cs="Arial"/>
-                <w:color w:val="000000"/>
                 <w:sz w:val="20"/>
                 <w:szCs w:val="20"/>
               </w:rPr>
@@ -852,7 +788,6 @@
               <w:ind w:right="25"/>
               <w:rPr>
                 <w:rFonts w:ascii="Arial Narrow" w:eastAsia="Arial" w:hAnsi="Arial Narrow" w:cs="Arial"/>
-                <w:color w:val="000000"/>
                 <w:sz w:val="20"/>
                 <w:szCs w:val="20"/>
               </w:rPr>
@@ -860,7 +795,6 @@
             <w:r>
               <w:rPr>
                 <w:rFonts w:ascii="Arial Narrow" w:eastAsia="Arial" w:hAnsi="Arial Narrow" w:cs="Arial"/>
-                <w:color w:val="000000"/>
                 <w:sz w:val="20"/>
                 <w:szCs w:val="20"/>
               </w:rPr>
@@ -869,7 +803,6 @@
             <w:r>
               <w:rPr>
                 <w:rFonts w:ascii="Arial Narrow" w:eastAsia="Arial" w:hAnsi="Arial Narrow" w:cs="Arial"/>
-                <w:color w:val="000000"/>
                 <w:sz w:val="20"/>
                 <w:szCs w:val="20"/>
               </w:rPr>
@@ -878,7 +811,6 @@
             <w:r>
               <w:rPr>
                 <w:rFonts w:ascii="Arial Narrow" w:eastAsia="Arial" w:hAnsi="Arial Narrow" w:cs="Arial"/>
-                <w:color w:val="000000"/>
                 <w:sz w:val="20"/>
                 <w:szCs w:val="20"/>
               </w:rPr>
@@ -887,7 +819,6 @@
             <w:r>
               <w:rPr>
                 <w:rFonts w:ascii="Arial Narrow" w:eastAsia="Arial" w:hAnsi="Arial Narrow" w:cs="Arial"/>
-                <w:color w:val="FF0000"/>
                 <w:sz w:val="20"/>
                 <w:szCs w:val="20"/>
               </w:rPr>
@@ -896,7 +827,6 @@
             <w:r>
               <w:rPr>
                 <w:rFonts w:ascii="Arial Narrow" w:eastAsia="Arial" w:hAnsi="Arial Narrow" w:cs="Arial"/>
-                <w:color w:val="FF0000"/>
                 <w:sz w:val="20"/>
                 <w:szCs w:val="20"/>
               </w:rPr>
@@ -905,7 +835,6 @@
             <w:r>
               <w:rPr>
                 <w:rFonts w:ascii="Arial Narrow" w:eastAsia="Arial" w:hAnsi="Arial Narrow" w:cs="Arial"/>
-                <w:color w:val="FF0000"/>
                 <w:sz w:val="20"/>
                 <w:szCs w:val="20"/>
               </w:rPr>
@@ -914,7 +843,6 @@
             <w:r>
               <w:rPr>
                 <w:rFonts w:ascii="Arial Narrow" w:eastAsia="Arial" w:hAnsi="Arial Narrow" w:cs="Arial"/>
-                <w:color w:val="FF0000"/>
                 <w:sz w:val="20"/>
                 <w:szCs w:val="20"/>
               </w:rPr>
@@ -944,7 +872,6 @@
               </w:pBdr>
               <w:rPr>
                 <w:rFonts w:ascii="Arial Narrow" w:eastAsia="Arial" w:hAnsi="Arial Narrow" w:cs="Arial"/>
-                <w:color w:val="000000"/>
                 <w:sz w:val="20"/>
                 <w:szCs w:val="20"/>
               </w:rPr>
@@ -953,7 +880,6 @@
               <w:rPr>
                 <w:rFonts w:ascii="Arial Narrow" w:eastAsia="Arial" w:hAnsi="Arial Narrow" w:cs="Arial"/>
                 <w:b/>
-                <w:color w:val="000000"/>
                 <w:sz w:val="20"/>
                 <w:szCs w:val="20"/>
               </w:rPr>
@@ -983,7 +909,6 @@
               <w:rPr>
                 <w:rFonts w:ascii="Arial Narrow" w:eastAsia="Arial" w:hAnsi="Arial Narrow" w:cs="Arial"/>
                 <w:b/>
-                <w:color w:val="000000"/>
                 <w:sz w:val="20"/>
                 <w:szCs w:val="20"/>
               </w:rPr>
@@ -992,7 +917,6 @@
               <w:rPr>
                 <w:rFonts w:ascii="Arial Narrow" w:eastAsia="Arial" w:hAnsi="Arial Narrow" w:cs="Arial"/>
                 <w:b/>
-                <w:color w:val="000000"/>
                 <w:sz w:val="20"/>
                 <w:szCs w:val="20"/>
               </w:rPr>
@@ -1021,7 +945,6 @@
               </w:pBdr>
               <w:rPr>
                 <w:rFonts w:ascii="Arial Narrow" w:eastAsia="Times New Roman" w:hAnsi="Arial Narrow" w:cs="Times New Roman"/>
-                <w:color w:val="000000"/>
                 <w:sz w:val="20"/>
                 <w:szCs w:val="20"/>
               </w:rPr>
@@ -1029,38 +952,10 @@
             <w:r>
               <w:rPr>
                 <w:rFonts w:ascii="Arial Narrow" w:eastAsia="Arial" w:hAnsi="Arial Narrow" w:cs="Arial"/>
-                <w:color w:val="000000"/>
                 <w:sz w:val="20"/>
                 <w:szCs w:val="20"/>
               </w:rPr>
-              <w:t xml:space="preserve">La </w:t>
-            </w:r>
-            <w:r>
-              <w:rPr>
-                <w:rFonts w:ascii="Arial Narrow" w:eastAsia="Arial" w:hAnsi="Arial Narrow" w:cs="Arial"/>
-                <w:color w:val="000000"/>
-                <w:sz w:val="20"/>
-                <w:szCs w:val="20"/>
-              </w:rPr>
-              <w:t>Molina, 17</w:t>
-            </w:r>
-            <w:r>
-              <w:rPr>
-                <w:rFonts w:ascii="Arial Narrow" w:eastAsia="Arial" w:hAnsi="Arial Narrow" w:cs="Arial"/>
-                <w:color w:val="4472C4" w:themeColor="accent5"/>
-                <w:sz w:val="20"/>
-                <w:szCs w:val="20"/>
-              </w:rPr>
-              <w:t xml:space="preserve"> de </w:t>
-            </w:r>
-            <w:r>
-              <w:rPr>
-                <w:rFonts w:ascii="Arial Narrow" w:eastAsia="Arial" w:hAnsi="Arial Narrow" w:cs="Arial"/>
-                <w:color w:val="4472C4" w:themeColor="accent5"/>
-                <w:sz w:val="20"/>
-                <w:szCs w:val="20"/>
-              </w:rPr>
-              <w:t>febrero de 2026</w:t>
+              <w:t>La Molina, 17 de febrero de 2026</w:t>
             </w:r>
           </w:p>
         </w:tc>
@@ -1078,7 +973,6 @@
         <w:jc w:val="both"/>
         <w:rPr>
           <w:rFonts w:ascii="Arial" w:eastAsia="Arial" w:hAnsi="Arial" w:cs="Arial"/>
-          <w:color w:val="000000"/>
           <w:sz w:val="2"/>
           <w:szCs w:val="2"/>
         </w:rPr>
@@ -1096,7 +990,6 @@
         <w:jc w:val="both"/>
         <w:rPr>
           <w:rFonts w:ascii="Arial" w:eastAsia="Arial" w:hAnsi="Arial" w:cs="Arial"/>
-          <w:color w:val="000000"/>
           <w:sz w:val="22"/>
           <w:szCs w:val="22"/>
         </w:rPr>
@@ -1125,198 +1018,43 @@
           <w:sz w:val="20"/>
           <w:szCs w:val="20"/>
         </w:rPr>
-        <w:t xml:space="preserve">Mediante el presente me dirijo a usted en atención al expediente de la referencia, a través del cual </w:t>
-      </w:r>
-      <w:r>
-        <w:rPr>
-          <w:rFonts w:ascii="Arial Narrow" w:eastAsia="Arial" w:hAnsi="Arial Narrow" w:cs="Arial"/>
-          <w:sz w:val="20"/>
-          <w:szCs w:val="20"/>
-        </w:rPr>
-        <w:t>${</w:t>
-      </w:r>
-      <w:r>
-        <w:rPr>
-          <w:rFonts w:ascii="Arial Narrow" w:eastAsia="Arial" w:hAnsi="Arial Narrow" w:cs="Arial"/>
-          <w:sz w:val="20"/>
-          <w:szCs w:val="20"/>
-        </w:rPr>
-        <w:t>SOLICITANTE</w:t>
-      </w:r>
-      <w:r>
-        <w:rPr>
-          <w:rFonts w:ascii="Arial Narrow" w:eastAsia="Arial" w:hAnsi="Arial Narrow" w:cs="Arial"/>
-          <w:sz w:val="20"/>
-          <w:szCs w:val="20"/>
-        </w:rPr>
-        <w:t>}</w:t>
-      </w:r>
-      <w:r>
-        <w:rPr>
-          <w:rFonts w:ascii="Arial Narrow" w:eastAsia="Arial" w:hAnsi="Arial Narrow" w:cs="Arial"/>
-          <w:sz w:val="20"/>
-          <w:szCs w:val="20"/>
-        </w:rPr>
-        <w:t xml:space="preserve"> </w:t>
+        <w:t xml:space="preserve">Mediante el presente me dirijo a usted en atención al expediente de la referencia, a través del cual BRISA ASOCIADOS </w:t>
+      </w:r>
+      <w:proofErr w:type="gramStart"/>
+      <w:r>
+        <w:rPr>
+          <w:rFonts w:ascii="Arial Narrow" w:eastAsia="Arial" w:hAnsi="Arial Narrow" w:cs="Arial"/>
+          <w:sz w:val="20"/>
+          <w:szCs w:val="20"/>
+        </w:rPr>
+        <w:t>S.A.C. ,</w:t>
+      </w:r>
+      <w:proofErr w:type="gramEnd"/>
+      <w:r>
+        <w:rPr>
+          <w:rFonts w:ascii="Arial Narrow" w:eastAsia="Arial" w:hAnsi="Arial Narrow" w:cs="Arial"/>
+          <w:sz w:val="20"/>
+          <w:szCs w:val="20"/>
+        </w:rPr>
+        <w:t xml:space="preserve"> con local comercial ubicado en ${DIRECCION_DEL_PREDIO_MATERIA_A_EVALUAR} Distrito de La Molina, representado por </w:t>
       </w:r>
       <w:r>
         <w:rPr>
           <w:rFonts w:ascii="Arial Narrow" w:eastAsia="Arial" w:hAnsi="Arial Narrow" w:cs="Arial"/>
           <w:b/>
-          <w:color w:val="FF0000"/>
-          <w:sz w:val="20"/>
-          <w:szCs w:val="20"/>
-        </w:rPr>
-        <w:fldChar w:fldCharType="begin"/>
-      </w:r>
-      <w:r>
-        <w:rPr>
-          <w:rFonts w:ascii="Arial Narrow" w:eastAsia="Arial" w:hAnsi="Arial Narrow" w:cs="Arial"/>
-          <w:b/>
-          <w:color w:val="FF0000"/>
-          <w:sz w:val="20"/>
-          <w:szCs w:val="20"/>
-        </w:rPr>
-        <w:instrText xml:space="preserve"> MERGEFIELD SOLICITANTE </w:instrText>
-      </w:r>
-      <w:r>
-        <w:rPr>
-          <w:rFonts w:ascii="Arial Narrow" w:eastAsia="Arial" w:hAnsi="Arial Narrow" w:cs="Arial"/>
-          <w:b/>
-          <w:color w:val="FF0000"/>
-          <w:sz w:val="20"/>
-          <w:szCs w:val="20"/>
-        </w:rPr>
-        <w:fldChar w:fldCharType="separate"/>
-      </w:r>
-      <w:r>
-        <w:rPr>
-          <w:rFonts w:ascii="Arial Narrow" w:eastAsia="Arial" w:hAnsi="Arial Narrow" w:cs="Arial"/>
-          <w:b/>
-          <w:color w:val="FF0000"/>
-          <w:sz w:val="20"/>
-          <w:szCs w:val="20"/>
-        </w:rPr>
-        <w:fldChar w:fldCharType="end"/>
-      </w:r>
-      <w:r>
-        <w:rPr>
-          <w:rFonts w:ascii="Arial Narrow" w:eastAsia="Arial" w:hAnsi="Arial Narrow" w:cs="Arial"/>
-          <w:color w:val="000000"/>
-          <w:sz w:val="20"/>
-          <w:szCs w:val="20"/>
-        </w:rPr>
-        <w:t xml:space="preserve">, </w:t>
-      </w:r>
-      <w:r>
-        <w:rPr>
-          <w:rFonts w:ascii="Arial Narrow" w:eastAsia="Arial" w:hAnsi="Arial Narrow" w:cs="Arial"/>
-          <w:sz w:val="20"/>
-          <w:szCs w:val="20"/>
-        </w:rPr>
-        <w:t>con local comercial ubicado en</w:t>
-      </w:r>
-      <w:r>
-        <w:rPr>
-          <w:rFonts w:ascii="Arial Narrow" w:eastAsia="Arial" w:hAnsi="Arial Narrow" w:cs="Arial"/>
-          <w:color w:val="FF0000"/>
-          <w:sz w:val="20"/>
-          <w:szCs w:val="20"/>
-        </w:rPr>
-        <w:t xml:space="preserve"> </w:t>
-      </w:r>
-      <w:r>
-        <w:rPr>
-          <w:rFonts w:ascii="Arial Narrow" w:eastAsia="Arial" w:hAnsi="Arial Narrow" w:cs="Arial"/>
-          <w:color w:val="FF0000"/>
-          <w:sz w:val="20"/>
-          <w:szCs w:val="20"/>
-        </w:rPr>
-        <w:t>${</w:t>
-      </w:r>
-      <w:r>
-        <w:rPr>
-          <w:rFonts w:ascii="Arial Narrow" w:eastAsia="Arial" w:hAnsi="Arial Narrow" w:cs="Arial"/>
-          <w:color w:val="FF0000"/>
-          <w:sz w:val="20"/>
-          <w:szCs w:val="20"/>
-        </w:rPr>
-        <w:t>DIRECCION_DEL_PREDIO_MATERIA_A_EVALUAR</w:t>
-      </w:r>
-      <w:r>
-        <w:rPr>
-          <w:rFonts w:ascii="Arial Narrow" w:eastAsia="Arial" w:hAnsi="Arial Narrow" w:cs="Arial"/>
-          <w:color w:val="FF0000"/>
-          <w:sz w:val="20"/>
-          <w:szCs w:val="20"/>
-        </w:rPr>
-        <w:t>}</w:t>
-      </w:r>
-      <w:r>
-        <w:rPr>
-          <w:rFonts w:ascii="Arial Narrow" w:eastAsia="Arial" w:hAnsi="Arial Narrow" w:cs="Arial"/>
-          <w:sz w:val="20"/>
-          <w:szCs w:val="20"/>
-        </w:rPr>
-        <w:t xml:space="preserve"> Distrito de La Molina, representado por </w:t>
-      </w:r>
-      <w:r>
-        <w:rPr>
-          <w:rFonts w:ascii="Arial Narrow" w:eastAsia="Arial" w:hAnsi="Arial Narrow" w:cs="Arial"/>
-          <w:b/>
-          <w:color w:val="FF0000"/>
-          <w:sz w:val="20"/>
-          <w:szCs w:val="20"/>
-        </w:rPr>
-        <w:t>${</w:t>
-      </w:r>
-      <w:r>
-        <w:rPr>
-          <w:rFonts w:ascii="Arial Narrow" w:eastAsia="Arial" w:hAnsi="Arial Narrow" w:cs="Arial"/>
-          <w:b/>
-          <w:color w:val="FF0000"/>
-          <w:sz w:val="20"/>
-          <w:szCs w:val="20"/>
-        </w:rPr>
-        <w:t>REPRESENTANTE_LEGAL_O_APODERAD</w:t>
-      </w:r>
-      <w:r>
-        <w:rPr>
-          <w:rFonts w:ascii="Arial Narrow" w:eastAsia="Arial" w:hAnsi="Arial Narrow" w:cs="Arial"/>
-          <w:b/>
-          <w:color w:val="FF0000"/>
-          <w:sz w:val="20"/>
-          <w:szCs w:val="20"/>
-        </w:rPr>
-        <w:t>O</w:t>
-      </w:r>
-      <w:r>
-        <w:rPr>
-          <w:rFonts w:ascii="Arial Narrow" w:eastAsia="Arial" w:hAnsi="Arial Narrow" w:cs="Arial"/>
-          <w:b/>
-          <w:color w:val="FF0000"/>
-          <w:sz w:val="20"/>
-          <w:szCs w:val="20"/>
-        </w:rPr>
-        <w:t>}</w:t>
-      </w:r>
-      <w:r>
-        <w:rPr>
-          <w:rFonts w:ascii="Arial Narrow" w:eastAsia="Arial" w:hAnsi="Arial Narrow" w:cs="Arial"/>
-          <w:b/>
-          <w:color w:val="FF0000"/>
-          <w:sz w:val="20"/>
-          <w:szCs w:val="20"/>
-        </w:rPr>
-        <w:t xml:space="preserve"> </w:t>
-      </w:r>
-      <w:r>
-        <w:rPr>
-          <w:rFonts w:ascii="Arial Narrow" w:eastAsia="Arial" w:hAnsi="Arial Narrow" w:cs="Arial"/>
-          <w:sz w:val="20"/>
-          <w:szCs w:val="20"/>
-        </w:rPr>
-        <w:t xml:space="preserve">con DNI </w:t>
+          <w:bCs/>
+          <w:sz w:val="20"/>
+          <w:szCs w:val="20"/>
+        </w:rPr>
+        <w:t>${REPRESENTANTE_LEGAL_O_APODERADO}</w:t>
+      </w:r>
+      <w:r>
+        <w:rPr>
+          <w:rFonts w:ascii="Arial Narrow" w:eastAsia="Arial" w:hAnsi="Arial Narrow" w:cs="Arial"/>
+          <w:sz w:val="20"/>
+          <w:szCs w:val="20"/>
+        </w:rPr>
+        <w:t xml:space="preserve"> con DNI </w:t>
       </w:r>
       <w:proofErr w:type="spellStart"/>
       <w:r>
@@ -1334,114 +1072,7 @@
           <w:sz w:val="20"/>
           <w:szCs w:val="20"/>
         </w:rPr>
-        <w:t xml:space="preserve"> </w:t>
-      </w:r>
-      <w:r>
-        <w:rPr>
-          <w:rFonts w:ascii="Arial Narrow" w:eastAsia="Arial" w:hAnsi="Arial Narrow" w:cs="Arial"/>
-          <w:sz w:val="20"/>
-          <w:szCs w:val="20"/>
-        </w:rPr>
-        <w:t>${</w:t>
-      </w:r>
-      <w:r>
-        <w:rPr>
-          <w:rFonts w:ascii="Arial Narrow" w:eastAsia="Arial" w:hAnsi="Arial Narrow" w:cs="Arial"/>
-          <w:sz w:val="20"/>
-          <w:szCs w:val="20"/>
-        </w:rPr>
-        <w:t>DNI_</w:t>
-      </w:r>
-      <w:proofErr w:type="gramStart"/>
-      <w:r>
-        <w:rPr>
-          <w:rFonts w:ascii="Arial Narrow" w:eastAsia="Arial" w:hAnsi="Arial Narrow" w:cs="Arial"/>
-          <w:sz w:val="20"/>
-          <w:szCs w:val="20"/>
-        </w:rPr>
-        <w:t>RUC</w:t>
-      </w:r>
-      <w:r>
-        <w:rPr>
-          <w:rFonts w:ascii="Arial Narrow" w:eastAsia="Arial" w:hAnsi="Arial Narrow" w:cs="Arial"/>
-          <w:sz w:val="20"/>
-          <w:szCs w:val="20"/>
-        </w:rPr>
-        <w:t>}</w:t>
-      </w:r>
-      <w:r>
-        <w:rPr>
-          <w:rFonts w:ascii="Arial Narrow" w:eastAsia="Arial" w:hAnsi="Arial Narrow" w:cs="Arial"/>
-          <w:sz w:val="20"/>
-          <w:szCs w:val="20"/>
-        </w:rPr>
-        <w:t>/</w:t>
-      </w:r>
-      <w:proofErr w:type="gramEnd"/>
-      <w:r>
-        <w:rPr>
-          <w:rFonts w:ascii="Arial Narrow" w:eastAsia="Arial" w:hAnsi="Arial Narrow" w:cs="Arial"/>
-          <w:sz w:val="20"/>
-          <w:szCs w:val="20"/>
-        </w:rPr>
-        <w:t>${</w:t>
-      </w:r>
-      <w:r>
-        <w:rPr>
-          <w:rFonts w:ascii="Arial Narrow" w:eastAsia="Arial" w:hAnsi="Arial Narrow" w:cs="Arial"/>
-          <w:sz w:val="20"/>
-          <w:szCs w:val="20"/>
-        </w:rPr>
-        <w:t>DNI_CARNET_DE_EXT</w:t>
-      </w:r>
-      <w:r>
-        <w:rPr>
-          <w:rFonts w:ascii="Arial Narrow" w:eastAsia="Arial" w:hAnsi="Arial Narrow" w:cs="Arial"/>
-          <w:sz w:val="20"/>
-          <w:szCs w:val="20"/>
-        </w:rPr>
-        <w:t>}</w:t>
-      </w:r>
-      <w:r>
-        <w:rPr>
-          <w:rFonts w:ascii="Arial Narrow" w:eastAsia="Arial" w:hAnsi="Arial Narrow" w:cs="Arial"/>
-          <w:sz w:val="20"/>
-          <w:szCs w:val="20"/>
-        </w:rPr>
-        <w:t>;</w:t>
-      </w:r>
-      <w:r>
-        <w:rPr>
-          <w:rFonts w:ascii="Arial Narrow" w:eastAsia="Arial" w:hAnsi="Arial Narrow" w:cs="Arial"/>
-          <w:sz w:val="20"/>
-          <w:szCs w:val="20"/>
-        </w:rPr>
-        <w:t xml:space="preserve"> solicita la autorización para la ubicación e instalación de un (01) “</w:t>
-      </w:r>
-      <w:r>
-        <w:rPr>
-          <w:rFonts w:ascii="Arial Narrow" w:eastAsia="Arial" w:hAnsi="Arial Narrow" w:cs="Arial"/>
-          <w:color w:val="0070C0"/>
-          <w:sz w:val="20"/>
-          <w:szCs w:val="20"/>
-        </w:rPr>
-        <w:t>Anuncio Simple</w:t>
-      </w:r>
-      <w:r>
-        <w:rPr>
-          <w:rFonts w:ascii="Arial Narrow" w:eastAsia="Arial" w:hAnsi="Arial Narrow" w:cs="Arial"/>
-          <w:sz w:val="20"/>
-          <w:szCs w:val="20"/>
-        </w:rPr>
-        <w:t>”, en el frontis del predio</w:t>
-      </w:r>
-      <w:r>
-        <w:rPr>
-          <w:rFonts w:ascii="Arial Narrow" w:eastAsia="Arial" w:hAnsi="Arial Narrow" w:cs="Arial"/>
-          <w:sz w:val="20"/>
-          <w:szCs w:val="20"/>
-        </w:rPr>
-        <w:t>, para lo cual se informa lo siguiente:</w:t>
+        <w:t xml:space="preserve"> ${DNI_RUC}/${DNI_CARNET_DE_EXT}; solicita la autorización para la ubicación e instalación de un (01) “Anuncio Simple”, en el frontis del predio, para lo cual se informa lo siguiente:</w:t>
       </w:r>
     </w:p>
     <w:p>
@@ -1606,39 +1237,7 @@
           <w:sz w:val="20"/>
           <w:szCs w:val="20"/>
         </w:rPr>
-        <w:t xml:space="preserve"> </w:t>
-      </w:r>
-      <w:r>
-        <w:rPr>
-          <w:rFonts w:ascii="Arial Narrow" w:hAnsi="Arial Narrow" w:cs="Arial"/>
-          <w:sz w:val="20"/>
-          <w:szCs w:val="20"/>
-        </w:rPr>
-        <w:t>2682-2024</w:t>
-      </w:r>
-      <w:r>
-        <w:rPr>
-          <w:rFonts w:ascii="Arial Narrow" w:hAnsi="Arial Narrow" w:cs="Arial"/>
-          <w:sz w:val="20"/>
-          <w:szCs w:val="20"/>
-        </w:rPr>
-        <w:t>-MML</w:t>
-      </w:r>
-      <w:r>
-        <w:rPr>
-          <w:rFonts w:ascii="Arial Narrow" w:hAnsi="Arial Narrow" w:cs="Arial"/>
-          <w:sz w:val="20"/>
-          <w:szCs w:val="20"/>
-        </w:rPr>
-        <w:t xml:space="preserve">, </w:t>
-      </w:r>
-      <w:r>
-        <w:rPr>
-          <w:rFonts w:ascii="Arial Narrow" w:hAnsi="Arial Narrow" w:cs="Arial"/>
-          <w:sz w:val="20"/>
-          <w:szCs w:val="20"/>
-        </w:rPr>
-        <w:t>Ordenanza que regula la ubicación de elementos de publicidad exterior en la provincia de Lima</w:t>
+        <w:t xml:space="preserve"> 2682-2024-MML, Ordenanza que regula la ubicación de elementos de publicidad exterior en la provincia de Lima</w:t>
       </w:r>
     </w:p>
     <w:p>
@@ -1680,39 +1279,7 @@
           <w:sz w:val="20"/>
           <w:szCs w:val="20"/>
         </w:rPr>
-        <w:t xml:space="preserve"> 473</w:t>
-      </w:r>
-      <w:r>
-        <w:rPr>
-          <w:rFonts w:ascii="Arial Narrow" w:hAnsi="Arial Narrow" w:cs="Arial"/>
-          <w:sz w:val="20"/>
-          <w:szCs w:val="20"/>
-        </w:rPr>
-        <w:t>-2025</w:t>
-      </w:r>
-      <w:r>
-        <w:rPr>
-          <w:rFonts w:ascii="Arial Narrow" w:hAnsi="Arial Narrow" w:cs="Arial"/>
-          <w:sz w:val="20"/>
-          <w:szCs w:val="20"/>
-        </w:rPr>
-        <w:t>/MDLM</w:t>
-      </w:r>
-      <w:r>
-        <w:rPr>
-          <w:rFonts w:ascii="Arial Narrow" w:hAnsi="Arial Narrow" w:cs="Arial"/>
-          <w:sz w:val="20"/>
-          <w:szCs w:val="20"/>
-        </w:rPr>
-        <w:t xml:space="preserve">, </w:t>
-      </w:r>
-      <w:r>
-        <w:rPr>
-          <w:rFonts w:ascii="Arial Narrow" w:hAnsi="Arial Narrow" w:cs="Arial"/>
-          <w:sz w:val="20"/>
-          <w:szCs w:val="20"/>
-        </w:rPr>
-        <w:t>Ordenanza que regula los elementos de publicidad exterior, las disposiciones técnicas y procedimientos administrativos en el distrito de La Molina</w:t>
+        <w:t xml:space="preserve"> 473-2025/MDLM, Ordenanza que regula los elementos de publicidad exterior, las disposiciones técnicas y procedimientos administrativos en el distrito de La Molina</w:t>
       </w:r>
     </w:p>
     <w:p>
@@ -1828,55 +1395,7 @@
           <w:sz w:val="20"/>
           <w:szCs w:val="20"/>
         </w:rPr>
-        <w:t xml:space="preserve">Ordenanza N°470-MDLM - Ordenanza </w:t>
-      </w:r>
-      <w:r>
-        <w:rPr>
-          <w:rFonts w:ascii="Arial Narrow" w:hAnsi="Arial Narrow" w:cs="Arial"/>
-          <w:sz w:val="20"/>
-          <w:szCs w:val="20"/>
-        </w:rPr>
-        <w:t>q</w:t>
-      </w:r>
-      <w:r>
-        <w:rPr>
-          <w:rFonts w:ascii="Arial Narrow" w:hAnsi="Arial Narrow" w:cs="Arial"/>
-          <w:sz w:val="20"/>
-          <w:szCs w:val="20"/>
-        </w:rPr>
-        <w:t xml:space="preserve">ue Aprueba Texto Único </w:t>
-      </w:r>
-      <w:r>
-        <w:rPr>
-          <w:rFonts w:ascii="Arial Narrow" w:hAnsi="Arial Narrow" w:cs="Arial"/>
-          <w:sz w:val="20"/>
-          <w:szCs w:val="20"/>
-        </w:rPr>
-        <w:t>d</w:t>
-      </w:r>
-      <w:r>
-        <w:rPr>
-          <w:rFonts w:ascii="Arial Narrow" w:hAnsi="Arial Narrow" w:cs="Arial"/>
-          <w:sz w:val="20"/>
-          <w:szCs w:val="20"/>
-        </w:rPr>
-        <w:t>e Procedi</w:t>
-      </w:r>
-      <w:r>
-        <w:rPr>
-          <w:rFonts w:ascii="Arial Narrow" w:hAnsi="Arial Narrow" w:cs="Arial"/>
-          <w:sz w:val="20"/>
-          <w:szCs w:val="20"/>
-        </w:rPr>
-        <w:t>mientos Administrativos – Tupa de la Municipalidad Distrital d</w:t>
-      </w:r>
-      <w:r>
-        <w:rPr>
-          <w:rFonts w:ascii="Arial Narrow" w:hAnsi="Arial Narrow" w:cs="Arial"/>
-          <w:sz w:val="20"/>
-          <w:szCs w:val="20"/>
-        </w:rPr>
-        <w:t>e La Molina</w:t>
+        <w:t>Ordenanza N°470-MDLM - Ordenanza que Aprueba Texto Único de Procedimientos Administrativos – Tupa de la Municipalidad Distrital de La Molina</w:t>
       </w:r>
     </w:p>
     <w:p>
@@ -1942,442 +1461,281 @@
     </w:p>
     <w:p>
       <w:pPr>
-        <w:ind w:left="993"/>
+        <w:pStyle w:val="Prrafodelista"/>
+        <w:ind w:left="1080"/>
         <w:jc w:val="both"/>
         <w:rPr>
-          <w:rFonts w:ascii="Arial Narrow" w:eastAsia="Arial" w:hAnsi="Arial Narrow" w:cs="Arial"/>
+          <w:rFonts w:ascii="Arial Narrow" w:eastAsia="Noto Sans CJK SC Regular" w:hAnsi="Arial Narrow" w:cs="Arial"/>
+          <w:kern w:val="1"/>
+          <w:sz w:val="20"/>
+          <w:szCs w:val="20"/>
+          <w:lang w:eastAsia="hi-IN" w:bidi="hi-IN"/>
+        </w:rPr>
+      </w:pPr>
+      <w:r>
+        <w:rPr>
+          <w:rFonts w:ascii="Arial Narrow" w:eastAsia="Noto Sans CJK SC Regular" w:hAnsi="Arial Narrow" w:cs="Arial"/>
+          <w:kern w:val="1"/>
+          <w:sz w:val="20"/>
+          <w:szCs w:val="20"/>
+          <w:lang w:eastAsia="hi-IN" w:bidi="hi-IN"/>
+        </w:rPr>
+        <w:t>- Administrado</w:t>
+      </w:r>
+      <w:proofErr w:type="gramStart"/>
+      <w:r>
+        <w:rPr>
+          <w:rFonts w:ascii="Arial Narrow" w:eastAsia="Noto Sans CJK SC Regular" w:hAnsi="Arial Narrow" w:cs="Arial"/>
+          <w:kern w:val="1"/>
+          <w:sz w:val="20"/>
+          <w:szCs w:val="20"/>
+          <w:lang w:eastAsia="hi-IN" w:bidi="hi-IN"/>
+        </w:rPr>
+        <w:tab/>
+        <w:t xml:space="preserve"> :</w:t>
+      </w:r>
+      <w:proofErr w:type="gramEnd"/>
+      <w:r>
+        <w:rPr>
+          <w:rFonts w:ascii="Arial Narrow" w:eastAsia="Noto Sans CJK SC Regular" w:hAnsi="Arial Narrow" w:cs="Arial"/>
+          <w:kern w:val="1"/>
+          <w:sz w:val="20"/>
+          <w:szCs w:val="20"/>
+          <w:lang w:eastAsia="hi-IN" w:bidi="hi-IN"/>
+        </w:rPr>
+        <w:t xml:space="preserve"> BRISA ASOCIADOS S.A.C.</w:t>
+      </w:r>
+    </w:p>
+    <w:p>
+      <w:pPr>
+        <w:pStyle w:val="Prrafodelista"/>
+        <w:ind w:left="1080"/>
+        <w:jc w:val="both"/>
+        <w:rPr>
+          <w:rFonts w:ascii="Arial Narrow" w:eastAsia="Noto Sans CJK SC Regular" w:hAnsi="Arial Narrow" w:cs="Arial"/>
+          <w:kern w:val="1"/>
+          <w:sz w:val="20"/>
+          <w:szCs w:val="20"/>
+          <w:lang w:eastAsia="hi-IN" w:bidi="hi-IN"/>
+        </w:rPr>
+      </w:pPr>
+      <w:r>
+        <w:rPr>
+          <w:rFonts w:ascii="Arial Narrow" w:eastAsia="Noto Sans CJK SC Regular" w:hAnsi="Arial Narrow" w:cs="Arial"/>
+          <w:kern w:val="1"/>
+          <w:sz w:val="20"/>
+          <w:szCs w:val="20"/>
+          <w:lang w:eastAsia="hi-IN" w:bidi="hi-IN"/>
+        </w:rPr>
+        <w:t xml:space="preserve">- D.N.I. / C.E. / RUC </w:t>
+      </w:r>
+      <w:proofErr w:type="spellStart"/>
+      <w:r>
+        <w:rPr>
+          <w:rFonts w:ascii="Arial Narrow" w:eastAsia="Noto Sans CJK SC Regular" w:hAnsi="Arial Narrow" w:cs="Arial"/>
+          <w:kern w:val="1"/>
+          <w:sz w:val="20"/>
+          <w:szCs w:val="20"/>
+          <w:lang w:eastAsia="hi-IN" w:bidi="hi-IN"/>
+        </w:rPr>
+        <w:t>N</w:t>
+      </w:r>
+      <w:proofErr w:type="gramStart"/>
+      <w:r>
+        <w:rPr>
+          <w:rFonts w:ascii="Arial Narrow" w:eastAsia="Noto Sans CJK SC Regular" w:hAnsi="Arial Narrow" w:cs="Arial"/>
+          <w:kern w:val="1"/>
+          <w:sz w:val="20"/>
+          <w:szCs w:val="20"/>
+          <w:lang w:eastAsia="hi-IN" w:bidi="hi-IN"/>
+        </w:rPr>
+        <w:t>°</w:t>
+      </w:r>
+      <w:proofErr w:type="spellEnd"/>
+      <w:r>
+        <w:rPr>
+          <w:rFonts w:ascii="Arial Narrow" w:eastAsia="Noto Sans CJK SC Regular" w:hAnsi="Arial Narrow" w:cs="Arial"/>
+          <w:kern w:val="1"/>
+          <w:sz w:val="20"/>
+          <w:szCs w:val="20"/>
+          <w:lang w:eastAsia="hi-IN" w:bidi="hi-IN"/>
+        </w:rPr>
+        <w:t xml:space="preserve">  :</w:t>
+      </w:r>
+      <w:proofErr w:type="gramEnd"/>
+      <w:r>
+        <w:rPr>
+          <w:rFonts w:ascii="Arial Narrow" w:eastAsia="Noto Sans CJK SC Regular" w:hAnsi="Arial Narrow" w:cs="Arial"/>
+          <w:kern w:val="1"/>
+          <w:sz w:val="20"/>
+          <w:szCs w:val="20"/>
+          <w:lang w:eastAsia="hi-IN" w:bidi="hi-IN"/>
+        </w:rPr>
+        <w:t xml:space="preserve"> ${DNI_RUC}</w:t>
+      </w:r>
+    </w:p>
+    <w:p>
+      <w:pPr>
+        <w:pStyle w:val="Prrafodelista"/>
+        <w:ind w:left="1080"/>
+        <w:jc w:val="both"/>
+        <w:rPr>
+          <w:rFonts w:ascii="Arial Narrow" w:eastAsia="Noto Sans CJK SC Regular" w:hAnsi="Arial Narrow" w:cs="Arial"/>
+          <w:kern w:val="1"/>
+          <w:sz w:val="20"/>
+          <w:szCs w:val="20"/>
+          <w:lang w:eastAsia="hi-IN" w:bidi="hi-IN"/>
+        </w:rPr>
+      </w:pPr>
+      <w:r>
+        <w:rPr>
+          <w:rFonts w:ascii="Arial Narrow" w:eastAsia="Noto Sans CJK SC Regular" w:hAnsi="Arial Narrow" w:cs="Arial"/>
+          <w:kern w:val="1"/>
+          <w:sz w:val="20"/>
+          <w:szCs w:val="20"/>
+          <w:lang w:eastAsia="hi-IN" w:bidi="hi-IN"/>
+        </w:rPr>
+        <w:t xml:space="preserve">- Representante           </w:t>
+      </w:r>
+      <w:proofErr w:type="gramStart"/>
+      <w:r>
+        <w:rPr>
+          <w:rFonts w:ascii="Arial Narrow" w:eastAsia="Noto Sans CJK SC Regular" w:hAnsi="Arial Narrow" w:cs="Arial"/>
+          <w:kern w:val="1"/>
+          <w:sz w:val="20"/>
+          <w:szCs w:val="20"/>
+          <w:lang w:eastAsia="hi-IN" w:bidi="hi-IN"/>
+        </w:rPr>
+        <w:t xml:space="preserve">  :</w:t>
+      </w:r>
+      <w:proofErr w:type="gramEnd"/>
+      <w:r>
+        <w:rPr>
+          <w:rFonts w:ascii="Arial Narrow" w:eastAsia="Noto Sans CJK SC Regular" w:hAnsi="Arial Narrow" w:cs="Arial"/>
+          <w:kern w:val="1"/>
+          <w:sz w:val="20"/>
+          <w:szCs w:val="20"/>
+          <w:lang w:eastAsia="hi-IN" w:bidi="hi-IN"/>
+        </w:rPr>
+        <w:t xml:space="preserve"> ${REPRESENTANTE_LEGAL_O_APODERADO}</w:t>
+      </w:r>
+    </w:p>
+    <w:p>
+      <w:pPr>
+        <w:pStyle w:val="Prrafodelista"/>
+        <w:ind w:left="1080"/>
+        <w:jc w:val="both"/>
+        <w:rPr>
+          <w:rFonts w:ascii="Arial Narrow" w:eastAsia="Noto Sans CJK SC Regular" w:hAnsi="Arial Narrow" w:cs="Arial"/>
+          <w:kern w:val="1"/>
+          <w:sz w:val="20"/>
+          <w:szCs w:val="20"/>
+          <w:lang w:eastAsia="hi-IN" w:bidi="hi-IN"/>
+        </w:rPr>
+      </w:pPr>
+      <w:r>
+        <w:rPr>
+          <w:rFonts w:ascii="Arial Narrow" w:eastAsia="Noto Sans CJK SC Regular" w:hAnsi="Arial Narrow" w:cs="Arial"/>
+          <w:kern w:val="1"/>
+          <w:sz w:val="20"/>
+          <w:szCs w:val="20"/>
+          <w:lang w:eastAsia="hi-IN" w:bidi="hi-IN"/>
+        </w:rPr>
+        <w:t xml:space="preserve">- DNI / C.E.                   </w:t>
+      </w:r>
+      <w:proofErr w:type="gramStart"/>
+      <w:r>
+        <w:rPr>
+          <w:rFonts w:ascii="Arial Narrow" w:eastAsia="Noto Sans CJK SC Regular" w:hAnsi="Arial Narrow" w:cs="Arial"/>
+          <w:kern w:val="1"/>
+          <w:sz w:val="20"/>
+          <w:szCs w:val="20"/>
+          <w:lang w:eastAsia="hi-IN" w:bidi="hi-IN"/>
+        </w:rPr>
+        <w:t xml:space="preserve">  :</w:t>
+      </w:r>
+      <w:proofErr w:type="gramEnd"/>
+      <w:r>
+        <w:rPr>
+          <w:rFonts w:ascii="Arial Narrow" w:eastAsia="Noto Sans CJK SC Regular" w:hAnsi="Arial Narrow" w:cs="Arial"/>
+          <w:kern w:val="1"/>
+          <w:sz w:val="20"/>
+          <w:szCs w:val="20"/>
+          <w:lang w:eastAsia="hi-IN" w:bidi="hi-IN"/>
+        </w:rPr>
+        <w:t xml:space="preserve"> ${DNI_CARNET_DE_EXT}</w:t>
+      </w:r>
+    </w:p>
+    <w:p>
+      <w:pPr>
+        <w:pStyle w:val="Prrafodelista"/>
+        <w:ind w:left="1080"/>
+        <w:jc w:val="both"/>
+        <w:rPr>
+          <w:rFonts w:ascii="Arial Narrow" w:eastAsia="Noto Sans CJK SC Regular" w:hAnsi="Arial Narrow" w:cs="Arial"/>
+          <w:kern w:val="1"/>
+          <w:sz w:val="20"/>
+          <w:szCs w:val="20"/>
+          <w:lang w:eastAsia="hi-IN" w:bidi="hi-IN"/>
+        </w:rPr>
+      </w:pPr>
+      <w:r>
+        <w:rPr>
+          <w:rFonts w:ascii="Arial Narrow" w:eastAsia="Noto Sans CJK SC Regular" w:hAnsi="Arial Narrow" w:cs="Arial"/>
+          <w:kern w:val="1"/>
+          <w:sz w:val="20"/>
+          <w:szCs w:val="20"/>
+          <w:lang w:eastAsia="hi-IN" w:bidi="hi-IN"/>
+        </w:rPr>
+        <w:t xml:space="preserve">- Domicilio Legal          </w:t>
+      </w:r>
+      <w:proofErr w:type="gramStart"/>
+      <w:r>
+        <w:rPr>
+          <w:rFonts w:ascii="Arial Narrow" w:eastAsia="Noto Sans CJK SC Regular" w:hAnsi="Arial Narrow" w:cs="Arial"/>
+          <w:kern w:val="1"/>
+          <w:sz w:val="20"/>
+          <w:szCs w:val="20"/>
+          <w:lang w:eastAsia="hi-IN" w:bidi="hi-IN"/>
+        </w:rPr>
+        <w:t xml:space="preserve">  :</w:t>
+      </w:r>
+      <w:proofErr w:type="gramEnd"/>
+      <w:r>
+        <w:rPr>
+          <w:rFonts w:ascii="Arial Narrow" w:eastAsia="Noto Sans CJK SC Regular" w:hAnsi="Arial Narrow" w:cs="Arial"/>
+          <w:kern w:val="1"/>
+          <w:sz w:val="20"/>
+          <w:szCs w:val="20"/>
+          <w:lang w:eastAsia="hi-IN" w:bidi="hi-IN"/>
+        </w:rPr>
+        <w:t xml:space="preserve"> ${DIRECCION_FISCAL}</w:t>
+      </w:r>
+    </w:p>
+    <w:p>
+      <w:pPr>
+        <w:pStyle w:val="Prrafodelista"/>
+        <w:spacing w:after="0" w:line="240" w:lineRule="auto"/>
+        <w:ind w:left="1080"/>
+        <w:jc w:val="both"/>
+        <w:rPr>
+          <w:rFonts w:ascii="Arial Narrow" w:hAnsi="Arial Narrow" w:cs="Arial"/>
           <w:b/>
-          <w:sz w:val="20"/>
-          <w:szCs w:val="20"/>
-        </w:rPr>
-      </w:pPr>
-      <w:r>
-        <w:rPr>
-          <w:rFonts w:ascii="Arial Narrow" w:hAnsi="Arial Narrow" w:cs="Arial"/>
-          <w:sz w:val="20"/>
-          <w:szCs w:val="20"/>
-        </w:rPr>
-        <w:t>- Administrado</w:t>
-      </w:r>
-      <w:r>
-        <w:rPr>
-          <w:rFonts w:ascii="Arial Narrow" w:hAnsi="Arial Narrow" w:cs="Arial"/>
-          <w:sz w:val="20"/>
-          <w:szCs w:val="20"/>
-        </w:rPr>
-        <w:tab/>
-        <w:t xml:space="preserve">            </w:t>
-      </w:r>
-      <w:proofErr w:type="gramStart"/>
-      <w:r>
-        <w:rPr>
-          <w:rFonts w:ascii="Arial Narrow" w:hAnsi="Arial Narrow" w:cs="Arial"/>
-          <w:sz w:val="20"/>
-          <w:szCs w:val="20"/>
-        </w:rPr>
-        <w:t xml:space="preserve">  </w:t>
-      </w:r>
-      <w:r>
-        <w:rPr>
-          <w:rFonts w:ascii="Arial Narrow" w:hAnsi="Arial Narrow" w:cs="Arial"/>
-          <w:sz w:val="20"/>
-          <w:szCs w:val="20"/>
-        </w:rPr>
-        <w:t>:</w:t>
-      </w:r>
-      <w:proofErr w:type="gramEnd"/>
-      <w:r>
-        <w:rPr>
-          <w:rFonts w:ascii="Arial Narrow" w:hAnsi="Arial Narrow" w:cs="Arial"/>
-          <w:sz w:val="20"/>
-          <w:szCs w:val="20"/>
-        </w:rPr>
-        <w:t xml:space="preserve"> </w:t>
-      </w:r>
-      <w:r>
-        <w:rPr>
-          <w:rFonts w:ascii="Arial Narrow" w:hAnsi="Arial Narrow" w:cs="Arial"/>
-          <w:sz w:val="20"/>
-          <w:szCs w:val="20"/>
-        </w:rPr>
-        <w:t>${</w:t>
-      </w:r>
-      <w:r>
-        <w:rPr>
-          <w:rFonts w:ascii="Arial Narrow" w:hAnsi="Arial Narrow" w:cs="Arial"/>
-          <w:sz w:val="20"/>
-          <w:szCs w:val="20"/>
-        </w:rPr>
-        <w:t>SOLICITANTE</w:t>
-      </w:r>
-      <w:r>
-        <w:rPr>
-          <w:rFonts w:ascii="Arial Narrow" w:hAnsi="Arial Narrow" w:cs="Arial"/>
-          <w:sz w:val="20"/>
-          <w:szCs w:val="20"/>
-        </w:rPr>
-        <w:t>}</w:t>
-      </w:r>
-    </w:p>
-    <w:p>
-      <w:pPr>
-        <w:ind w:left="993"/>
-        <w:jc w:val="both"/>
-        <w:rPr>
-          <w:rFonts w:ascii="Arial Narrow" w:hAnsi="Arial Narrow" w:cs="Arial"/>
           <w:bCs/>
           <w:sz w:val="20"/>
           <w:szCs w:val="20"/>
-        </w:rPr>
-      </w:pPr>
-      <w:r>
-        <w:rPr>
-          <w:rFonts w:ascii="Arial Narrow" w:hAnsi="Arial Narrow" w:cs="Arial"/>
-          <w:sz w:val="20"/>
-          <w:szCs w:val="20"/>
-        </w:rPr>
-        <w:t xml:space="preserve">- D.N.I. / C.E. / RUC </w:t>
-      </w:r>
-      <w:proofErr w:type="spellStart"/>
-      <w:r>
-        <w:rPr>
-          <w:rFonts w:ascii="Arial Narrow" w:hAnsi="Arial Narrow" w:cs="Arial"/>
-          <w:sz w:val="20"/>
-          <w:szCs w:val="20"/>
-        </w:rPr>
-        <w:t>N</w:t>
-      </w:r>
-      <w:proofErr w:type="gramStart"/>
-      <w:r>
-        <w:rPr>
-          <w:rFonts w:ascii="Arial Narrow" w:hAnsi="Arial Narrow" w:cs="Arial"/>
-          <w:sz w:val="20"/>
-          <w:szCs w:val="20"/>
-        </w:rPr>
-        <w:t>°</w:t>
-      </w:r>
-      <w:proofErr w:type="spellEnd"/>
-      <w:r>
-        <w:rPr>
-          <w:rFonts w:ascii="Arial Narrow" w:hAnsi="Arial Narrow" w:cs="Arial"/>
-          <w:sz w:val="20"/>
-          <w:szCs w:val="20"/>
-        </w:rPr>
-        <w:t xml:space="preserve">  </w:t>
-      </w:r>
-      <w:r>
-        <w:rPr>
-          <w:rFonts w:ascii="Arial Narrow" w:hAnsi="Arial Narrow" w:cs="Arial"/>
-          <w:sz w:val="20"/>
-          <w:szCs w:val="20"/>
-        </w:rPr>
-        <w:t>:</w:t>
-      </w:r>
-      <w:proofErr w:type="gramEnd"/>
-      <w:r>
-        <w:rPr>
-          <w:rFonts w:ascii="Arial Narrow" w:hAnsi="Arial Narrow" w:cs="Arial"/>
-          <w:sz w:val="20"/>
-          <w:szCs w:val="20"/>
-        </w:rPr>
-        <w:t xml:space="preserve"> </w:t>
-      </w:r>
-      <w:r>
-        <w:rPr>
-          <w:rFonts w:ascii="Arial Narrow" w:hAnsi="Arial Narrow" w:cs="Arial"/>
-          <w:sz w:val="20"/>
-          <w:szCs w:val="20"/>
-        </w:rPr>
-        <w:t>${</w:t>
-      </w:r>
-      <w:r>
-        <w:rPr>
-          <w:rFonts w:ascii="Arial Narrow" w:hAnsi="Arial Narrow" w:cs="Arial"/>
-          <w:sz w:val="20"/>
-          <w:szCs w:val="20"/>
-        </w:rPr>
-        <w:t>DNI_RUC</w:t>
-      </w:r>
-      <w:r>
-        <w:rPr>
-          <w:rFonts w:ascii="Arial Narrow" w:hAnsi="Arial Narrow" w:cs="Arial"/>
-          <w:sz w:val="20"/>
-          <w:szCs w:val="20"/>
-        </w:rPr>
-        <w:t>}</w:t>
-      </w:r>
-    </w:p>
-    <w:p>
-      <w:pPr>
-        <w:ind w:left="993"/>
-        <w:jc w:val="both"/>
-        <w:rPr>
-          <w:rFonts w:ascii="Arial Narrow" w:eastAsia="Arial" w:hAnsi="Arial Narrow" w:cs="Arial"/>
-          <w:b/>
-          <w:sz w:val="20"/>
-          <w:szCs w:val="20"/>
-        </w:rPr>
-      </w:pPr>
-      <w:r>
-        <w:rPr>
-          <w:rFonts w:ascii="Arial Narrow" w:hAnsi="Arial Narrow" w:cs="Arial"/>
-          <w:bCs/>
-          <w:sz w:val="20"/>
-          <w:szCs w:val="20"/>
-        </w:rPr>
-        <w:t xml:space="preserve">- Representante           </w:t>
-      </w:r>
-      <w:proofErr w:type="gramStart"/>
-      <w:r>
-        <w:rPr>
-          <w:rFonts w:ascii="Arial Narrow" w:hAnsi="Arial Narrow" w:cs="Arial"/>
-          <w:bCs/>
-          <w:sz w:val="20"/>
-          <w:szCs w:val="20"/>
-        </w:rPr>
-        <w:t xml:space="preserve">  :</w:t>
-      </w:r>
-      <w:proofErr w:type="gramEnd"/>
-      <w:r>
-        <w:rPr>
-          <w:rFonts w:ascii="Arial Narrow" w:hAnsi="Arial Narrow" w:cs="Arial"/>
-          <w:bCs/>
-          <w:color w:val="FF0000"/>
-          <w:sz w:val="20"/>
-          <w:szCs w:val="20"/>
-        </w:rPr>
-        <w:t xml:space="preserve"> </w:t>
-      </w:r>
-      <w:r>
-        <w:rPr>
-          <w:rFonts w:ascii="Arial Narrow" w:hAnsi="Arial Narrow" w:cs="Arial"/>
-          <w:bCs/>
-          <w:color w:val="FF0000"/>
-          <w:sz w:val="20"/>
-          <w:szCs w:val="20"/>
-        </w:rPr>
-        <w:t>${</w:t>
-      </w:r>
-      <w:r>
-        <w:rPr>
-          <w:rFonts w:ascii="Arial Narrow" w:hAnsi="Arial Narrow" w:cs="Arial"/>
-          <w:bCs/>
-          <w:color w:val="FF0000"/>
-          <w:sz w:val="20"/>
-          <w:szCs w:val="20"/>
-        </w:rPr>
-        <w:t>REPRESENTANTE_LEGAL_O_APODERADO</w:t>
-      </w:r>
-      <w:r>
-        <w:rPr>
-          <w:rFonts w:ascii="Arial Narrow" w:hAnsi="Arial Narrow" w:cs="Arial"/>
-          <w:bCs/>
-          <w:color w:val="FF0000"/>
-          <w:sz w:val="20"/>
-          <w:szCs w:val="20"/>
-        </w:rPr>
-        <w:t>}</w:t>
-      </w:r>
-    </w:p>
-    <w:p>
-      <w:pPr>
-        <w:ind w:left="993"/>
-        <w:jc w:val="both"/>
-        <w:rPr>
-          <w:rFonts w:ascii="Arial Narrow" w:hAnsi="Arial Narrow" w:cs="Arial"/>
-          <w:bCs/>
-          <w:sz w:val="20"/>
-          <w:szCs w:val="20"/>
-        </w:rPr>
-      </w:pPr>
-      <w:r>
-        <w:rPr>
-          <w:rFonts w:ascii="Arial Narrow" w:eastAsia="Arial" w:hAnsi="Arial Narrow" w:cs="Arial"/>
-          <w:sz w:val="20"/>
-          <w:szCs w:val="20"/>
-        </w:rPr>
-        <w:t>- DNI</w:t>
-      </w:r>
-      <w:r>
-        <w:rPr>
-          <w:rFonts w:ascii="Arial Narrow" w:hAnsi="Arial Narrow" w:cs="Arial"/>
-          <w:sz w:val="20"/>
-          <w:szCs w:val="20"/>
-        </w:rPr>
-        <w:t xml:space="preserve"> / C.E. </w:t>
-      </w:r>
-      <w:r>
-        <w:rPr>
-          <w:rFonts w:ascii="Arial Narrow" w:eastAsia="Arial" w:hAnsi="Arial Narrow" w:cs="Arial"/>
-          <w:sz w:val="20"/>
-          <w:szCs w:val="20"/>
-        </w:rPr>
-        <w:t xml:space="preserve">                  </w:t>
-      </w:r>
-      <w:proofErr w:type="gramStart"/>
-      <w:r>
-        <w:rPr>
-          <w:rFonts w:ascii="Arial Narrow" w:eastAsia="Arial" w:hAnsi="Arial Narrow" w:cs="Arial"/>
-          <w:sz w:val="20"/>
-          <w:szCs w:val="20"/>
-        </w:rPr>
-        <w:t xml:space="preserve">  :</w:t>
-      </w:r>
-      <w:proofErr w:type="gramEnd"/>
-      <w:r>
-        <w:rPr>
-          <w:rFonts w:ascii="Arial Narrow" w:eastAsia="Arial" w:hAnsi="Arial Narrow" w:cs="Arial"/>
-          <w:sz w:val="20"/>
-          <w:szCs w:val="20"/>
-        </w:rPr>
-        <w:t xml:space="preserve"> </w:t>
-      </w:r>
-      <w:r>
-        <w:rPr>
-          <w:rFonts w:ascii="Arial Narrow" w:eastAsia="Arial" w:hAnsi="Arial Narrow" w:cs="Arial"/>
-          <w:sz w:val="20"/>
-          <w:szCs w:val="20"/>
-        </w:rPr>
-        <w:t>${</w:t>
-      </w:r>
-      <w:r>
-        <w:rPr>
-          <w:rFonts w:ascii="Arial Narrow" w:eastAsia="Arial" w:hAnsi="Arial Narrow" w:cs="Arial"/>
-          <w:sz w:val="20"/>
-          <w:szCs w:val="20"/>
-        </w:rPr>
-        <w:t>DNI_CARNET_DE_EXT</w:t>
-      </w:r>
-      <w:r>
-        <w:rPr>
-          <w:rFonts w:ascii="Arial Narrow" w:eastAsia="Arial" w:hAnsi="Arial Narrow" w:cs="Arial"/>
-          <w:sz w:val="20"/>
-          <w:szCs w:val="20"/>
-        </w:rPr>
-        <w:t>}</w:t>
-      </w:r>
-    </w:p>
-    <w:p>
-      <w:pPr>
-        <w:ind w:left="993"/>
-        <w:jc w:val="both"/>
-        <w:rPr>
-          <w:rFonts w:ascii="Arial Narrow" w:eastAsia="Arial" w:hAnsi="Arial Narrow" w:cs="Arial"/>
-          <w:sz w:val="20"/>
-          <w:szCs w:val="20"/>
-        </w:rPr>
-      </w:pPr>
-      <w:r>
-        <w:rPr>
-          <w:rFonts w:ascii="Arial Narrow" w:hAnsi="Arial Narrow" w:cs="Arial"/>
-          <w:bCs/>
-          <w:sz w:val="20"/>
-          <w:szCs w:val="20"/>
-        </w:rPr>
-        <w:t xml:space="preserve">- </w:t>
-      </w:r>
-      <w:r>
-        <w:rPr>
-          <w:rFonts w:ascii="Arial Narrow" w:hAnsi="Arial Narrow" w:cs="Arial"/>
-          <w:sz w:val="20"/>
-          <w:szCs w:val="20"/>
-        </w:rPr>
-        <w:t>Domicilio Legal</w:t>
-      </w:r>
-      <w:r>
-        <w:rPr>
-          <w:rFonts w:ascii="Arial Narrow" w:hAnsi="Arial Narrow" w:cs="Arial"/>
-          <w:sz w:val="20"/>
-          <w:szCs w:val="20"/>
-        </w:rPr>
-        <w:t xml:space="preserve">          </w:t>
-      </w:r>
-      <w:proofErr w:type="gramStart"/>
-      <w:r>
-        <w:rPr>
-          <w:rFonts w:ascii="Arial Narrow" w:hAnsi="Arial Narrow" w:cs="Arial"/>
-          <w:sz w:val="20"/>
-          <w:szCs w:val="20"/>
-        </w:rPr>
-        <w:t xml:space="preserve">  </w:t>
-      </w:r>
-      <w:r>
-        <w:rPr>
-          <w:rFonts w:ascii="Arial Narrow" w:hAnsi="Arial Narrow" w:cs="Arial"/>
-          <w:sz w:val="20"/>
-          <w:szCs w:val="20"/>
-        </w:rPr>
-        <w:t>:</w:t>
-      </w:r>
-      <w:proofErr w:type="gramEnd"/>
-      <w:r>
-        <w:rPr>
-          <w:rFonts w:ascii="Arial Narrow" w:hAnsi="Arial Narrow" w:cs="Arial"/>
-          <w:sz w:val="20"/>
-          <w:szCs w:val="20"/>
-        </w:rPr>
-        <w:t xml:space="preserve"> </w:t>
-      </w:r>
-      <w:r>
-        <w:rPr>
-          <w:rFonts w:ascii="Arial Narrow" w:hAnsi="Arial Narrow" w:cs="Arial"/>
-          <w:sz w:val="20"/>
-          <w:szCs w:val="20"/>
-        </w:rPr>
-        <w:t>${</w:t>
-      </w:r>
-      <w:r>
-        <w:rPr>
-          <w:rFonts w:ascii="Arial Narrow" w:hAnsi="Arial Narrow" w:cs="Arial"/>
-          <w:sz w:val="20"/>
-          <w:szCs w:val="20"/>
-        </w:rPr>
-        <w:t>DIRECCION_FISCAL</w:t>
-      </w:r>
-      <w:r>
-        <w:rPr>
-          <w:rFonts w:ascii="Arial Narrow" w:hAnsi="Arial Narrow" w:cs="Arial"/>
-          <w:sz w:val="20"/>
-          <w:szCs w:val="20"/>
-        </w:rPr>
-        <w:t>}</w:t>
-      </w:r>
-    </w:p>
-    <w:p>
-      <w:pPr>
-        <w:ind w:left="993"/>
-        <w:jc w:val="both"/>
-        <w:rPr>
-          <w:rFonts w:ascii="Arial Narrow" w:hAnsi="Arial Narrow" w:cs="Arial"/>
-          <w:bCs/>
-          <w:sz w:val="20"/>
-          <w:szCs w:val="20"/>
-        </w:rPr>
-      </w:pPr>
-      <w:r>
-        <w:rPr>
-          <w:rFonts w:ascii="Arial Narrow" w:eastAsia="Arial" w:hAnsi="Arial Narrow" w:cs="Arial"/>
-          <w:sz w:val="20"/>
-          <w:szCs w:val="20"/>
-        </w:rPr>
-        <w:t xml:space="preserve">                                         </w:t>
-      </w:r>
-      <w:r>
-        <w:rPr>
-          <w:rFonts w:ascii="Arial Narrow" w:eastAsia="Arial" w:hAnsi="Arial Narrow" w:cs="Arial"/>
-          <w:sz w:val="20"/>
-          <w:szCs w:val="20"/>
-        </w:rPr>
-        <w:t xml:space="preserve">Distrito de </w:t>
-      </w:r>
-      <w:r>
-        <w:rPr>
-          <w:rFonts w:ascii="Arial Narrow" w:eastAsia="Arial" w:hAnsi="Arial Narrow" w:cs="Arial"/>
-          <w:color w:val="0070C0"/>
-          <w:sz w:val="20"/>
-          <w:szCs w:val="20"/>
-        </w:rPr>
-        <w:t>La Molina</w:t>
+          <w:u w:val="single"/>
+        </w:rPr>
+      </w:pPr>
+      <w:r>
+        <w:rPr>
+          <w:rFonts w:ascii="Arial Narrow" w:eastAsia="Noto Sans CJK SC Regular" w:hAnsi="Arial Narrow" w:cs="Arial"/>
+          <w:kern w:val="1"/>
+          <w:sz w:val="20"/>
+          <w:szCs w:val="20"/>
+          <w:lang w:eastAsia="hi-IN" w:bidi="hi-IN"/>
+        </w:rPr>
+        <w:t xml:space="preserve">                                         Distrito de La Molina</w:t>
       </w:r>
     </w:p>
     <w:p>
@@ -2438,13 +1796,6 @@
           <w:szCs w:val="20"/>
         </w:rPr>
         <w:tab/>
-      </w:r>
-      <w:r>
-        <w:rPr>
-          <w:rFonts w:ascii="Arial Narrow" w:hAnsi="Arial Narrow" w:cs="Arial"/>
-          <w:sz w:val="20"/>
-          <w:szCs w:val="20"/>
-        </w:rPr>
         <w:t xml:space="preserve">            </w:t>
       </w:r>
       <w:proofErr w:type="gramStart"/>
@@ -2454,15 +1805,7 @@
           <w:sz w:val="20"/>
           <w:szCs w:val="20"/>
         </w:rPr>
-        <w:t xml:space="preserve">  </w:t>
-      </w:r>
-      <w:r>
-        <w:rPr>
-          <w:rFonts w:ascii="Arial Narrow" w:hAnsi="Arial Narrow" w:cs="Arial"/>
-          <w:sz w:val="20"/>
-          <w:szCs w:val="20"/>
-        </w:rPr>
-        <w:t>:</w:t>
+        <w:t xml:space="preserve">  :</w:t>
       </w:r>
       <w:proofErr w:type="gramEnd"/>
       <w:r>
@@ -2516,15 +1859,7 @@
           <w:sz w:val="20"/>
           <w:szCs w:val="20"/>
         </w:rPr>
-        <w:t xml:space="preserve">- </w:t>
-      </w:r>
-      <w:r>
-        <w:rPr>
-          <w:rFonts w:ascii="Arial Narrow" w:hAnsi="Arial Narrow" w:cs="Arial"/>
-          <w:sz w:val="20"/>
-          <w:szCs w:val="20"/>
-        </w:rPr>
-        <w:t>Ubicación</w:t>
+        <w:t>- Ubicación</w:t>
       </w:r>
       <w:r>
         <w:rPr>
@@ -2533,13 +1868,6 @@
           <w:szCs w:val="20"/>
         </w:rPr>
         <w:tab/>
-      </w:r>
-      <w:r>
-        <w:rPr>
-          <w:rFonts w:ascii="Arial Narrow" w:hAnsi="Arial Narrow" w:cs="Arial"/>
-          <w:sz w:val="20"/>
-          <w:szCs w:val="20"/>
-        </w:rPr>
         <w:t xml:space="preserve">            </w:t>
       </w:r>
       <w:proofErr w:type="gramStart"/>
@@ -2549,15 +1877,7 @@
           <w:sz w:val="20"/>
           <w:szCs w:val="20"/>
         </w:rPr>
-        <w:t xml:space="preserve">  </w:t>
-      </w:r>
-      <w:r>
-        <w:rPr>
-          <w:rFonts w:ascii="Arial Narrow" w:hAnsi="Arial Narrow" w:cs="Arial"/>
-          <w:sz w:val="20"/>
-          <w:szCs w:val="20"/>
-        </w:rPr>
-        <w:t>:</w:t>
+        <w:t xml:space="preserve">  :</w:t>
       </w:r>
       <w:proofErr w:type="gramEnd"/>
       <w:r>
@@ -2619,15 +1939,7 @@
           <w:sz w:val="20"/>
           <w:szCs w:val="20"/>
         </w:rPr>
-        <w:t xml:space="preserve">                                        </w:t>
-      </w:r>
-      <w:r>
-        <w:rPr>
-          <w:rFonts w:ascii="Arial Narrow" w:eastAsia="Arial" w:hAnsi="Arial Narrow" w:cs="Arial"/>
-          <w:sz w:val="20"/>
-          <w:szCs w:val="20"/>
-        </w:rPr>
-        <w:t>Distrito de La Molina</w:t>
+        <w:t xml:space="preserve">                                        Distrito de La Molina</w:t>
       </w:r>
       <w:r>
         <w:rPr>
@@ -2646,34 +1958,17 @@
         <w:jc w:val="both"/>
         <w:rPr>
           <w:rFonts w:ascii="Arial Narrow" w:hAnsi="Arial Narrow" w:cs="Arial"/>
-          <w:color w:val="FF0000"/>
-          <w:sz w:val="20"/>
-          <w:szCs w:val="20"/>
-        </w:rPr>
-      </w:pPr>
-      <w:r>
-        <w:rPr>
-          <w:rFonts w:ascii="Arial Narrow" w:hAnsi="Arial Narrow" w:cs="Arial"/>
-          <w:sz w:val="20"/>
-          <w:szCs w:val="20"/>
-        </w:rPr>
-        <w:t xml:space="preserve">- </w:t>
-      </w:r>
-      <w:r>
-        <w:rPr>
-          <w:rFonts w:ascii="Arial Narrow" w:hAnsi="Arial Narrow" w:cs="Arial"/>
-          <w:sz w:val="20"/>
-          <w:szCs w:val="20"/>
-        </w:rPr>
-        <w:t>RUC</w:t>
-      </w:r>
-      <w:r>
-        <w:rPr>
-          <w:rFonts w:ascii="Arial Narrow" w:hAnsi="Arial Narrow" w:cs="Arial"/>
-          <w:sz w:val="20"/>
-          <w:szCs w:val="20"/>
-        </w:rPr>
-        <w:t xml:space="preserve">/TEL/CORREO  </w:t>
+          <w:sz w:val="20"/>
+          <w:szCs w:val="20"/>
+        </w:rPr>
+      </w:pPr>
+      <w:r>
+        <w:rPr>
+          <w:rFonts w:ascii="Arial Narrow" w:hAnsi="Arial Narrow" w:cs="Arial"/>
+          <w:sz w:val="20"/>
+          <w:szCs w:val="20"/>
+        </w:rPr>
+        <w:t xml:space="preserve">- RUC/TEL/CORREO  </w:t>
       </w:r>
       <w:proofErr w:type="gramStart"/>
       <w:r>
@@ -2682,15 +1977,7 @@
           <w:sz w:val="20"/>
           <w:szCs w:val="20"/>
         </w:rPr>
-        <w:t xml:space="preserve">  </w:t>
-      </w:r>
-      <w:r>
-        <w:rPr>
-          <w:rFonts w:ascii="Arial Narrow" w:hAnsi="Arial Narrow" w:cs="Arial"/>
-          <w:sz w:val="20"/>
-          <w:szCs w:val="20"/>
-        </w:rPr>
-        <w:t>:</w:t>
+        <w:t xml:space="preserve">  :</w:t>
       </w:r>
       <w:proofErr w:type="gramEnd"/>
       <w:r>
@@ -2809,8 +2096,9 @@
           <w:sz w:val="20"/>
           <w:szCs w:val="20"/>
         </w:rPr>
-        <w:t xml:space="preserve">Que, con fecha </w:t>
-      </w:r>
+        <w:t xml:space="preserve">Que, con fecha 27 de enero del 2026, ingreso a la oficina de gestión documentaria y atención al ciudadano, el expediente administrativo y/o documento simple con Número de Registro </w:t>
+      </w:r>
+      <w:proofErr w:type="spellStart"/>
       <w:r>
         <w:rPr>
           <w:rFonts w:ascii="Arial Narrow" w:hAnsi="Arial Narrow" w:cs="Arial"/>
@@ -2818,33 +2106,93 @@
           <w:sz w:val="20"/>
           <w:szCs w:val="20"/>
         </w:rPr>
-        <w:t>27</w:t>
-      </w:r>
+        <w:t>N°</w:t>
+      </w:r>
+      <w:proofErr w:type="spellEnd"/>
       <w:r>
         <w:rPr>
           <w:rFonts w:ascii="Arial Narrow" w:hAnsi="Arial Narrow" w:cs="Arial"/>
           <w:bCs/>
-          <w:color w:val="0070C0"/>
-          <w:sz w:val="20"/>
-          <w:szCs w:val="20"/>
-        </w:rPr>
-        <w:t xml:space="preserve"> de </w:t>
+          <w:sz w:val="20"/>
+          <w:szCs w:val="20"/>
+        </w:rPr>
+        <w:t xml:space="preserve"> </w:t>
       </w:r>
       <w:r>
         <w:rPr>
           <w:rFonts w:ascii="Arial Narrow" w:hAnsi="Arial Narrow" w:cs="Arial"/>
           <w:bCs/>
-          <w:color w:val="0070C0"/>
-          <w:sz w:val="20"/>
-          <w:szCs w:val="20"/>
-        </w:rPr>
-        <w:t>enero</w:t>
+          <w:sz w:val="20"/>
+          <w:szCs w:val="20"/>
+        </w:rPr>
+        <w:t>${</w:t>
+      </w:r>
+      <w:r>
+        <w:rPr>
+          <w:rFonts w:ascii="Arial Narrow" w:eastAsia="Arial" w:hAnsi="Arial Narrow" w:cs="Arial"/>
+          <w:sz w:val="20"/>
+          <w:szCs w:val="20"/>
+        </w:rPr>
+        <w:t>N_EXPEDIENTE</w:t>
       </w:r>
       <w:r>
         <w:rPr>
           <w:rFonts w:ascii="Arial Narrow" w:hAnsi="Arial Narrow" w:cs="Arial"/>
           <w:bCs/>
-          <w:color w:val="0070C0"/>
+          <w:sz w:val="20"/>
+          <w:szCs w:val="20"/>
+        </w:rPr>
+        <w:t>}</w:t>
+      </w:r>
+      <w:r>
+        <w:rPr>
+          <w:rFonts w:ascii="Arial Narrow" w:hAnsi="Arial Narrow" w:cs="Arial"/>
+          <w:bCs/>
+          <w:sz w:val="20"/>
+          <w:szCs w:val="20"/>
+        </w:rPr>
+        <w:t xml:space="preserve">, </w:t>
+      </w:r>
+      <w:r>
+        <w:rPr>
+          <w:rFonts w:ascii="Arial Narrow" w:hAnsi="Arial Narrow" w:cs="Arial"/>
+          <w:bCs/>
+          <w:sz w:val="20"/>
+          <w:szCs w:val="20"/>
+        </w:rPr>
+        <w:t xml:space="preserve">presentado por </w:t>
+      </w:r>
+      <w:r>
+        <w:rPr>
+          <w:rFonts w:ascii="Arial Narrow" w:hAnsi="Arial Narrow" w:cs="Arial"/>
+          <w:bCs/>
+          <w:sz w:val="20"/>
+          <w:szCs w:val="20"/>
+        </w:rPr>
+        <w:t>${</w:t>
+      </w:r>
+      <w:r>
+        <w:rPr>
+          <w:rFonts w:ascii="Arial Narrow" w:hAnsi="Arial Narrow" w:cs="Arial"/>
+          <w:bCs/>
+          <w:sz w:val="20"/>
+          <w:szCs w:val="20"/>
+        </w:rPr>
+        <w:t>SOLICITANTE</w:t>
+      </w:r>
+      <w:r>
+        <w:rPr>
+          <w:rFonts w:ascii="Arial Narrow" w:hAnsi="Arial Narrow" w:cs="Arial"/>
+          <w:bCs/>
+          <w:sz w:val="20"/>
+          <w:szCs w:val="20"/>
+        </w:rPr>
+        <w:t>}</w:t>
+      </w:r>
+      <w:r>
+        <w:rPr>
+          <w:rFonts w:ascii="Arial Narrow" w:hAnsi="Arial Narrow" w:cs="Arial"/>
+          <w:bCs/>
           <w:sz w:val="20"/>
           <w:szCs w:val="20"/>
         </w:rPr>
@@ -2857,7 +2205,7 @@
           <w:sz w:val="20"/>
           <w:szCs w:val="20"/>
         </w:rPr>
-        <w:t>del 202</w:t>
+        <w:t xml:space="preserve">Cuyo representante es el (la) Sr. (a) </w:t>
       </w:r>
       <w:r>
         <w:rPr>
@@ -2866,7 +2214,7 @@
           <w:sz w:val="20"/>
           <w:szCs w:val="20"/>
         </w:rPr>
-        <w:t>6</w:t>
+        <w:t>${</w:t>
       </w:r>
       <w:r>
         <w:rPr>
@@ -2875,7 +2223,34 @@
           <w:sz w:val="20"/>
           <w:szCs w:val="20"/>
         </w:rPr>
-        <w:t xml:space="preserve">, ingreso a la oficina de gestión documentaria y atención al ciudadano, el expediente administrativo y/o documento simple con Número de Registro </w:t>
+        <w:t>REPRESENTANTE_LEGAL_O_APODERADO</w:t>
+      </w:r>
+      <w:r>
+        <w:rPr>
+          <w:rFonts w:ascii="Arial Narrow" w:hAnsi="Arial Narrow" w:cs="Arial"/>
+          <w:bCs/>
+          <w:sz w:val="20"/>
+          <w:szCs w:val="20"/>
+        </w:rPr>
+        <w:t>}</w:t>
+      </w:r>
+      <w:r>
+        <w:rPr>
+          <w:rFonts w:ascii="Arial Narrow" w:hAnsi="Arial Narrow" w:cs="Arial"/>
+          <w:bCs/>
+          <w:sz w:val="20"/>
+          <w:szCs w:val="20"/>
+        </w:rPr>
+        <w:t xml:space="preserve"> </w:t>
+      </w:r>
+      <w:r>
+        <w:rPr>
+          <w:rFonts w:ascii="Arial Narrow" w:hAnsi="Arial Narrow" w:cs="Arial"/>
+          <w:bCs/>
+          <w:sz w:val="20"/>
+          <w:szCs w:val="20"/>
+        </w:rPr>
+        <w:t xml:space="preserve">D.N.I. / C.E. </w:t>
       </w:r>
       <w:proofErr w:type="spellStart"/>
       <w:r>
@@ -2908,12 +2283,22 @@
       </w:r>
       <w:r>
         <w:rPr>
+          <w:rFonts w:ascii="Arial Narrow" w:eastAsia="Noto Sans CJK SC Regular" w:hAnsi="Arial Narrow" w:cs="Arial"/>
+          <w:kern w:val="1"/>
+          <w:sz w:val="20"/>
+          <w:szCs w:val="20"/>
+          <w:lang w:eastAsia="hi-IN" w:bidi="hi-IN"/>
+        </w:rPr>
+        <w:t>DNI_CARNET_DE_EXT</w:t>
+      </w:r>
+      <w:r>
+        <w:rPr>
           <w:rFonts w:ascii="Arial Narrow" w:hAnsi="Arial Narrow" w:cs="Arial"/>
           <w:bCs/>
           <w:sz w:val="20"/>
           <w:szCs w:val="20"/>
         </w:rPr>
-        <w:t>N</w:t>
+        <w:t>}</w:t>
       </w:r>
       <w:r>
         <w:rPr>
@@ -2922,7 +2307,24 @@
           <w:sz w:val="20"/>
           <w:szCs w:val="20"/>
         </w:rPr>
-        <w:t>_DE_EXPEDIENTE</w:t>
+        <w:t xml:space="preserve">, </w:t>
+      </w:r>
+      <w:r>
+        <w:rPr>
+          <w:rFonts w:ascii="Arial Narrow" w:eastAsia="Arial" w:hAnsi="Arial Narrow" w:cs="Arial"/>
+          <w:sz w:val="20"/>
+          <w:szCs w:val="20"/>
+        </w:rPr>
+        <w:t xml:space="preserve">solicita la autorización para la ubicación e instalación de un (01) </w:t>
+      </w:r>
+      <w:r>
+        <w:rPr>
+          <w:rFonts w:ascii="Arial Narrow" w:eastAsia="Arial" w:hAnsi="Arial Narrow" w:cs="Arial"/>
+          <w:sz w:val="20"/>
+          <w:szCs w:val="20"/>
+        </w:rPr>
+        <w:lastRenderedPageBreak/>
+        <w:t>“aviso publicitario simple”</w:t>
       </w:r>
       <w:r>
         <w:rPr>
@@ -2931,290 +2333,59 @@
           <w:sz w:val="20"/>
           <w:szCs w:val="20"/>
         </w:rPr>
+        <w:t>, para el predio ubicado en</w:t>
+      </w:r>
+      <w:r>
+        <w:rPr>
+          <w:rFonts w:ascii="Arial Narrow" w:hAnsi="Arial Narrow" w:cs="Arial"/>
+          <w:bCs/>
+          <w:sz w:val="20"/>
+          <w:szCs w:val="20"/>
+        </w:rPr>
+        <w:t xml:space="preserve"> </w:t>
+      </w:r>
+      <w:r>
+        <w:rPr>
+          <w:rFonts w:ascii="Arial Narrow" w:hAnsi="Arial Narrow" w:cs="Arial"/>
+          <w:bCs/>
+          <w:sz w:val="20"/>
+          <w:szCs w:val="20"/>
+        </w:rPr>
+        <w:t>${</w:t>
+      </w:r>
+      <w:r>
+        <w:rPr>
+          <w:rFonts w:ascii="Arial Narrow" w:hAnsi="Arial Narrow" w:cs="Arial"/>
+          <w:bCs/>
+          <w:sz w:val="20"/>
+          <w:szCs w:val="20"/>
+        </w:rPr>
+        <w:t>DIRECCION_DEL_PREDIO_MATERIA_A_EVALUAR</w:t>
+      </w:r>
+      <w:r>
+        <w:rPr>
+          <w:rFonts w:ascii="Arial Narrow" w:hAnsi="Arial Narrow" w:cs="Arial"/>
+          <w:bCs/>
+          <w:sz w:val="20"/>
+          <w:szCs w:val="20"/>
+        </w:rPr>
         <w:t>}</w:t>
       </w:r>
       <w:r>
         <w:rPr>
-          <w:rFonts w:ascii="Arial Narrow" w:hAnsi="Arial Narrow" w:cs="Arial"/>
-          <w:bCs/>
-          <w:sz w:val="20"/>
-          <w:szCs w:val="20"/>
-        </w:rPr>
-        <w:t xml:space="preserve">, </w:t>
-      </w:r>
-      <w:r>
-        <w:rPr>
-          <w:rFonts w:ascii="Arial Narrow" w:hAnsi="Arial Narrow" w:cs="Arial"/>
-          <w:bCs/>
-          <w:sz w:val="20"/>
-          <w:szCs w:val="20"/>
-        </w:rPr>
-        <w:t xml:space="preserve">presentado por </w:t>
-      </w:r>
-      <w:r>
-        <w:rPr>
-          <w:rFonts w:ascii="Arial Narrow" w:hAnsi="Arial Narrow" w:cs="Arial"/>
-          <w:bCs/>
-          <w:sz w:val="20"/>
-          <w:szCs w:val="20"/>
-        </w:rPr>
-        <w:t>${</w:t>
-      </w:r>
-      <w:r>
-        <w:rPr>
-          <w:rFonts w:ascii="Arial Narrow" w:hAnsi="Arial Narrow" w:cs="Arial"/>
-          <w:bCs/>
-          <w:sz w:val="20"/>
-          <w:szCs w:val="20"/>
-        </w:rPr>
-        <w:t>SOLICITANTE</w:t>
-      </w:r>
-      <w:r>
-        <w:rPr>
-          <w:rFonts w:ascii="Arial Narrow" w:hAnsi="Arial Narrow" w:cs="Arial"/>
-          <w:bCs/>
-          <w:sz w:val="20"/>
-          <w:szCs w:val="20"/>
-        </w:rPr>
-        <w:t>}</w:t>
-      </w:r>
-      <w:r>
-        <w:rPr>
-          <w:rFonts w:ascii="Arial Narrow" w:hAnsi="Arial Narrow" w:cs="Arial"/>
-          <w:bCs/>
-          <w:sz w:val="20"/>
-          <w:szCs w:val="20"/>
-        </w:rPr>
-        <w:t xml:space="preserve"> </w:t>
-      </w:r>
-      <w:r>
-        <w:rPr>
-          <w:rFonts w:ascii="Arial Narrow" w:hAnsi="Arial Narrow" w:cs="Arial"/>
-          <w:bCs/>
-          <w:sz w:val="20"/>
-          <w:szCs w:val="20"/>
-        </w:rPr>
-        <w:t xml:space="preserve">Cuyo representante es el (la) Sr. (a) </w:t>
-      </w:r>
-      <w:r>
-        <w:rPr>
-          <w:rFonts w:ascii="Arial Narrow" w:hAnsi="Arial Narrow" w:cs="Arial"/>
-          <w:bCs/>
-          <w:sz w:val="20"/>
-          <w:szCs w:val="20"/>
-        </w:rPr>
-        <w:t>${</w:t>
-      </w:r>
-      <w:r>
-        <w:rPr>
-          <w:rFonts w:ascii="Arial Narrow" w:hAnsi="Arial Narrow" w:cs="Arial"/>
-          <w:bCs/>
-          <w:sz w:val="20"/>
-          <w:szCs w:val="20"/>
-        </w:rPr>
-        <w:t>REPRESENTANTE_LEGAL_O_APODERADO</w:t>
-      </w:r>
-      <w:r>
-        <w:rPr>
-          <w:rFonts w:ascii="Arial Narrow" w:hAnsi="Arial Narrow" w:cs="Arial"/>
-          <w:bCs/>
-          <w:sz w:val="20"/>
-          <w:szCs w:val="20"/>
-        </w:rPr>
-        <w:t>}</w:t>
-      </w:r>
-      <w:r>
-        <w:rPr>
-          <w:rFonts w:ascii="Arial Narrow" w:hAnsi="Arial Narrow" w:cs="Arial"/>
-          <w:bCs/>
-          <w:sz w:val="20"/>
-          <w:szCs w:val="20"/>
-        </w:rPr>
-        <w:t xml:space="preserve"> </w:t>
-      </w:r>
-      <w:r>
-        <w:rPr>
-          <w:rFonts w:ascii="Arial Narrow" w:hAnsi="Arial Narrow" w:cs="Arial"/>
-          <w:bCs/>
-          <w:sz w:val="20"/>
-          <w:szCs w:val="20"/>
-        </w:rPr>
-        <w:t xml:space="preserve">D.N.I. / C.E. </w:t>
-      </w:r>
-      <w:proofErr w:type="spellStart"/>
-      <w:r>
-        <w:rPr>
-          <w:rFonts w:ascii="Arial Narrow" w:hAnsi="Arial Narrow" w:cs="Arial"/>
-          <w:bCs/>
-          <w:sz w:val="20"/>
-          <w:szCs w:val="20"/>
-        </w:rPr>
-        <w:t>N°</w:t>
-      </w:r>
-      <w:proofErr w:type="spellEnd"/>
-      <w:r>
-        <w:rPr>
-          <w:rFonts w:ascii="Arial Narrow" w:hAnsi="Arial Narrow" w:cs="Arial"/>
-          <w:bCs/>
-          <w:sz w:val="20"/>
-          <w:szCs w:val="20"/>
-        </w:rPr>
-        <w:t xml:space="preserve"> </w:t>
-      </w:r>
-      <w:r>
-        <w:rPr>
-          <w:rFonts w:ascii="Arial Narrow" w:hAnsi="Arial Narrow" w:cs="Arial"/>
-          <w:bCs/>
-          <w:sz w:val="20"/>
-          <w:szCs w:val="20"/>
-        </w:rPr>
-        <w:t>${</w:t>
-      </w:r>
-      <w:r>
-        <w:rPr>
-          <w:rFonts w:ascii="Arial Narrow" w:hAnsi="Arial Narrow" w:cs="Arial"/>
-          <w:bCs/>
-          <w:sz w:val="20"/>
-          <w:szCs w:val="20"/>
-        </w:rPr>
-        <w:t>DNI__CARNET_DE_EXT</w:t>
-      </w:r>
-      <w:r>
-        <w:rPr>
-          <w:rFonts w:ascii="Arial Narrow" w:hAnsi="Arial Narrow" w:cs="Arial"/>
-          <w:bCs/>
-          <w:sz w:val="20"/>
-          <w:szCs w:val="20"/>
-        </w:rPr>
-        <w:t>}</w:t>
-      </w:r>
-      <w:r>
-        <w:rPr>
-          <w:rFonts w:ascii="Arial Narrow" w:hAnsi="Arial Narrow" w:cs="Arial"/>
-          <w:bCs/>
-          <w:sz w:val="20"/>
-          <w:szCs w:val="20"/>
-        </w:rPr>
-        <w:t xml:space="preserve">, </w:t>
-      </w:r>
-      <w:r>
-        <w:rPr>
-          <w:rFonts w:ascii="Arial Narrow" w:eastAsia="Arial" w:hAnsi="Arial Narrow" w:cs="Arial"/>
-          <w:sz w:val="20"/>
-          <w:szCs w:val="20"/>
-        </w:rPr>
-        <w:t>solicita la autorización para la ubicación e instalación de un (</w:t>
-      </w:r>
-      <w:r>
-        <w:rPr>
-          <w:rFonts w:ascii="Arial Narrow" w:eastAsia="Arial" w:hAnsi="Arial Narrow" w:cs="Arial"/>
-          <w:sz w:val="20"/>
-          <w:szCs w:val="20"/>
-        </w:rPr>
-        <w:t>01) “</w:t>
-      </w:r>
-      <w:r>
-        <w:rPr>
-          <w:rFonts w:ascii="Arial Narrow" w:eastAsia="Arial" w:hAnsi="Arial Narrow" w:cs="Arial"/>
-          <w:color w:val="0070C0"/>
-          <w:sz w:val="20"/>
-          <w:szCs w:val="20"/>
-        </w:rPr>
-        <w:t>aviso publicitario simple</w:t>
-      </w:r>
-      <w:r>
-        <w:rPr>
-          <w:rFonts w:ascii="Arial Narrow" w:eastAsia="Arial" w:hAnsi="Arial Narrow" w:cs="Arial"/>
-          <w:sz w:val="20"/>
-          <w:szCs w:val="20"/>
-        </w:rPr>
-        <w:t>”</w:t>
-      </w:r>
-      <w:r>
-        <w:rPr>
-          <w:rFonts w:ascii="Arial Narrow" w:hAnsi="Arial Narrow" w:cs="Arial"/>
-          <w:bCs/>
-          <w:sz w:val="20"/>
-          <w:szCs w:val="20"/>
-        </w:rPr>
-        <w:t>, para el predio ubicado en</w:t>
-      </w:r>
-      <w:r>
-        <w:rPr>
-          <w:rFonts w:ascii="Arial Narrow" w:hAnsi="Arial Narrow" w:cs="Arial"/>
-          <w:bCs/>
-          <w:sz w:val="20"/>
-          <w:szCs w:val="20"/>
-        </w:rPr>
-        <w:t xml:space="preserve"> </w:t>
-      </w:r>
-      <w:r>
-        <w:rPr>
-          <w:rFonts w:ascii="Arial Narrow" w:hAnsi="Arial Narrow" w:cs="Arial"/>
-          <w:bCs/>
-          <w:sz w:val="20"/>
-          <w:szCs w:val="20"/>
-        </w:rPr>
-        <w:lastRenderedPageBreak/>
-        <w:t>${</w:t>
-      </w:r>
-      <w:r>
-        <w:rPr>
-          <w:rFonts w:ascii="Arial Narrow" w:hAnsi="Arial Narrow" w:cs="Arial"/>
-          <w:bCs/>
-          <w:sz w:val="20"/>
-          <w:szCs w:val="20"/>
-        </w:rPr>
-        <w:t>DIRECCION_DEL_PREDIO_MATERIA_A_EVALUAR</w:t>
-      </w:r>
-      <w:r>
-        <w:rPr>
-          <w:rFonts w:ascii="Arial Narrow" w:hAnsi="Arial Narrow" w:cs="Arial"/>
-          <w:bCs/>
-          <w:sz w:val="20"/>
-          <w:szCs w:val="20"/>
-        </w:rPr>
-        <w:t>}</w:t>
-      </w:r>
-      <w:r>
-        <w:rPr>
-          <w:rFonts w:ascii="Arial Narrow" w:eastAsia="Arial" w:hAnsi="Arial Narrow" w:cs="Arial"/>
-          <w:sz w:val="20"/>
-          <w:szCs w:val="20"/>
-        </w:rPr>
-        <w:t>,</w:t>
-      </w:r>
-      <w:r>
-        <w:rPr>
-          <w:rFonts w:ascii="Arial Narrow" w:eastAsia="Arial" w:hAnsi="Arial Narrow" w:cs="Arial"/>
-          <w:sz w:val="20"/>
-          <w:szCs w:val="20"/>
-        </w:rPr>
-        <w:t xml:space="preserve"> Distrito de La Molina</w:t>
-      </w:r>
-      <w:r>
-        <w:rPr>
-          <w:rFonts w:ascii="Arial Narrow" w:eastAsia="Arial" w:hAnsi="Arial Narrow" w:cs="Arial"/>
-          <w:sz w:val="20"/>
-          <w:szCs w:val="20"/>
-        </w:rPr>
-        <w:t>,</w:t>
-      </w:r>
-      <w:r>
-        <w:rPr>
-          <w:rFonts w:ascii="Arial Narrow" w:hAnsi="Arial Narrow" w:cs="Arial"/>
-          <w:sz w:val="20"/>
-          <w:szCs w:val="20"/>
-        </w:rPr>
-        <w:t xml:space="preserve"> Provincia y departamento de Lima.</w:t>
-      </w:r>
-      <w:r>
-        <w:rPr>
-          <w:rFonts w:ascii="Arial Narrow" w:hAnsi="Arial Narrow" w:cs="Arial"/>
-          <w:sz w:val="20"/>
-          <w:szCs w:val="20"/>
-        </w:rPr>
-        <w:t xml:space="preserve"> </w:t>
+          <w:rFonts w:ascii="Arial Narrow" w:eastAsia="Arial" w:hAnsi="Arial Narrow" w:cs="Arial"/>
+          <w:sz w:val="20"/>
+          <w:szCs w:val="20"/>
+        </w:rPr>
+        <w:t>, Distrito de La Molina,</w:t>
+      </w:r>
+      <w:r>
+        <w:rPr>
+          <w:rFonts w:ascii="Arial Narrow" w:hAnsi="Arial Narrow" w:cs="Arial"/>
+          <w:sz w:val="20"/>
+          <w:szCs w:val="20"/>
+        </w:rPr>
+        <w:t xml:space="preserve"> Provincia y departamento de Lima. </w:t>
       </w:r>
     </w:p>
     <w:p>
@@ -3347,47 +2518,7 @@
           <w:sz w:val="20"/>
           <w:szCs w:val="20"/>
         </w:rPr>
-        <w:t xml:space="preserve"> </w:t>
-      </w:r>
-      <w:r>
-        <w:rPr>
-          <w:rFonts w:ascii="Arial Narrow" w:hAnsi="Arial Narrow" w:cs="Arial"/>
-          <w:sz w:val="20"/>
-          <w:szCs w:val="20"/>
-        </w:rPr>
-        <w:t>2682-2024</w:t>
-      </w:r>
-      <w:r>
-        <w:rPr>
-          <w:rFonts w:ascii="Arial Narrow" w:hAnsi="Arial Narrow" w:cs="Arial"/>
-          <w:sz w:val="20"/>
-          <w:szCs w:val="20"/>
-        </w:rPr>
-        <w:t>-MML</w:t>
-      </w:r>
-      <w:r>
-        <w:rPr>
-          <w:rFonts w:ascii="Arial Narrow" w:hAnsi="Arial Narrow" w:cs="Arial"/>
-          <w:sz w:val="20"/>
-          <w:szCs w:val="20"/>
-        </w:rPr>
-        <w:t xml:space="preserve">, </w:t>
-      </w:r>
-      <w:r>
-        <w:rPr>
-          <w:rFonts w:ascii="Arial Narrow" w:hAnsi="Arial Narrow" w:cs="Arial"/>
-          <w:sz w:val="20"/>
-          <w:szCs w:val="20"/>
-        </w:rPr>
-        <w:t>Ordenanza que regula la ubicación de elementos de publicidad exterior en la provincia de Lima</w:t>
-      </w:r>
-      <w:r>
-        <w:rPr>
-          <w:rFonts w:ascii="Arial Narrow" w:hAnsi="Arial Narrow" w:cs="Arial"/>
-          <w:sz w:val="20"/>
-          <w:szCs w:val="20"/>
-        </w:rPr>
-        <w:t xml:space="preserve">, </w:t>
+        <w:t xml:space="preserve"> 2682-2024-MML, Ordenanza que regula la ubicación de elementos de publicidad exterior en la provincia de Lima, </w:t>
       </w:r>
       <w:r>
         <w:rPr>
@@ -3397,7 +2528,14 @@
           <w:szCs w:val="20"/>
           <w:lang w:eastAsia="es-PE"/>
         </w:rPr>
-        <w:t xml:space="preserve">Que, respeto a la normativa que regula la instalación de elementos de publicidad exterior, se tiene que, con fecha jueves </w:t>
+        <w:t xml:space="preserve">Que, respeto a la normativa que regula la instalación de elementos de publicidad exterior, se tiene que, con fecha jueves 19 de diciembre de 2024, se publicó en el Diario Oficial El Peruano la Ordenanza N°2682-2024-MML, Ordenanza que regula las disposiciones técnicas y procedimientos administrativos de autorización para la ubicación de elementos de publicidad exterior en los distritos de la provincia de Lima; ordenanza que deroga la </w:t>
+      </w:r>
+      <w:r>
+        <w:rPr>
+          <w:rFonts w:ascii="Arial Narrow" w:hAnsi="Arial Narrow" w:cs="Arial"/>
+          <w:sz w:val="20"/>
+        </w:rPr>
+        <w:t xml:space="preserve">Ordenanza N°2348-2021-MML, Ordenanza que regula las disposiciones técnicas y procedimientos administrativos de autorización para la ubicación de elementos de publicidad exterior en los distritos de la provincia de Lima y deroga a la </w:t>
       </w:r>
       <w:r>
         <w:rPr>
@@ -3407,301 +2545,7 @@
           <w:szCs w:val="20"/>
           <w:lang w:eastAsia="es-PE"/>
         </w:rPr>
-        <w:t>19</w:t>
-      </w:r>
-      <w:r>
-        <w:rPr>
-          <w:rFonts w:ascii="Arial Narrow" w:eastAsia="Times New Roman" w:hAnsi="Arial Narrow" w:cs="Arial-BoldMT"/>
-          <w:bCs/>
-          <w:sz w:val="20"/>
-          <w:szCs w:val="20"/>
-          <w:lang w:eastAsia="es-PE"/>
-        </w:rPr>
-        <w:t xml:space="preserve"> de </w:t>
-      </w:r>
-      <w:r>
-        <w:rPr>
-          <w:rFonts w:ascii="Arial Narrow" w:eastAsia="Times New Roman" w:hAnsi="Arial Narrow" w:cs="Arial-BoldMT"/>
-          <w:bCs/>
-          <w:sz w:val="20"/>
-          <w:szCs w:val="20"/>
-          <w:lang w:eastAsia="es-PE"/>
-        </w:rPr>
-        <w:t>diciembre</w:t>
-      </w:r>
-      <w:r>
-        <w:rPr>
-          <w:rFonts w:ascii="Arial Narrow" w:eastAsia="Times New Roman" w:hAnsi="Arial Narrow" w:cs="Arial-BoldMT"/>
-          <w:bCs/>
-          <w:sz w:val="20"/>
-          <w:szCs w:val="20"/>
-          <w:lang w:eastAsia="es-PE"/>
-        </w:rPr>
-        <w:t xml:space="preserve"> de 202</w:t>
-      </w:r>
-      <w:r>
-        <w:rPr>
-          <w:rFonts w:ascii="Arial Narrow" w:eastAsia="Times New Roman" w:hAnsi="Arial Narrow" w:cs="Arial-BoldMT"/>
-          <w:bCs/>
-          <w:sz w:val="20"/>
-          <w:szCs w:val="20"/>
-          <w:lang w:eastAsia="es-PE"/>
-        </w:rPr>
-        <w:t>4</w:t>
-      </w:r>
-      <w:r>
-        <w:rPr>
-          <w:rFonts w:ascii="Arial Narrow" w:eastAsia="Times New Roman" w:hAnsi="Arial Narrow" w:cs="Arial-BoldMT"/>
-          <w:bCs/>
-          <w:sz w:val="20"/>
-          <w:szCs w:val="20"/>
-          <w:lang w:eastAsia="es-PE"/>
-        </w:rPr>
-        <w:t>, se publicó en el Diario Oficia</w:t>
-      </w:r>
-      <w:r>
-        <w:rPr>
-          <w:rFonts w:ascii="Arial Narrow" w:eastAsia="Times New Roman" w:hAnsi="Arial Narrow" w:cs="Arial-BoldMT"/>
-          <w:bCs/>
-          <w:sz w:val="20"/>
-          <w:szCs w:val="20"/>
-          <w:lang w:eastAsia="es-PE"/>
-        </w:rPr>
-        <w:t>l El Peruano la Ordenanza N°2682</w:t>
-      </w:r>
-      <w:r>
-        <w:rPr>
-          <w:rFonts w:ascii="Arial Narrow" w:eastAsia="Times New Roman" w:hAnsi="Arial Narrow" w:cs="Arial-BoldMT"/>
-          <w:bCs/>
-          <w:sz w:val="20"/>
-          <w:szCs w:val="20"/>
-          <w:lang w:eastAsia="es-PE"/>
-        </w:rPr>
-        <w:t>-202</w:t>
-      </w:r>
-      <w:r>
-        <w:rPr>
-          <w:rFonts w:ascii="Arial Narrow" w:eastAsia="Times New Roman" w:hAnsi="Arial Narrow" w:cs="Arial-BoldMT"/>
-          <w:bCs/>
-          <w:sz w:val="20"/>
-          <w:szCs w:val="20"/>
-          <w:lang w:eastAsia="es-PE"/>
-        </w:rPr>
-        <w:t>4</w:t>
-      </w:r>
-      <w:r>
-        <w:rPr>
-          <w:rFonts w:ascii="Arial Narrow" w:eastAsia="Times New Roman" w:hAnsi="Arial Narrow" w:cs="Arial-BoldMT"/>
-          <w:bCs/>
-          <w:sz w:val="20"/>
-          <w:szCs w:val="20"/>
-          <w:lang w:eastAsia="es-PE"/>
-        </w:rPr>
-        <w:t xml:space="preserve">-MML, Ordenanza que regula las disposiciones técnicas y procedimientos administrativos de autorización para la ubicación de elementos de publicidad exterior en los distritos de la provincia de Lima; ordenanza que deroga la </w:t>
-      </w:r>
-      <w:r>
-        <w:rPr>
-          <w:rFonts w:ascii="Arial Narrow" w:hAnsi="Arial Narrow" w:cs="Arial"/>
-          <w:sz w:val="20"/>
-        </w:rPr>
-        <w:t>Ordenanza N°2348-2021-MML, Ordenanza que regula las disposiciones técnicas y procedimientos administrativos de autorización para la ubicación de elementos de publicidad exterior en los dis</w:t>
-      </w:r>
-      <w:r>
-        <w:rPr>
-          <w:rFonts w:ascii="Arial Narrow" w:hAnsi="Arial Narrow" w:cs="Arial"/>
-          <w:sz w:val="20"/>
-        </w:rPr>
-        <w:t xml:space="preserve">tritos de la provincia de Lima y deroga a la </w:t>
-      </w:r>
-      <w:r>
-        <w:rPr>
-          <w:rFonts w:ascii="Arial Narrow" w:eastAsia="Times New Roman" w:hAnsi="Arial Narrow" w:cs="Arial-BoldMT"/>
-          <w:bCs/>
-          <w:sz w:val="20"/>
-          <w:szCs w:val="20"/>
-          <w:lang w:eastAsia="es-PE"/>
-        </w:rPr>
-        <w:t xml:space="preserve">Ordenanza Nº1094 y su modificatoria </w:t>
-      </w:r>
-      <w:r>
-        <w:rPr>
-          <w:rFonts w:ascii="Arial Narrow" w:eastAsia="Times New Roman" w:hAnsi="Arial Narrow" w:cs="Arial-BoldMT"/>
-          <w:bCs/>
-          <w:sz w:val="20"/>
-          <w:szCs w:val="20"/>
-          <w:lang w:eastAsia="es-PE"/>
-        </w:rPr>
-        <w:t xml:space="preserve">la </w:t>
-      </w:r>
-      <w:r>
-        <w:rPr>
-          <w:rFonts w:ascii="Arial Narrow" w:eastAsia="Times New Roman" w:hAnsi="Arial Narrow" w:cs="Arial-BoldMT"/>
-          <w:bCs/>
-          <w:sz w:val="20"/>
-          <w:szCs w:val="20"/>
-          <w:lang w:eastAsia="es-PE"/>
-        </w:rPr>
-        <w:t>Ordenanza Nº1703, así como todas aquellas disposiciones que se oponen a la presente normativa; en tal sentido, en el art. 1 señala “La presente ordenanza tiene por objeto regular la ubicación de elementos de publicidad exterior (EPE) en la</w:t>
-      </w:r>
-      <w:r>
-        <w:rPr>
-          <w:rFonts w:ascii="Arial Narrow" w:eastAsia="Times New Roman" w:hAnsi="Arial Narrow" w:cs="Arial-BoldMT"/>
-          <w:bCs/>
-          <w:sz w:val="20"/>
-          <w:szCs w:val="20"/>
-          <w:lang w:eastAsia="es-PE"/>
-        </w:rPr>
-        <w:t xml:space="preserve"> </w:t>
-      </w:r>
-      <w:r>
-        <w:rPr>
-          <w:rFonts w:ascii="Arial Narrow" w:eastAsia="Times New Roman" w:hAnsi="Arial Narrow" w:cs="Arial-BoldMT"/>
-          <w:bCs/>
-          <w:sz w:val="20"/>
-          <w:szCs w:val="20"/>
-          <w:lang w:eastAsia="es-PE"/>
-        </w:rPr>
-        <w:t>provincia de Lima. Tiene por finalidad, establecer las disposiciones técnicas y normativas que regulan la</w:t>
-      </w:r>
-      <w:r>
-        <w:rPr>
-          <w:rFonts w:ascii="Arial Narrow" w:eastAsia="Times New Roman" w:hAnsi="Arial Narrow" w:cs="Arial-BoldMT"/>
-          <w:bCs/>
-          <w:sz w:val="20"/>
-          <w:szCs w:val="20"/>
-          <w:lang w:eastAsia="es-PE"/>
-        </w:rPr>
-        <w:t xml:space="preserve"> </w:t>
-      </w:r>
-      <w:r>
-        <w:rPr>
-          <w:rFonts w:ascii="Arial Narrow" w:eastAsia="Times New Roman" w:hAnsi="Arial Narrow" w:cs="Arial-BoldMT"/>
-          <w:bCs/>
-          <w:sz w:val="20"/>
-          <w:szCs w:val="20"/>
-          <w:lang w:eastAsia="es-PE"/>
-        </w:rPr>
-        <w:t>ubicación de los elementos de publicidad exterior (EPE) en la provincia de Lima, en favor del crecimiento</w:t>
-      </w:r>
-      <w:r>
-        <w:rPr>
-          <w:rFonts w:ascii="Arial Narrow" w:eastAsia="Times New Roman" w:hAnsi="Arial Narrow" w:cs="Arial-BoldMT"/>
-          <w:bCs/>
-          <w:sz w:val="20"/>
-          <w:szCs w:val="20"/>
-          <w:lang w:eastAsia="es-PE"/>
-        </w:rPr>
-        <w:t xml:space="preserve"> </w:t>
-      </w:r>
-      <w:r>
-        <w:rPr>
-          <w:rFonts w:ascii="Arial Narrow" w:eastAsia="Times New Roman" w:hAnsi="Arial Narrow" w:cs="Arial-BoldMT"/>
-          <w:bCs/>
-          <w:sz w:val="20"/>
-          <w:szCs w:val="20"/>
-          <w:lang w:eastAsia="es-PE"/>
-        </w:rPr>
-        <w:t>ordenado de la ciudad y el interés público; sin que su propagación genere incremento de contaminación</w:t>
-      </w:r>
-      <w:r>
-        <w:rPr>
-          <w:rFonts w:ascii="Arial Narrow" w:eastAsia="Times New Roman" w:hAnsi="Arial Narrow" w:cs="Arial-BoldMT"/>
-          <w:bCs/>
-          <w:sz w:val="20"/>
-          <w:szCs w:val="20"/>
-          <w:lang w:eastAsia="es-PE"/>
-        </w:rPr>
-        <w:t xml:space="preserve"> </w:t>
-      </w:r>
-      <w:r>
-        <w:rPr>
-          <w:rFonts w:ascii="Arial Narrow" w:eastAsia="Times New Roman" w:hAnsi="Arial Narrow" w:cs="Arial-BoldMT"/>
-          <w:bCs/>
-          <w:sz w:val="20"/>
-          <w:szCs w:val="20"/>
-          <w:lang w:eastAsia="es-PE"/>
-        </w:rPr>
-        <w:t>visual y lumínica; así como, para cautelar la seguridad pública y el derecho al bienestar de toda la</w:t>
-      </w:r>
-      <w:r>
-        <w:rPr>
-          <w:rFonts w:ascii="Arial Narrow" w:eastAsia="Times New Roman" w:hAnsi="Arial Narrow" w:cs="Arial-BoldMT"/>
-          <w:bCs/>
-          <w:sz w:val="20"/>
-          <w:szCs w:val="20"/>
-          <w:lang w:eastAsia="es-PE"/>
-        </w:rPr>
-        <w:t xml:space="preserve"> </w:t>
-      </w:r>
-      <w:r>
-        <w:rPr>
-          <w:rFonts w:ascii="Arial Narrow" w:eastAsia="Times New Roman" w:hAnsi="Arial Narrow" w:cs="Arial-BoldMT"/>
-          <w:bCs/>
-          <w:sz w:val="20"/>
-          <w:szCs w:val="20"/>
-          <w:lang w:eastAsia="es-PE"/>
-        </w:rPr>
-        <w:t>ciudadanía, primando como criterio, la conservación de la armonía del paisaje urbano y la imagen de la</w:t>
-      </w:r>
-      <w:r>
-        <w:rPr>
-          <w:rFonts w:ascii="Arial Narrow" w:eastAsia="Times New Roman" w:hAnsi="Arial Narrow" w:cs="Arial-BoldMT"/>
-          <w:bCs/>
-          <w:sz w:val="20"/>
-          <w:szCs w:val="20"/>
-          <w:lang w:eastAsia="es-PE"/>
-        </w:rPr>
-        <w:t xml:space="preserve"> </w:t>
-      </w:r>
-      <w:r>
-        <w:rPr>
-          <w:rFonts w:ascii="Arial Narrow" w:eastAsia="Times New Roman" w:hAnsi="Arial Narrow" w:cs="Arial-BoldMT"/>
-          <w:bCs/>
-          <w:sz w:val="20"/>
-          <w:szCs w:val="20"/>
-          <w:lang w:eastAsia="es-PE"/>
-        </w:rPr>
-        <w:t xml:space="preserve">ciudad.”; y el artículo </w:t>
-      </w:r>
-      <w:r>
-        <w:rPr>
-          <w:rFonts w:ascii="Arial Narrow" w:eastAsia="Times New Roman" w:hAnsi="Arial Narrow" w:cs="Arial-BoldMT"/>
-          <w:bCs/>
-          <w:sz w:val="20"/>
-          <w:szCs w:val="20"/>
-          <w:lang w:eastAsia="es-PE"/>
-        </w:rPr>
-        <w:t>3</w:t>
-      </w:r>
-      <w:r>
-        <w:rPr>
-          <w:rFonts w:ascii="Arial Narrow" w:eastAsia="Times New Roman" w:hAnsi="Arial Narrow" w:cs="Arial-BoldMT"/>
-          <w:bCs/>
-          <w:sz w:val="20"/>
-          <w:szCs w:val="20"/>
-          <w:lang w:eastAsia="es-PE"/>
-        </w:rPr>
-        <w:t>° establece que, “La presente ordenanza tiene alcance metropolitano , en consecuencia , su cumplimiento es obligatorio en toda</w:t>
-      </w:r>
-      <w:r>
-        <w:rPr>
-          <w:rFonts w:ascii="Arial Narrow" w:eastAsia="Times New Roman" w:hAnsi="Arial Narrow" w:cs="Arial-BoldMT"/>
-          <w:bCs/>
-          <w:sz w:val="20"/>
-          <w:szCs w:val="20"/>
-          <w:lang w:eastAsia="es-PE"/>
-        </w:rPr>
-        <w:t xml:space="preserve"> </w:t>
-      </w:r>
-      <w:r>
-        <w:rPr>
-          <w:rFonts w:ascii="Arial Narrow" w:eastAsia="Times New Roman" w:hAnsi="Arial Narrow" w:cs="Arial-BoldMT"/>
-          <w:bCs/>
-          <w:sz w:val="20"/>
-          <w:szCs w:val="20"/>
-          <w:lang w:eastAsia="es-PE"/>
-        </w:rPr>
-        <w:t>la jurisdicción de la provincia de Lima; con excepción del Centro Histórico de Lima, el cual tiene una propia regulación.;</w:t>
+        <w:t>Ordenanza Nº1094 y su modificatoria la Ordenanza Nº1703, así como todas aquellas disposiciones que se oponen a la presente normativa; en tal sentido, en el art. 1 señala “La presente ordenanza tiene por objeto regular la ubicación de elementos de publicidad exterior (EPE) en la provincia de Lima. Tiene por finalidad, establecer las disposiciones técnicas y normativas que regulan la ubicación de los elementos de publicidad exterior (EPE) en la provincia de Lima, en favor del crecimiento ordenado de la ciudad y el interés público; sin que su propagación genere incremento de contaminación visual y lumínica; así como, para cautelar la seguridad pública y el derecho al bienestar de toda la ciudadanía, primando como criterio, la conservación de la armonía del paisaje urbano y la imagen de la ciudad.”; y el artículo 3° establece que, “La presente ordenanza tiene alcance metropolitano , en consecuencia , su cumplimiento es obligatorio en toda la jurisdicción de la provincia de Lima; con excepción del Centro Histórico de Lima, el cual tiene una propia regulación.;</w:t>
       </w:r>
     </w:p>
     <w:p>
@@ -3724,27 +2568,7 @@
           <w:szCs w:val="20"/>
           <w:lang w:eastAsia="es-PE"/>
         </w:rPr>
-        <w:t xml:space="preserve">Que, es importante precisar que el artículo </w:t>
-      </w:r>
-      <w:r>
-        <w:rPr>
-          <w:rFonts w:ascii="Arial Narrow" w:eastAsia="Times New Roman" w:hAnsi="Arial Narrow" w:cs="Arial-BoldMT"/>
-          <w:bCs/>
-          <w:sz w:val="20"/>
-          <w:szCs w:val="20"/>
-          <w:lang w:eastAsia="es-PE"/>
-        </w:rPr>
-        <w:t>50</w:t>
-      </w:r>
-      <w:r>
-        <w:rPr>
-          <w:rFonts w:ascii="Arial Narrow" w:eastAsia="Times New Roman" w:hAnsi="Arial Narrow" w:cs="Arial-BoldMT"/>
-          <w:bCs/>
-          <w:sz w:val="20"/>
-          <w:szCs w:val="20"/>
-          <w:lang w:eastAsia="es-PE"/>
-        </w:rPr>
-        <w:t>° de la norma en comento; establece prohibiciones de obligatorio cumplimiento, en relación a los bienes de dominio privado, público y unidades móviles;</w:t>
+        <w:t>Que, es importante precisar que el artículo 50° de la norma en comento; establece prohibiciones de obligatorio cumplimiento, en relación a los bienes de dominio privado, público y unidades móviles;</w:t>
       </w:r>
     </w:p>
     <w:p>
@@ -3771,24 +2595,7 @@
           <w:sz w:val="20"/>
           <w:szCs w:val="20"/>
         </w:rPr>
-        <w:t xml:space="preserve">Que, por su parte, el TUPA de la Municipalidad distrital de La Molina, regula que, para obtener la autorización de instalación o ubicación de avisos de publicidad exterior en predios o vía pública - </w:t>
-      </w:r>
-      <w:r>
-        <w:rPr>
-          <w:rFonts w:ascii="Arial Narrow" w:hAnsi="Arial Narrow" w:cs="Arial"/>
-          <w:color w:val="0070C0"/>
-          <w:sz w:val="20"/>
-          <w:szCs w:val="20"/>
-        </w:rPr>
-        <w:t>anuncios o avisos publicitarios simple</w:t>
-      </w:r>
-      <w:r>
-        <w:rPr>
-          <w:rFonts w:ascii="Arial Narrow" w:hAnsi="Arial Narrow" w:cs="Arial"/>
-          <w:sz w:val="20"/>
-          <w:szCs w:val="20"/>
-        </w:rPr>
-        <w:t>, de la referencia a); adjunta los siguientes documentos:</w:t>
+        <w:t>Que, por su parte, el TUPA de la Municipalidad distrital de La Molina, regula que, para obtener la autorización de instalación o ubicación de avisos de publicidad exterior en predios o vía pública - anuncios o avisos publicitarios simple, de la referencia a); adjunta los siguientes documentos:</w:t>
       </w:r>
     </w:p>
     <w:p>
@@ -3952,59 +2759,7 @@
           <w:sz w:val="20"/>
           <w:lang w:val="es-PE"/>
         </w:rPr>
-        <w:t xml:space="preserve">, por el monto de </w:t>
-      </w:r>
-      <w:r>
-        <w:rPr>
-          <w:rFonts w:ascii="Arial Narrow" w:hAnsi="Arial Narrow" w:cs="Arial"/>
-          <w:sz w:val="20"/>
-          <w:lang w:val="es-PE"/>
-        </w:rPr>
-        <w:t xml:space="preserve">S/ </w:t>
-      </w:r>
-      <w:r>
-        <w:rPr>
-          <w:rFonts w:ascii="Arial Narrow" w:hAnsi="Arial Narrow" w:cs="Arial"/>
-          <w:color w:val="0070C0"/>
-          <w:sz w:val="20"/>
-          <w:lang w:val="es-PE"/>
-        </w:rPr>
-        <w:t>297</w:t>
-      </w:r>
-      <w:r>
-        <w:rPr>
-          <w:rFonts w:ascii="Arial Narrow" w:hAnsi="Arial Narrow" w:cs="Arial"/>
-          <w:color w:val="0070C0"/>
-          <w:sz w:val="20"/>
-          <w:lang w:val="es-PE"/>
-        </w:rPr>
-        <w:t>.</w:t>
-      </w:r>
-      <w:r>
-        <w:rPr>
-          <w:rFonts w:ascii="Arial Narrow" w:hAnsi="Arial Narrow" w:cs="Arial"/>
-          <w:color w:val="0070C0"/>
-          <w:sz w:val="20"/>
-          <w:lang w:val="es-PE"/>
-        </w:rPr>
-        <w:t>0</w:t>
-      </w:r>
-      <w:r>
-        <w:rPr>
-          <w:rFonts w:ascii="Arial Narrow" w:hAnsi="Arial Narrow" w:cs="Arial"/>
-          <w:color w:val="0070C0"/>
-          <w:sz w:val="20"/>
-          <w:lang w:val="es-PE"/>
-        </w:rPr>
-        <w:t>0</w:t>
-      </w:r>
-      <w:r>
-        <w:rPr>
-          <w:rFonts w:ascii="Arial Narrow" w:hAnsi="Arial Narrow" w:cs="Arial"/>
-          <w:sz w:val="20"/>
-          <w:lang w:val="es-PE"/>
-        </w:rPr>
-        <w:t>.</w:t>
+        <w:t>, por el monto de S/ 297.00.</w:t>
       </w:r>
     </w:p>
     <w:p>
@@ -4132,16 +2887,15 @@
           <w:sz w:val="20"/>
           <w:lang w:val="es-PE"/>
         </w:rPr>
-        <w:t xml:space="preserve">con </w:t>
-      </w:r>
-      <w:r>
-        <w:rPr>
-          <w:rFonts w:ascii="Arial Narrow" w:hAnsi="Arial Narrow" w:cs="Arial"/>
-          <w:color w:val="0070C0"/>
+        <w:t xml:space="preserve">con RUC </w:t>
+      </w:r>
+      <w:r>
+        <w:rPr>
+          <w:rFonts w:ascii="Arial Narrow" w:hAnsi="Arial Narrow" w:cs="Arial"/>
           <w:sz w:val="20"/>
           <w:lang w:val="es-PE"/>
         </w:rPr>
-        <w:t>RUC</w:t>
+        <w:t>${</w:t>
       </w:r>
       <w:r>
         <w:rPr>
@@ -4149,7 +2903,7 @@
           <w:sz w:val="20"/>
           <w:lang w:val="es-PE"/>
         </w:rPr>
-        <w:t xml:space="preserve"> </w:t>
+        <w:t>DNI_RUC</w:t>
       </w:r>
       <w:r>
         <w:rPr>
@@ -4157,7 +2911,7 @@
           <w:sz w:val="20"/>
           <w:lang w:val="es-PE"/>
         </w:rPr>
-        <w:t>${</w:t>
+        <w:t>}</w:t>
       </w:r>
       <w:r>
         <w:rPr>
@@ -4165,22 +2919,6 @@
           <w:sz w:val="20"/>
           <w:lang w:val="es-PE"/>
         </w:rPr>
-        <w:t>DNI_RUC</w:t>
-      </w:r>
-      <w:r>
-        <w:rPr>
-          <w:rFonts w:ascii="Arial Narrow" w:hAnsi="Arial Narrow" w:cs="Arial"/>
-          <w:sz w:val="20"/>
-          <w:lang w:val="es-PE"/>
-        </w:rPr>
-        <w:t>}</w:t>
-      </w:r>
-      <w:r>
-        <w:rPr>
-          <w:rFonts w:ascii="Arial Narrow" w:hAnsi="Arial Narrow" w:cs="Arial"/>
-          <w:sz w:val="20"/>
-          <w:lang w:val="es-PE"/>
-        </w:rPr>
         <w:t>.</w:t>
       </w:r>
     </w:p>
@@ -4201,61 +2939,7 @@
           <w:sz w:val="20"/>
           <w:szCs w:val="20"/>
         </w:rPr>
-        <w:t xml:space="preserve">Por el cual se constata el CUMPLIMIENTO de requisitos establecidos en el Texto Único de Procedimientos Administrativos (TUPA) - </w:t>
-      </w:r>
-      <w:r>
-        <w:rPr>
-          <w:rFonts w:ascii="Arial Narrow" w:hAnsi="Arial Narrow" w:cs="Arial"/>
-          <w:bCs/>
-          <w:sz w:val="20"/>
-          <w:szCs w:val="20"/>
-        </w:rPr>
-        <w:t>Ordenanza N°470-MDLM</w:t>
-      </w:r>
-      <w:r>
-        <w:rPr>
-          <w:rFonts w:ascii="Arial Narrow" w:hAnsi="Arial Narrow" w:cs="Arial"/>
-          <w:bCs/>
-          <w:sz w:val="20"/>
-          <w:szCs w:val="20"/>
-        </w:rPr>
-        <w:t xml:space="preserve">, </w:t>
-      </w:r>
-      <w:r>
-        <w:rPr>
-          <w:rFonts w:ascii="Arial Narrow" w:hAnsi="Arial Narrow" w:cs="Arial"/>
-          <w:bCs/>
-          <w:sz w:val="20"/>
-          <w:szCs w:val="20"/>
-        </w:rPr>
-        <w:t>Decreto de Alcaldía N°</w:t>
-      </w:r>
-      <w:r>
-        <w:rPr>
-          <w:rFonts w:ascii="Arial Narrow" w:hAnsi="Arial Narrow" w:cs="Arial"/>
-          <w:bCs/>
-          <w:sz w:val="20"/>
-          <w:szCs w:val="20"/>
-        </w:rPr>
-        <w:t>004-2025/MDLM</w:t>
-      </w:r>
-      <w:r>
-        <w:rPr>
-          <w:rFonts w:ascii="Arial Narrow" w:hAnsi="Arial Narrow" w:cs="Arial"/>
-          <w:bCs/>
-          <w:sz w:val="20"/>
-          <w:szCs w:val="20"/>
-        </w:rPr>
-        <w:t xml:space="preserve"> </w:t>
-      </w:r>
-      <w:r>
-        <w:rPr>
-          <w:rFonts w:ascii="Arial Narrow" w:hAnsi="Arial Narrow" w:cs="Arial"/>
-          <w:bCs/>
-          <w:sz w:val="20"/>
-          <w:szCs w:val="20"/>
-        </w:rPr>
-        <w:t>y modificatorias del TUPA.</w:t>
+        <w:t>Por el cual se constata el CUMPLIMIENTO de requisitos establecidos en el Texto Único de Procedimientos Administrativos (TUPA) - Ordenanza N°470-MDLM, Decreto de Alcaldía N°004-2025/MDLM y modificatorias del TUPA.</w:t>
       </w:r>
     </w:p>
     <w:p>
@@ -4311,42 +2995,49 @@
           <w:bCs/>
           <w:sz w:val="20"/>
         </w:rPr>
-        <w:t>el expediente administrativo y/o documento simple con Número</w:t>
-      </w:r>
+        <w:t xml:space="preserve">el expediente administrativo y/o documento simple con Número de Registro </w:t>
+      </w:r>
+      <w:proofErr w:type="spellStart"/>
       <w:r>
         <w:rPr>
           <w:rFonts w:ascii="Arial Narrow" w:hAnsi="Arial Narrow" w:cs="Arial"/>
           <w:bCs/>
           <w:sz w:val="20"/>
         </w:rPr>
-        <w:t xml:space="preserve"> de Registro </w:t>
-      </w:r>
-      <w:proofErr w:type="spellStart"/>
+        <w:t>N°</w:t>
+      </w:r>
+      <w:proofErr w:type="spellEnd"/>
       <w:r>
         <w:rPr>
           <w:rFonts w:ascii="Arial Narrow" w:hAnsi="Arial Narrow" w:cs="Arial"/>
           <w:bCs/>
           <w:sz w:val="20"/>
         </w:rPr>
-        <w:t>N°</w:t>
-      </w:r>
-      <w:proofErr w:type="spellEnd"/>
+        <w:t xml:space="preserve"> </w:t>
+      </w:r>
+      <w:bookmarkEnd w:id="3"/>
       <w:r>
         <w:rPr>
           <w:rFonts w:ascii="Arial Narrow" w:hAnsi="Arial Narrow" w:cs="Arial"/>
           <w:bCs/>
           <w:sz w:val="20"/>
         </w:rPr>
-        <w:t xml:space="preserve"> </w:t>
-      </w:r>
-      <w:bookmarkEnd w:id="3"/>
+        <w:t>${</w:t>
+      </w:r>
+      <w:r>
+        <w:rPr>
+          <w:rFonts w:ascii="Arial Narrow" w:eastAsia="Arial" w:hAnsi="Arial Narrow" w:cs="Arial"/>
+          <w:sz w:val="20"/>
+        </w:rPr>
+        <w:t>N_EXPEDIENTE</w:t>
+      </w:r>
       <w:r>
         <w:rPr>
           <w:rFonts w:ascii="Arial Narrow" w:hAnsi="Arial Narrow" w:cs="Arial"/>
           <w:bCs/>
           <w:sz w:val="20"/>
         </w:rPr>
-        <w:t>${</w:t>
+        <w:t>}</w:t>
       </w:r>
       <w:r>
         <w:rPr>
@@ -4354,22 +3045,6 @@
           <w:bCs/>
           <w:sz w:val="20"/>
         </w:rPr>
-        <w:t>N_DE_EXPEDIENTE</w:t>
-      </w:r>
-      <w:r>
-        <w:rPr>
-          <w:rFonts w:ascii="Arial Narrow" w:hAnsi="Arial Narrow" w:cs="Arial"/>
-          <w:bCs/>
-          <w:sz w:val="20"/>
-        </w:rPr>
-        <w:t>}</w:t>
-      </w:r>
-      <w:r>
-        <w:rPr>
-          <w:rFonts w:ascii="Arial Narrow" w:hAnsi="Arial Narrow" w:cs="Arial"/>
-          <w:bCs/>
-          <w:sz w:val="20"/>
-        </w:rPr>
         <w:t xml:space="preserve">, </w:t>
       </w:r>
       <w:r>
@@ -4377,44 +3052,7 @@
           <w:rFonts w:ascii="Arial Narrow" w:eastAsia="Arial" w:hAnsi="Arial Narrow" w:cs="Arial"/>
           <w:sz w:val="20"/>
         </w:rPr>
-        <w:t>solicita la autorización para la ubicación e instalación de un (</w:t>
-      </w:r>
-      <w:r>
-        <w:rPr>
-          <w:rFonts w:ascii="Arial Narrow" w:eastAsia="Arial" w:hAnsi="Arial Narrow" w:cs="Arial"/>
-          <w:sz w:val="20"/>
-        </w:rPr>
-        <w:t>01) “</w:t>
-      </w:r>
-      <w:r>
-        <w:rPr>
-          <w:rFonts w:ascii="Arial Narrow" w:eastAsia="Arial" w:hAnsi="Arial Narrow" w:cs="Arial"/>
-          <w:color w:val="0070C0"/>
-          <w:sz w:val="20"/>
-        </w:rPr>
-        <w:t xml:space="preserve">aviso publicitario </w:t>
-      </w:r>
-      <w:r>
-        <w:rPr>
-          <w:rFonts w:ascii="Arial Narrow" w:eastAsia="Arial" w:hAnsi="Arial Narrow" w:cs="Arial"/>
-          <w:color w:val="0070C0"/>
-          <w:sz w:val="20"/>
-        </w:rPr>
-        <w:t>simple</w:t>
-      </w:r>
-      <w:r>
-        <w:rPr>
-          <w:rFonts w:ascii="Arial Narrow" w:eastAsia="Arial" w:hAnsi="Arial Narrow" w:cs="Arial"/>
-          <w:sz w:val="20"/>
-        </w:rPr>
-        <w:t>”</w:t>
-      </w:r>
-      <w:r>
-        <w:rPr>
-          <w:rFonts w:ascii="Arial Narrow" w:eastAsia="Arial" w:hAnsi="Arial Narrow" w:cs="Arial"/>
-          <w:sz w:val="20"/>
-        </w:rPr>
-        <w:t xml:space="preserve"> que cuenta con las siguientes características:</w:t>
+        <w:t>solicita la autorización para la ubicación e instalación de un (01) “aviso publicitario simple” que cuenta con las siguientes características:</w:t>
       </w:r>
     </w:p>
     <w:p>
@@ -4487,7 +3125,6 @@
       <w:r>
         <w:rPr>
           <w:rFonts w:ascii="Arial Narrow" w:eastAsia="Arial" w:hAnsi="Arial Narrow" w:cs="Arial"/>
-          <w:color w:val="FF0000"/>
           <w:sz w:val="20"/>
           <w:szCs w:val="20"/>
         </w:rPr>
@@ -4575,6 +3212,7 @@
           <w:rFonts w:ascii="Arial Narrow" w:eastAsia="Arial" w:hAnsi="Arial Narrow" w:cs="Arial"/>
           <w:sz w:val="20"/>
           <w:szCs w:val="20"/>
+          <w:u w:val="single"/>
         </w:rPr>
       </w:pPr>
       <w:r>
@@ -4602,15 +3240,7 @@
           <w:sz w:val="20"/>
           <w:szCs w:val="20"/>
         </w:rPr>
-        <w:t xml:space="preserve"> </w:t>
-      </w:r>
-      <w:r>
-        <w:rPr>
-          <w:rFonts w:ascii="Arial Narrow" w:eastAsia="Arial" w:hAnsi="Arial Narrow" w:cs="Arial"/>
-          <w:sz w:val="20"/>
-          <w:szCs w:val="20"/>
-        </w:rPr>
-        <w:t xml:space="preserve">1 lado de </w:t>
+        <w:t xml:space="preserve"> 1 lado de </w:t>
       </w:r>
       <w:r>
         <w:rPr>
@@ -4651,7 +3281,6 @@
         <w:jc w:val="both"/>
         <w:rPr>
           <w:rFonts w:ascii="Arial Narrow" w:eastAsia="Arial" w:hAnsi="Arial Narrow" w:cs="Arial"/>
-          <w:color w:val="FF0000"/>
           <w:sz w:val="20"/>
           <w:szCs w:val="20"/>
         </w:rPr>
@@ -4673,21 +3302,11 @@
           <w:szCs w:val="20"/>
         </w:rPr>
         <w:tab/>
-      </w:r>
-      <w:r>
-        <w:rPr>
-          <w:rFonts w:ascii="Arial Narrow" w:eastAsia="Arial" w:hAnsi="Arial Narrow" w:cs="Arial"/>
-          <w:b/>
-          <w:color w:val="FF0000"/>
-          <w:sz w:val="20"/>
-          <w:szCs w:val="20"/>
-        </w:rPr>
         <w:t>:</w:t>
       </w:r>
       <w:r>
         <w:rPr>
           <w:rFonts w:ascii="Arial Narrow" w:eastAsia="Arial" w:hAnsi="Arial Narrow" w:cs="Arial"/>
-          <w:color w:val="FF0000"/>
           <w:sz w:val="20"/>
           <w:szCs w:val="20"/>
         </w:rPr>
@@ -4696,7 +3315,6 @@
       <w:r>
         <w:rPr>
           <w:rFonts w:ascii="Arial Narrow" w:eastAsia="Arial" w:hAnsi="Arial Narrow" w:cs="Arial"/>
-          <w:color w:val="FF0000"/>
           <w:sz w:val="20"/>
           <w:szCs w:val="20"/>
         </w:rPr>
@@ -4705,7 +3323,6 @@
       <w:r>
         <w:rPr>
           <w:rFonts w:ascii="Arial Narrow" w:eastAsia="Arial" w:hAnsi="Arial Narrow" w:cs="Arial"/>
-          <w:color w:val="FF0000"/>
           <w:sz w:val="20"/>
           <w:szCs w:val="20"/>
         </w:rPr>
@@ -4714,7 +3331,6 @@
       <w:r>
         <w:rPr>
           <w:rFonts w:ascii="Arial Narrow" w:eastAsia="Arial" w:hAnsi="Arial Narrow" w:cs="Arial"/>
-          <w:color w:val="FF0000"/>
           <w:sz w:val="20"/>
           <w:szCs w:val="20"/>
         </w:rPr>
@@ -4735,7 +3351,6 @@
         <w:jc w:val="both"/>
         <w:rPr>
           <w:rFonts w:ascii="Arial Narrow" w:eastAsia="Arial" w:hAnsi="Arial Narrow" w:cs="Arial"/>
-          <w:color w:val="FF0000"/>
           <w:sz w:val="20"/>
           <w:szCs w:val="20"/>
         </w:rPr>
@@ -4793,7 +3408,6 @@
       <w:r>
         <w:rPr>
           <w:rFonts w:ascii="Arial Narrow" w:eastAsia="Arial" w:hAnsi="Arial Narrow" w:cs="Arial"/>
-          <w:color w:val="FF0000"/>
           <w:sz w:val="20"/>
           <w:szCs w:val="20"/>
         </w:rPr>
@@ -5021,7 +3635,6 @@
         <w:jc w:val="both"/>
         <w:rPr>
           <w:rFonts w:ascii="Arial Narrow" w:eastAsia="Arial" w:hAnsi="Arial Narrow" w:cs="Arial"/>
-          <w:color w:val="FF0000"/>
           <w:sz w:val="20"/>
           <w:szCs w:val="20"/>
         </w:rPr>
@@ -5106,7 +3719,6 @@
         <w:jc w:val="both"/>
         <w:rPr>
           <w:rFonts w:ascii="Arial Narrow" w:eastAsia="Arial" w:hAnsi="Arial Narrow" w:cs="Arial"/>
-          <w:color w:val="0070C0"/>
           <w:sz w:val="20"/>
           <w:szCs w:val="20"/>
         </w:rPr>
@@ -5165,17 +3777,7 @@
           <w:szCs w:val="20"/>
           <w:u w:val="single"/>
         </w:rPr>
-        <w:t>VISTA DEL ELEMENTO PU</w:t>
-      </w:r>
-      <w:r>
-        <w:rPr>
-          <w:rFonts w:ascii="Arial Narrow" w:eastAsia="Arial" w:hAnsi="Arial Narrow" w:cs="Arial"/>
-          <w:b/>
-          <w:sz w:val="20"/>
-          <w:szCs w:val="20"/>
-          <w:u w:val="single"/>
-        </w:rPr>
-        <w:t>BLICITARIO EN EL LOCAL COMERCIAL</w:t>
+        <w:t>VISTA DEL ELEMENTO PUBLICITARIO EN EL LOCAL COMERCIAL</w:t>
       </w:r>
       <w:r>
         <w:rPr>
@@ -5314,15 +3916,7 @@
           <w:sz w:val="20"/>
           <w:szCs w:val="20"/>
         </w:rPr>
-        <w:t>V</w:t>
-      </w:r>
-      <w:r>
-        <w:rPr>
-          <w:rFonts w:ascii="Arial Narrow" w:eastAsia="Arial" w:hAnsi="Arial Narrow" w:cs="Arial"/>
-          <w:sz w:val="20"/>
-          <w:szCs w:val="20"/>
-        </w:rPr>
-        <w:t>ISTA AMPLIA DONDE SE VISUALIZA EL PREDIO COMPLETO Y ENTORNO URBANO</w:t>
+        <w:t>VISTA AMPLIA DONDE SE VISUALIZA EL PREDIO COMPLETO Y ENTORNO URBANO</w:t>
       </w:r>
     </w:p>
     <w:p>
@@ -5724,16 +4318,15 @@
           <w:sz w:val="20"/>
           <w:lang w:val="es-PE"/>
         </w:rPr>
-        <w:t xml:space="preserve">Se observa que el </w:t>
-      </w:r>
-      <w:r>
-        <w:rPr>
-          <w:rFonts w:ascii="Arial Narrow" w:hAnsi="Arial Narrow" w:cs="Arial"/>
-          <w:color w:val="0070C0"/>
+        <w:t xml:space="preserve">Se observa que el anuncio solicitado, se ubicará en propiedad privada instalado </w:t>
+      </w:r>
+      <w:r>
+        <w:rPr>
+          <w:rFonts w:ascii="Arial Narrow" w:hAnsi="Arial Narrow" w:cs="Arial"/>
           <w:sz w:val="20"/>
           <w:lang w:val="es-PE"/>
         </w:rPr>
-        <w:t xml:space="preserve">anuncio </w:t>
+        <w:t>${</w:t>
       </w:r>
       <w:r>
         <w:rPr>
@@ -5741,7 +4334,7 @@
           <w:sz w:val="20"/>
           <w:lang w:val="es-PE"/>
         </w:rPr>
-        <w:t xml:space="preserve">solicitado, se ubicará en propiedad privada instalado </w:t>
+        <w:t>UBICACIÓN_DEL_ANUNCIO</w:t>
       </w:r>
       <w:r>
         <w:rPr>
@@ -5749,7 +4342,7 @@
           <w:sz w:val="20"/>
           <w:lang w:val="es-PE"/>
         </w:rPr>
-        <w:t>${</w:t>
+        <w:t>}</w:t>
       </w:r>
       <w:r>
         <w:rPr>
@@ -5757,7 +4350,7 @@
           <w:sz w:val="20"/>
           <w:lang w:val="es-PE"/>
         </w:rPr>
-        <w:t>UBICACIÓN_DEL_ANUNCIO</w:t>
+        <w:t xml:space="preserve">, </w:t>
       </w:r>
       <w:r>
         <w:rPr>
@@ -5765,31 +4358,7 @@
           <w:sz w:val="20"/>
           <w:lang w:val="es-PE"/>
         </w:rPr>
-        <w:t>}</w:t>
-      </w:r>
-      <w:r>
-        <w:rPr>
-          <w:rFonts w:ascii="Arial Narrow" w:hAnsi="Arial Narrow" w:cs="Arial"/>
-          <w:sz w:val="20"/>
-          <w:lang w:val="es-PE"/>
-        </w:rPr>
-        <w:t xml:space="preserve">, </w:t>
-      </w:r>
-      <w:r>
-        <w:rPr>
-          <w:rFonts w:ascii="Arial Narrow" w:hAnsi="Arial Narrow" w:cs="Arial"/>
-          <w:sz w:val="20"/>
-          <w:lang w:val="es-PE"/>
-        </w:rPr>
-        <w:t xml:space="preserve">por lo que CUMPLE </w:t>
-      </w:r>
-      <w:r>
-        <w:rPr>
-          <w:rFonts w:ascii="Arial Narrow" w:hAnsi="Arial Narrow" w:cs="Arial"/>
-          <w:sz w:val="20"/>
-          <w:lang w:val="es-PE"/>
-        </w:rPr>
-        <w:t xml:space="preserve">con la Ordenanza </w:t>
+        <w:t xml:space="preserve">por lo que CUMPLE con la Ordenanza </w:t>
       </w:r>
       <w:proofErr w:type="spellStart"/>
       <w:r>
@@ -5856,7 +4425,6 @@
         <w:rPr>
           <w:rFonts w:ascii="Arial Narrow" w:eastAsia="Noto Sans CJK SC Regular" w:hAnsi="Arial Narrow" w:cs="Arial"/>
           <w:bCs/>
-          <w:color w:val="000000" w:themeColor="text1"/>
           <w:sz w:val="20"/>
         </w:rPr>
         <w:t>Ordenanza N°</w:t>
@@ -5872,7 +4440,6 @@
         <w:rPr>
           <w:rFonts w:ascii="Arial Narrow" w:eastAsia="Noto Sans CJK SC Regular" w:hAnsi="Arial Narrow" w:cs="Arial"/>
           <w:bCs/>
-          <w:color w:val="000000" w:themeColor="text1"/>
           <w:sz w:val="20"/>
         </w:rPr>
         <w:t>-MDLM</w:t>
@@ -5881,7 +4448,6 @@
         <w:rPr>
           <w:rFonts w:ascii="Arial Narrow" w:hAnsi="Arial Narrow" w:cs="Arial"/>
           <w:bCs/>
-          <w:color w:val="000000" w:themeColor="text1"/>
           <w:sz w:val="20"/>
         </w:rPr>
         <w:t xml:space="preserve">, Decreto de Alcaldía </w:t>
@@ -5891,7 +4457,6 @@
         <w:rPr>
           <w:rFonts w:ascii="Arial Narrow" w:hAnsi="Arial Narrow" w:cs="Arial"/>
           <w:bCs/>
-          <w:color w:val="000000" w:themeColor="text1"/>
           <w:sz w:val="20"/>
           <w:lang w:val="es-PE"/>
         </w:rPr>
@@ -5902,7 +4467,6 @@
         <w:rPr>
           <w:rFonts w:ascii="Arial Narrow" w:hAnsi="Arial Narrow" w:cs="Arial"/>
           <w:bCs/>
-          <w:color w:val="000000" w:themeColor="text1"/>
           <w:sz w:val="20"/>
           <w:lang w:val="es-PE"/>
         </w:rPr>
@@ -5912,44 +4476,23 @@
         <w:rPr>
           <w:rFonts w:ascii="Arial Narrow" w:hAnsi="Arial Narrow" w:cs="Arial"/>
           <w:bCs/>
-          <w:color w:val="000000" w:themeColor="text1"/>
-          <w:sz w:val="20"/>
-        </w:rPr>
-        <w:t>04</w:t>
+          <w:sz w:val="20"/>
+        </w:rPr>
+        <w:t>04-2025</w:t>
       </w:r>
       <w:r>
         <w:rPr>
           <w:rFonts w:ascii="Arial Narrow" w:hAnsi="Arial Narrow" w:cs="Arial"/>
           <w:bCs/>
-          <w:color w:val="000000" w:themeColor="text1"/>
-          <w:sz w:val="20"/>
-        </w:rPr>
-        <w:t>-202</w:t>
+          <w:sz w:val="20"/>
+          <w:lang w:val="es-PE"/>
+        </w:rPr>
+        <w:t>-MD</w:t>
       </w:r>
       <w:r>
         <w:rPr>
           <w:rFonts w:ascii="Arial Narrow" w:hAnsi="Arial Narrow" w:cs="Arial"/>
           <w:bCs/>
-          <w:color w:val="000000" w:themeColor="text1"/>
-          <w:sz w:val="20"/>
-        </w:rPr>
-        <w:t>5</w:t>
-      </w:r>
-      <w:r>
-        <w:rPr>
-          <w:rFonts w:ascii="Arial Narrow" w:hAnsi="Arial Narrow" w:cs="Arial"/>
-          <w:bCs/>
-          <w:color w:val="000000" w:themeColor="text1"/>
-          <w:sz w:val="20"/>
-          <w:lang w:val="es-PE"/>
-        </w:rPr>
-        <w:t>-MD</w:t>
-      </w:r>
-      <w:r>
-        <w:rPr>
-          <w:rFonts w:ascii="Arial Narrow" w:hAnsi="Arial Narrow" w:cs="Arial"/>
-          <w:bCs/>
-          <w:color w:val="000000" w:themeColor="text1"/>
           <w:sz w:val="20"/>
         </w:rPr>
         <w:t>LM y modificatorias del TUPA</w:t>
@@ -6192,25 +4735,7 @@
           <w:sz w:val="18"/>
           <w:szCs w:val="18"/>
         </w:rPr>
-        <w:t xml:space="preserve">                                                                               </w:t>
-      </w:r>
-      <w:r>
-        <w:rPr>
-          <w:rFonts w:ascii="Arial Narrow" w:hAnsi="Arial Narrow" w:cs="Arial"/>
-          <w:bCs/>
-          <w:sz w:val="18"/>
-          <w:szCs w:val="18"/>
-        </w:rPr>
-        <w:t>_________________________</w:t>
-      </w:r>
-      <w:r>
-        <w:rPr>
-          <w:rFonts w:ascii="Arial Narrow" w:hAnsi="Arial Narrow" w:cs="Arial"/>
-          <w:bCs/>
-          <w:sz w:val="18"/>
-          <w:szCs w:val="18"/>
-        </w:rPr>
-        <w:t>_________</w:t>
+        <w:t xml:space="preserve">                                                                               __________________________________</w:t>
       </w:r>
     </w:p>
     <w:p>
@@ -6636,72 +5161,6 @@
               </pic:pic>
             </a:graphicData>
           </a:graphic>
-        </wp:anchor>
-      </w:drawing>
-    </w:r>
-    <w:r>
-      <w:rPr>
-        <w:rStyle w:val="Fuentedeprrafopredeter1"/>
-        <w:rFonts w:ascii="Arial" w:hAnsi="Arial" w:cs="Arial"/>
-        <w:b/>
-        <w:noProof/>
-        <w:color w:val="FFFFFF" w:themeColor="background1"/>
-        <w:sz w:val="20"/>
-        <w:szCs w:val="23"/>
-      </w:rPr>
-      <w:drawing>
-        <wp:anchor distT="0" distB="0" distL="114300" distR="114300" simplePos="0" relativeHeight="251658240" behindDoc="0" locked="0" layoutInCell="1" allowOverlap="1" wp14:anchorId="6DF4D4CD" wp14:editId="6494BC4C">
-          <wp:simplePos x="0" y="0"/>
-          <wp:positionH relativeFrom="margin">
-            <wp:align>center</wp:align>
-          </wp:positionH>
-          <wp:positionV relativeFrom="paragraph">
-            <wp:posOffset>-236220</wp:posOffset>
-          </wp:positionV>
-          <wp:extent cx="1037590" cy="1037590"/>
-          <wp:effectExtent l="0" t="0" r="0" b="0"/>
-          <wp:wrapNone/>
-          <wp:docPr id="8" name="Imagen 8"/>
-          <wp:cNvGraphicFramePr>
-            <a:graphicFrameLocks xmlns:a="http://schemas.openxmlformats.org/drawingml/2006/main" noChangeAspect="1"/>
-          </wp:cNvGraphicFramePr>
-          <a:graphic xmlns:a="http://schemas.openxmlformats.org/drawingml/2006/main">
-            <a:graphicData uri="http://schemas.openxmlformats.org/drawingml/2006/picture">
-              <pic:pic xmlns:pic="http://schemas.openxmlformats.org/drawingml/2006/picture">
-                <pic:nvPicPr>
-                  <pic:cNvPr id="1" name=""/>
-                  <pic:cNvPicPr/>
-                </pic:nvPicPr>
-                <pic:blipFill>
-                  <a:blip r:embed="rId2">
-                    <a:extLst>
-                      <a:ext uri="{28A0092B-C50C-407E-A947-70E740481C1C}">
-                        <a14:useLocalDpi xmlns:a14="http://schemas.microsoft.com/office/drawing/2010/main" val="0"/>
-                      </a:ext>
-                    </a:extLst>
-                  </a:blip>
-                  <a:stretch>
-                    <a:fillRect/>
-                  </a:stretch>
-                </pic:blipFill>
-                <pic:spPr>
-                  <a:xfrm>
-                    <a:off x="0" y="0"/>
-                    <a:ext cx="1037590" cy="1037590"/>
-                  </a:xfrm>
-                  <a:prstGeom prst="rect">
-                    <a:avLst/>
-                  </a:prstGeom>
-                </pic:spPr>
-              </pic:pic>
-            </a:graphicData>
-          </a:graphic>
-          <wp14:sizeRelH relativeFrom="margin">
-            <wp14:pctWidth>0</wp14:pctWidth>
-          </wp14:sizeRelH>
-          <wp14:sizeRelV relativeFrom="margin">
-            <wp14:pctHeight>0</wp14:pctHeight>
-          </wp14:sizeRelV>
         </wp:anchor>
       </w:drawing>
     </w:r>
@@ -10449,28 +8908,28 @@
 </file>
 
 <file path=customXml/item1.xml><?xml version="1.0" encoding="utf-8"?>
+<b:Sources xmlns:b="http://schemas.openxmlformats.org/officeDocument/2006/bibliography" xmlns="http://schemas.openxmlformats.org/officeDocument/2006/bibliography" SelectedStyle="\APA.XSL" StyleName="APA"/>
+</file>
+
+<file path=customXml/item2.xml><?xml version="1.0" encoding="utf-8"?>
 <go:gDocsCustomXmlDataStorage xmlns:go="http://customooxmlschemas.google.com/" xmlns:r="http://schemas.openxmlformats.org/officeDocument/2006/relationships" uri="GoogleDocsCustomDataVersion2">
   <go:docsCustomData xmlns:go="http://customooxmlschemas.google.com/" roundtripDataSignature="AMtx7mjySaGvrr1NJmheAEKOGJBULRZ8+Q==">CgMxLjAyCGguZ2pkZ3hzMgloLjMwajB6bGw4AHIhMUlYSE8ydFFKdTlVQ2tOTFFuZ1RnWEdEWkhveWlTUTZY</go:docsCustomData>
 </go:gDocsCustomXmlDataStorage>
 </file>
 
-<file path=customXml/item2.xml><?xml version="1.0" encoding="utf-8"?>
-<b:Sources xmlns:b="http://schemas.openxmlformats.org/officeDocument/2006/bibliography" xmlns="http://schemas.openxmlformats.org/officeDocument/2006/bibliography" SelectedStyle="\APA.XSL" StyleName="APA"/>
+<file path=customXml/itemProps1.xml><?xml version="1.0" encoding="utf-8"?>
+<ds:datastoreItem xmlns:ds="http://schemas.openxmlformats.org/officeDocument/2006/customXml" ds:itemID="{98F59C3D-6FD6-4EBF-9ADD-D1F2607F8558}">
+  <ds:schemaRefs>
+    <ds:schemaRef ds:uri="http://schemas.openxmlformats.org/officeDocument/2006/bibliography"/>
+  </ds:schemaRefs>
+</ds:datastoreItem>
 </file>
 
-<file path=customXml/itemProps1.xml><?xml version="1.0" encoding="utf-8"?>
+<file path=customXml/itemProps2.xml><?xml version="1.0" encoding="utf-8"?>
 <ds:datastoreItem xmlns:ds="http://schemas.openxmlformats.org/officeDocument/2006/customXml" ds:itemID="{11111111-1234-1234-1234-123412341234}">
   <ds:schemaRefs>
     <ds:schemaRef ds:uri="http://customooxmlschemas.google.com/"/>
     <ds:schemaRef ds:uri="http://schemas.openxmlformats.org/officeDocument/2006/relationships"/>
   </ds:schemaRefs>
 </ds:datastoreItem>
-</file>
-
-<file path=customXml/itemProps2.xml><?xml version="1.0" encoding="utf-8"?>
-<ds:datastoreItem xmlns:ds="http://schemas.openxmlformats.org/officeDocument/2006/customXml" ds:itemID="{98F59C3D-6FD6-4EBF-9ADD-D1F2607F8558}">
-  <ds:schemaRefs>
-    <ds:schemaRef ds:uri="http://schemas.openxmlformats.org/officeDocument/2006/bibliography"/>
-  </ds:schemaRefs>
-</ds:datastoreItem>
 </file>
</xml_diff>

<commit_message>
feat: permitir ingreso manual del número de informe técnico y parametrizar monto en anuncios
</commit_message>
<xml_diff>
--- a/app/Filament/Clusters/Sil/Resources/Anuncios/Template/template_informe_anuncio.docx
+++ b/app/Filament/Clusters/Sil/Resources/Anuncios/Template/template_informe_anuncio.docx
@@ -2759,7 +2759,31 @@
           <w:sz w:val="20"/>
           <w:lang w:val="es-PE"/>
         </w:rPr>
-        <w:t>, por el monto de S/ 297.00.</w:t>
+        <w:t xml:space="preserve">, por el monto de </w:t>
+      </w:r>
+      <w:r>
+        <w:rPr>
+          <w:rFonts w:ascii="Arial Narrow" w:hAnsi="Arial Narrow" w:cs="Arial"/>
+          <w:sz w:val="20"/>
+          <w:lang w:val="es-PE"/>
+        </w:rPr>
+        <w:t>${</w:t>
+      </w:r>
+      <w:r>
+        <w:rPr>
+          <w:rFonts w:ascii="Arial Narrow" w:hAnsi="Arial Narrow" w:cs="Arial"/>
+          <w:sz w:val="20"/>
+          <w:lang w:val="es-PE"/>
+        </w:rPr>
+        <w:t>MONTO</w:t>
+      </w:r>
+      <w:r>
+        <w:rPr>
+          <w:rFonts w:ascii="Arial Narrow" w:hAnsi="Arial Narrow" w:cs="Arial"/>
+          <w:sz w:val="20"/>
+          <w:lang w:val="es-PE"/>
+        </w:rPr>
+        <w:t>}</w:t>
       </w:r>
     </w:p>
     <w:p>

</xml_diff>

<commit_message>
feat: integración con Gestrad y parametrización extendida en plantillas de anuncios
</commit_message>
<xml_diff>
--- a/app/Filament/Clusters/Sil/Resources/Anuncios/Template/template_informe_anuncio.docx
+++ b/app/Filament/Clusters/Sil/Resources/Anuncios/Template/template_informe_anuncio.docx
@@ -604,32 +604,22 @@
               <w:jc w:val="both"/>
               <w:rPr>
                 <w:rFonts w:ascii="Arial Narrow" w:eastAsiaTheme="minorHAnsi" w:hAnsi="Arial Narrow" w:cs="Arial"/>
+                <w:color w:val="EE0000"/>
                 <w:kern w:val="0"/>
                 <w:sz w:val="20"/>
                 <w:szCs w:val="20"/>
                 <w:lang w:eastAsia="en-US" w:bidi="ar-SA"/>
               </w:rPr>
             </w:pPr>
-            <w:bookmarkStart w:id="2" w:name="_Hlk220937839"/>
             <w:r>
               <w:rPr>
                 <w:rFonts w:ascii="Arial Narrow" w:eastAsia="Arial" w:hAnsi="Arial Narrow" w:cs="Arial"/>
+                <w:color w:val="EE0000"/>
                 <w:sz w:val="20"/>
                 <w:szCs w:val="20"/>
               </w:rPr>
-              <w:t xml:space="preserve">Evaluación Técnica – </w:t>
+              <w:t>${OBSV_ASUNTO}</w:t>
             </w:r>
-            <w:r>
-              <w:rPr>
-                <w:rFonts w:ascii="Arial Narrow" w:eastAsiaTheme="minorHAnsi" w:hAnsi="Arial Narrow" w:cs="Arial"/>
-                <w:kern w:val="0"/>
-                <w:sz w:val="20"/>
-                <w:szCs w:val="20"/>
-                <w:lang w:eastAsia="en-US" w:bidi="ar-SA"/>
-              </w:rPr>
-              <w:t>Autorización para la ubicación de elemento de publicidad exterior - tipo: panel simple, paleta publicitaria, rótulo adhesivo, valla, volumétrico, bandera, banderola, plancheta publicitaria, afiches, panel monumental, panel monumental unipolar y tótem. En bienes de dominio privado</w:t>
-            </w:r>
-            <w:bookmarkEnd w:id="2"/>
           </w:p>
         </w:tc>
       </w:tr>
@@ -943,6 +933,7 @@
                 <w:right w:val="nil"/>
                 <w:between w:val="nil"/>
               </w:pBdr>
+              <w:ind w:left="708" w:hanging="708"/>
               <w:rPr>
                 <w:rFonts w:ascii="Arial Narrow" w:eastAsia="Times New Roman" w:hAnsi="Arial Narrow" w:cs="Times New Roman"/>
                 <w:sz w:val="20"/>
@@ -952,10 +943,11 @@
             <w:r>
               <w:rPr>
                 <w:rFonts w:ascii="Arial Narrow" w:eastAsia="Arial" w:hAnsi="Arial Narrow" w:cs="Arial"/>
+                <w:color w:val="EE0000"/>
                 <w:sz w:val="20"/>
                 <w:szCs w:val="20"/>
               </w:rPr>
-              <w:t>La Molina, 17 de febrero de 2026</w:t>
+              <w:t>${FECHA_INFORME_TECNICO_GESTRAD}</w:t>
             </w:r>
           </w:p>
         </w:tc>
@@ -1722,6 +1714,7 @@
           <w:rFonts w:ascii="Arial Narrow" w:hAnsi="Arial Narrow" w:cs="Arial"/>
           <w:b/>
           <w:bCs/>
+          <w:color w:val="EE0000"/>
           <w:sz w:val="20"/>
           <w:szCs w:val="20"/>
           <w:u w:val="single"/>
@@ -1735,7 +1728,40 @@
           <w:szCs w:val="20"/>
           <w:lang w:eastAsia="hi-IN" w:bidi="hi-IN"/>
         </w:rPr>
-        <w:t xml:space="preserve">                                         Distrito de La Molina</w:t>
+        <w:t xml:space="preserve">                                        </w:t>
+      </w:r>
+      <w:r>
+        <w:rPr>
+          <w:rFonts w:ascii="Arial Narrow" w:eastAsia="Noto Sans CJK SC Regular" w:hAnsi="Arial Narrow" w:cs="Arial"/>
+          <w:color w:val="EE0000"/>
+          <w:kern w:val="1"/>
+          <w:sz w:val="20"/>
+          <w:szCs w:val="20"/>
+          <w:lang w:eastAsia="hi-IN" w:bidi="hi-IN"/>
+        </w:rPr>
+        <w:t xml:space="preserve"> ${DISTRITO</w:t>
+      </w:r>
+      <w:r>
+        <w:rPr>
+          <w:rFonts w:ascii="Arial Narrow" w:eastAsia="Noto Sans CJK SC Regular" w:hAnsi="Arial Narrow" w:cs="Arial"/>
+          <w:color w:val="EE0000"/>
+          <w:kern w:val="1"/>
+          <w:sz w:val="20"/>
+          <w:szCs w:val="20"/>
+          <w:lang w:eastAsia="hi-IN" w:bidi="hi-IN"/>
+        </w:rPr>
+        <w:t>_LEGAL</w:t>
+      </w:r>
+      <w:r>
+        <w:rPr>
+          <w:rFonts w:ascii="Arial Narrow" w:eastAsia="Noto Sans CJK SC Regular" w:hAnsi="Arial Narrow" w:cs="Arial"/>
+          <w:color w:val="EE0000"/>
+          <w:kern w:val="1"/>
+          <w:sz w:val="20"/>
+          <w:szCs w:val="20"/>
+          <w:lang w:eastAsia="hi-IN" w:bidi="hi-IN"/>
+        </w:rPr>
+        <w:t>}</w:t>
       </w:r>
     </w:p>
     <w:p>
@@ -1939,15 +1965,16 @@
           <w:sz w:val="20"/>
           <w:szCs w:val="20"/>
         </w:rPr>
-        <w:t xml:space="preserve">                                        Distrito de La Molina</w:t>
-      </w:r>
-      <w:r>
-        <w:rPr>
-          <w:rFonts w:ascii="Arial Narrow" w:hAnsi="Arial Narrow" w:cs="Arial"/>
-          <w:sz w:val="20"/>
-          <w:szCs w:val="20"/>
-        </w:rPr>
-        <w:t xml:space="preserve"> </w:t>
+        <w:t xml:space="preserve">                                        </w:t>
+      </w:r>
+      <w:r>
+        <w:rPr>
+          <w:rFonts w:ascii="Arial Narrow" w:eastAsia="Arial" w:hAnsi="Arial Narrow" w:cs="Arial"/>
+          <w:color w:val="EE0000"/>
+          <w:sz w:val="20"/>
+          <w:szCs w:val="20"/>
+        </w:rPr>
+        <w:t>${DISTRITO_PREDIO}</w:t>
       </w:r>
     </w:p>
     <w:p>
@@ -2096,7 +2123,36 @@
           <w:sz w:val="20"/>
           <w:szCs w:val="20"/>
         </w:rPr>
-        <w:t xml:space="preserve">Que, con fecha 27 de enero del 2026, ingreso a la oficina de gestión documentaria y atención al ciudadano, el expediente administrativo y/o documento simple con Número de Registro </w:t>
+        <w:t xml:space="preserve">Que, con fecha </w:t>
+      </w:r>
+      <w:r>
+        <w:rPr>
+          <w:rFonts w:ascii="Arial Narrow" w:hAnsi="Arial Narrow" w:cs="Arial"/>
+          <w:bCs/>
+          <w:color w:val="EE0000"/>
+          <w:sz w:val="20"/>
+          <w:szCs w:val="20"/>
+        </w:rPr>
+        <w:t>${FECHA</w:t>
+      </w:r>
+      <w:r>
+        <w:rPr>
+          <w:rFonts w:ascii="Arial Narrow" w:hAnsi="Arial Narrow" w:cs="Arial"/>
+          <w:bCs/>
+          <w:color w:val="FF0000"/>
+          <w:sz w:val="20"/>
+          <w:szCs w:val="20"/>
+        </w:rPr>
+        <w:t>_INGRESO_GESTRAD}</w:t>
+      </w:r>
+      <w:r>
+        <w:rPr>
+          <w:rFonts w:ascii="Arial Narrow" w:hAnsi="Arial Narrow" w:cs="Arial"/>
+          <w:bCs/>
+          <w:sz w:val="20"/>
+          <w:szCs w:val="20"/>
+        </w:rPr>
+        <w:t xml:space="preserve">, ingreso a la oficina de gestión documentaria y atención al ciudadano, el expediente administrativo y/o documento simple con Número de Registro </w:t>
       </w:r>
       <w:proofErr w:type="spellStart"/>
       <w:r>
@@ -2315,16 +2371,7 @@
           <w:sz w:val="20"/>
           <w:szCs w:val="20"/>
         </w:rPr>
-        <w:t xml:space="preserve">solicita la autorización para la ubicación e instalación de un (01) </w:t>
-      </w:r>
-      <w:r>
-        <w:rPr>
-          <w:rFonts w:ascii="Arial Narrow" w:eastAsia="Arial" w:hAnsi="Arial Narrow" w:cs="Arial"/>
-          <w:sz w:val="20"/>
-          <w:szCs w:val="20"/>
-        </w:rPr>
-        <w:lastRenderedPageBreak/>
-        <w:t>“aviso publicitario simple”</w:t>
+        <w:t>solicita la autorización para la ubicación e instalación de un (01) “aviso publicitario simple”</w:t>
       </w:r>
       <w:r>
         <w:rPr>
@@ -2418,6 +2465,7 @@
           <w:sz w:val="20"/>
           <w:szCs w:val="20"/>
         </w:rPr>
+        <w:lastRenderedPageBreak/>
         <w:t xml:space="preserve">ANÁLISIS: </w:t>
       </w:r>
     </w:p>
@@ -2493,7 +2541,7 @@
           <w:lang w:eastAsia="es-PE"/>
         </w:rPr>
       </w:pPr>
-      <w:bookmarkStart w:id="3" w:name="_Hlk71963377"/>
+      <w:bookmarkStart w:id="2" w:name="_Hlk71963377"/>
       <w:r>
         <w:rPr>
           <w:rFonts w:ascii="Arial Narrow" w:hAnsi="Arial Narrow" w:cs="Arial"/>
@@ -2767,7 +2815,7 @@
           <w:sz w:val="20"/>
           <w:lang w:val="es-PE"/>
         </w:rPr>
-        <w:t>${</w:t>
+        <w:t>S/.</w:t>
       </w:r>
       <w:r>
         <w:rPr>
@@ -2775,6 +2823,22 @@
           <w:sz w:val="20"/>
           <w:lang w:val="es-PE"/>
         </w:rPr>
+        <w:t xml:space="preserve"> $</w:t>
+      </w:r>
+      <w:r>
+        <w:rPr>
+          <w:rFonts w:ascii="Arial Narrow" w:hAnsi="Arial Narrow" w:cs="Arial"/>
+          <w:sz w:val="20"/>
+          <w:lang w:val="es-PE"/>
+        </w:rPr>
+        <w:t>{</w:t>
+      </w:r>
+      <w:r>
+        <w:rPr>
+          <w:rFonts w:ascii="Arial Narrow" w:hAnsi="Arial Narrow" w:cs="Arial"/>
+          <w:sz w:val="20"/>
+          <w:lang w:val="es-PE"/>
+        </w:rPr>
         <w:t>MONTO</w:t>
       </w:r>
       <w:r>
@@ -2784,6 +2848,14 @@
           <w:lang w:val="es-PE"/>
         </w:rPr>
         <w:t>}</w:t>
+      </w:r>
+      <w:r>
+        <w:rPr>
+          <w:rFonts w:ascii="Arial Narrow" w:hAnsi="Arial Narrow" w:cs="Arial"/>
+          <w:sz w:val="20"/>
+          <w:lang w:val="es-PE"/>
+        </w:rPr>
+        <w:t>.</w:t>
       </w:r>
     </w:p>
     <w:p>
@@ -2868,6 +2940,42 @@
       <w:r>
         <w:rPr>
           <w:rFonts w:ascii="Arial Narrow" w:hAnsi="Arial Narrow" w:cs="Arial"/>
+          <w:b/>
+          <w:sz w:val="20"/>
+          <w:lang w:val="es-PE"/>
+        </w:rPr>
+        <w:t>-</w:t>
+      </w:r>
+      <w:r>
+        <w:rPr>
+          <w:rFonts w:ascii="Arial Narrow" w:hAnsi="Arial Narrow" w:cs="Arial"/>
+          <w:b/>
+          <w:sz w:val="20"/>
+          <w:lang w:val="es-PE"/>
+        </w:rPr>
+        <w:t>${LICENCIA_</w:t>
+      </w:r>
+      <w:r>
+        <w:rPr>
+          <w:rFonts w:ascii="Arial Narrow" w:hAnsi="Arial Narrow" w:cs="Arial"/>
+          <w:b/>
+          <w:sz w:val="20"/>
+          <w:lang w:val="es-PE"/>
+        </w:rPr>
+        <w:t>ANIO</w:t>
+      </w:r>
+      <w:r>
+        <w:rPr>
+          <w:rFonts w:ascii="Arial Narrow" w:hAnsi="Arial Narrow" w:cs="Arial"/>
+          <w:b/>
+          <w:sz w:val="20"/>
+          <w:lang w:val="es-PE"/>
+        </w:rPr>
+        <w:t>}</w:t>
+      </w:r>
+      <w:r>
+        <w:rPr>
+          <w:rFonts w:ascii="Arial Narrow" w:hAnsi="Arial Narrow" w:cs="Arial"/>
           <w:sz w:val="20"/>
           <w:lang w:val="es-PE"/>
         </w:rPr>
@@ -3039,7 +3147,7 @@
         </w:rPr>
         <w:t xml:space="preserve"> </w:t>
       </w:r>
-      <w:bookmarkEnd w:id="3"/>
+      <w:bookmarkEnd w:id="2"/>
       <w:r>
         <w:rPr>
           <w:rFonts w:ascii="Arial Narrow" w:hAnsi="Arial Narrow" w:cs="Arial"/>
@@ -3583,8 +3691,8 @@
           <w:szCs w:val="20"/>
         </w:rPr>
       </w:pPr>
-      <w:bookmarkStart w:id="4" w:name="_heading=h.30j0zll" w:colFirst="0" w:colLast="0"/>
-      <w:bookmarkEnd w:id="4"/>
+      <w:bookmarkStart w:id="3" w:name="_heading=h.30j0zll" w:colFirst="0" w:colLast="0"/>
+      <w:bookmarkEnd w:id="3"/>
       <w:r>
         <w:rPr>
           <w:rFonts w:ascii="Arial Narrow" w:eastAsia="Arial" w:hAnsi="Arial Narrow" w:cs="Arial"/>
@@ -3776,6 +3884,7 @@
           <w:sz w:val="20"/>
           <w:szCs w:val="20"/>
         </w:rPr>
+        <w:lastRenderedPageBreak/>
         <w:t xml:space="preserve">PANEL FOTOGRAFICO: </w:t>
       </w:r>
     </w:p>
@@ -3849,93 +3958,6 @@
       </w:pPr>
       <w:r>
         <w:rPr>
-          <w:noProof/>
-        </w:rPr>
-        <w:pict w14:anchorId="00B42E80">
-          <v:group id="12 Grupo" o:spid="_x0000_s2053" style="position:absolute;left:0;text-align:left;margin-left:35.55pt;margin-top:19.45pt;width:441.75pt;height:274.5pt;z-index:-251660800" coordsize="56102,34861" wrapcoords="-37 0 -37 21541 21600 21541 21600 0 -37 0" o:gfxdata="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">
-            <v:shapetype id="_x0000_t75" coordsize="21600,21600" o:spt="75" o:preferrelative="t" path="m@4@5l@4@11@9@11@9@5xe" filled="f" stroked="f">
-              <v:stroke joinstyle="miter"/>
-              <v:formulas>
-                <v:f eqn="if lineDrawn pixelLineWidth 0"/>
-                <v:f eqn="sum @0 1 0"/>
-                <v:f eqn="sum 0 0 @1"/>
-                <v:f eqn="prod @2 1 2"/>
-                <v:f eqn="prod @3 21600 pixelWidth"/>
-                <v:f eqn="prod @3 21600 pixelHeight"/>
-                <v:f eqn="sum @0 0 1"/>
-                <v:f eqn="prod @6 1 2"/>
-                <v:f eqn="prod @7 21600 pixelWidth"/>
-                <v:f eqn="sum @8 21600 0"/>
-                <v:f eqn="prod @7 21600 pixelHeight"/>
-                <v:f eqn="sum @10 21600 0"/>
-              </v:formulas>
-              <v:path o:extrusionok="f" gradientshapeok="t" o:connecttype="rect"/>
-              <o:lock v:ext="edit" aspectratio="t"/>
-            </v:shapetype>
-            <v:shape id="Imagen 2" o:spid="_x0000_s2054" type="#_x0000_t75" style="position:absolute;width:56102;height:34861;visibility:visible;mso-wrap-style:square" o:gfxdata="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">
-              <v:imagedata r:id="rId9" o:title=""/>
-            </v:shape>
-            <v:rect id="4 Rectángulo" o:spid="_x0000_s2055" style="position:absolute;left:571;top:28670;width:20579;height:5658;visibility:visible;mso-wrap-style:square;v-text-anchor:middle" o:gfxdata="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" fillcolor="white [3212]" strokecolor="black [3213]" strokeweight="1pt">
-              <v:textbox>
-                <w:txbxContent>
-                  <w:p>
-                    <w:pPr>
-                      <w:jc w:val="center"/>
-                      <w:rPr>
-                        <w:rFonts w:ascii="Arial Narrow" w:hAnsi="Arial Narrow"/>
-                        <w:color w:val="000000" w:themeColor="text1"/>
-                        <w:sz w:val="22"/>
-                      </w:rPr>
-                    </w:pPr>
-                    <w:r>
-                      <w:rPr>
-                        <w:rFonts w:ascii="Arial Narrow" w:hAnsi="Arial Narrow"/>
-                        <w:color w:val="000000" w:themeColor="text1"/>
-                        <w:sz w:val="22"/>
-                      </w:rPr>
-                      <w:t xml:space="preserve">Aviso publicitario </w:t>
-                    </w:r>
-                    <w:r>
-                      <w:rPr>
-                        <w:rFonts w:ascii="Arial Narrow" w:hAnsi="Arial Narrow"/>
-                        <w:color w:val="000000" w:themeColor="text1"/>
-                        <w:sz w:val="22"/>
-                      </w:rPr>
-                      <w:t>${</w:t>
-                    </w:r>
-                    <w:r>
-                      <w:rPr>
-                        <w:rFonts w:ascii="Arial Narrow" w:hAnsi="Arial Narrow"/>
-                        <w:color w:val="000000" w:themeColor="text1"/>
-                        <w:sz w:val="22"/>
-                      </w:rPr>
-                      <w:t>UBICACIÓN_DEL_ANUNCIO</w:t>
-                    </w:r>
-                    <w:r>
-                      <w:rPr>
-                        <w:rFonts w:ascii="Arial Narrow" w:hAnsi="Arial Narrow"/>
-                        <w:color w:val="000000" w:themeColor="text1"/>
-                        <w:sz w:val="22"/>
-                      </w:rPr>
-                      <w:t>}</w:t>
-                    </w:r>
-                  </w:p>
-                </w:txbxContent>
-              </v:textbox>
-            </v:rect>
-            <v:shapetype id="_x0000_t32" coordsize="21600,21600" o:spt="32" o:oned="t" path="m,l21600,21600e" filled="f">
-              <v:path arrowok="t" fillok="f" o:connecttype="none"/>
-              <o:lock v:ext="edit" shapetype="t"/>
-            </v:shapetype>
-            <v:shape id="11 Conector recto de flecha" o:spid="_x0000_s2056" type="#_x0000_t32" style="position:absolute;left:8572;top:22002;width:29153;height:6757;flip:y;visibility:visible;mso-wrap-style:square" o:connectortype="straight" o:gfxdata="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" strokecolor="white [3212]" strokeweight="1.5pt">
-              <v:stroke endarrow="open" joinstyle="miter"/>
-            </v:shape>
-            <w10:wrap type="tight"/>
-          </v:group>
-        </w:pict>
-      </w:r>
-      <w:r>
-        <w:rPr>
           <w:rFonts w:ascii="Arial Narrow" w:eastAsia="Arial" w:hAnsi="Arial Narrow" w:cs="Arial"/>
           <w:sz w:val="20"/>
           <w:szCs w:val="20"/>
@@ -3955,6 +3977,35 @@
         </w:pBdr>
         <w:jc w:val="center"/>
       </w:pPr>
+      <w:r>
+        <w:rPr>
+          <w:noProof/>
+        </w:rPr>
+        <w:pict w14:anchorId="67F40958">
+          <v:shapetype id="_x0000_t75" coordsize="21600,21600" o:spt="75" o:preferrelative="t" path="m@4@5l@4@11@9@11@9@5xe" filled="f" stroked="f">
+            <v:stroke joinstyle="miter"/>
+            <v:formulas>
+              <v:f eqn="if lineDrawn pixelLineWidth 0"/>
+              <v:f eqn="sum @0 1 0"/>
+              <v:f eqn="sum 0 0 @1"/>
+              <v:f eqn="prod @2 1 2"/>
+              <v:f eqn="prod @3 21600 pixelWidth"/>
+              <v:f eqn="prod @3 21600 pixelHeight"/>
+              <v:f eqn="sum @0 0 1"/>
+              <v:f eqn="prod @6 1 2"/>
+              <v:f eqn="prod @7 21600 pixelWidth"/>
+              <v:f eqn="sum @8 21600 0"/>
+              <v:f eqn="prod @7 21600 pixelHeight"/>
+              <v:f eqn="sum @10 21600 0"/>
+            </v:formulas>
+            <v:path o:extrusionok="f" gradientshapeok="t" o:connecttype="rect"/>
+            <o:lock v:ext="edit" aspectratio="t"/>
+          </v:shapetype>
+          <v:shape id="Imagen 2" o:spid="_x0000_s2054" type="#_x0000_t75" style="position:absolute;left:0;text-align:left;margin-left:35.55pt;margin-top:6.25pt;width:441.75pt;height:274.5pt;z-index:-251656704;visibility:visible;mso-wrap-style:square" o:gfxdata="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">
+            <v:imagedata r:id="rId9" o:title=""/>
+          </v:shape>
+        </w:pict>
+      </w:r>
       <w:r>
         <w:rPr>
           <w:noProof/>
@@ -3980,7 +4031,7 @@
             <v:shape id="10 Flecha abajo" o:spid="_x0000_s2051" type="#_x0000_t67" style="position:absolute;left:2211;top:-1639;width:3067;height:7489;rotation:90;visibility:visible;mso-wrap-style:square;v-text-anchor:middle" o:gfxdata="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" adj="17177,7182" fillcolor="red" stroked="f" strokeweight="1pt"/>
             <v:rect id="46 Rectángulo" o:spid="_x0000_s2052" style="position:absolute;left:4626;width:22236;height:4658;visibility:visible;mso-wrap-style:square;v-text-anchor:top" o:gfxdata="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" fillcolor="window" strokecolor="window">
               <v:stroke startarrowwidth="narrow" startarrowlength="short" endarrowwidth="narrow" endarrowlength="short" joinstyle="round"/>
-              <v:textbox inset="2.53958mm,1.2694mm,2.53958mm,1.2694mm">
+              <v:textbox style="mso-next-textbox:#46 Rectángulo" inset="2.53958mm,1.2694mm,2.53958mm,1.2694mm">
                 <w:txbxContent>
                   <w:p>
                     <w:pPr>
@@ -4201,6 +4252,21 @@
           <w:lang w:eastAsia="en-US" w:bidi="ar-SA"/>
         </w:rPr>
       </w:pPr>
+      <w:r>
+        <w:rPr>
+          <w:noProof/>
+          <w:lang w:eastAsia="en-US" w:bidi="ar-SA"/>
+        </w:rPr>
+        <w:pict w14:anchorId="0D15CB6F">
+          <v:shapetype id="_x0000_t32" coordsize="21600,21600" o:spt="32" o:oned="t" path="m,l21600,21600e" filled="f">
+            <v:path arrowok="t" fillok="f" o:connecttype="none"/>
+            <o:lock v:ext="edit" shapetype="t"/>
+          </v:shapetype>
+          <v:shape id="11 Conector recto de flecha" o:spid="_x0000_s2056" type="#_x0000_t32" style="position:absolute;left:0;text-align:left;margin-left:103.05pt;margin-top:11.15pt;width:229.55pt;height:53.2pt;flip:y;z-index:-251654656;visibility:visible;mso-wrap-style:square" o:connectortype="straight" o:gfxdata="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" strokecolor="white [3212]" strokeweight="1.5pt">
+            <v:stroke endarrow="open" joinstyle="miter"/>
+          </v:shape>
+        </w:pict>
+      </w:r>
     </w:p>
     <w:p>
       <w:pPr>
@@ -4209,6 +4275,62 @@
           <w:lang w:eastAsia="en-US" w:bidi="ar-SA"/>
         </w:rPr>
       </w:pPr>
+      <w:r>
+        <w:rPr>
+          <w:noProof/>
+          <w:lang w:eastAsia="en-US" w:bidi="ar-SA"/>
+        </w:rPr>
+        <w:pict w14:anchorId="51FAA413">
+          <v:rect id="4 Rectángulo" o:spid="_x0000_s2055" style="position:absolute;left:0;text-align:left;margin-left:42.3pt;margin-top:10.85pt;width:187.55pt;height:81.7pt;z-index:-251655680;visibility:visible;v-text-anchor:middle" o:gfxdata="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" fillcolor="white [3212]" strokecolor="black [3213]" strokeweight="1pt">
+            <v:textbox style="mso-next-textbox:#4 Rectángulo">
+              <w:txbxContent>
+                <w:p>
+                  <w:pPr>
+                    <w:jc w:val="center"/>
+                    <w:rPr>
+                      <w:rFonts w:ascii="Arial Narrow" w:hAnsi="Arial Narrow"/>
+                      <w:color w:val="000000" w:themeColor="text1"/>
+                      <w:sz w:val="22"/>
+                    </w:rPr>
+                  </w:pPr>
+                  <w:r>
+                    <w:rPr>
+                      <w:rFonts w:ascii="Arial Narrow" w:hAnsi="Arial Narrow"/>
+                      <w:color w:val="000000" w:themeColor="text1"/>
+                      <w:sz w:val="22"/>
+                    </w:rPr>
+                    <w:t xml:space="preserve">Aviso publicitario </w:t>
+                  </w:r>
+                  <w:r>
+                    <w:rPr>
+                      <w:rFonts w:ascii="Arial Narrow" w:hAnsi="Arial Narrow"/>
+                      <w:color w:val="000000" w:themeColor="text1"/>
+                      <w:sz w:val="22"/>
+                    </w:rPr>
+                    <w:t>${</w:t>
+                  </w:r>
+                  <w:r>
+                    <w:rPr>
+                      <w:rFonts w:ascii="Arial Narrow" w:hAnsi="Arial Narrow"/>
+                      <w:color w:val="000000" w:themeColor="text1"/>
+                      <w:sz w:val="22"/>
+                    </w:rPr>
+                    <w:t>UBICACIÓN_DEL_ANUNCIO</w:t>
+                  </w:r>
+                  <w:r>
+                    <w:rPr>
+                      <w:rFonts w:ascii="Arial Narrow" w:hAnsi="Arial Narrow"/>
+                      <w:color w:val="000000" w:themeColor="text1"/>
+                      <w:sz w:val="22"/>
+                    </w:rPr>
+                    <w:t>}</w:t>
+                  </w:r>
+                </w:p>
+              </w:txbxContent>
+            </v:textbox>
+          </v:rect>
+        </w:pict>
+      </w:r>
     </w:p>
     <w:p>
       <w:pPr>

</xml_diff>

<commit_message>
delete and modified template
</commit_message>
<xml_diff>
--- a/app/Filament/Clusters/Sil/Resources/Anuncios/Template/template_informe_anuncio.docx
+++ b/app/Filament/Clusters/Sil/Resources/Anuncios/Template/template_informe_anuncio.docx
@@ -57,6 +57,7 @@
         <w:rPr>
           <w:rFonts w:ascii="Arial" w:hAnsi="Arial" w:cs="Arial"/>
           <w:b/>
+          <w:color w:val="EE0000"/>
           <w:sz w:val="20"/>
           <w:szCs w:val="20"/>
         </w:rPr>
@@ -65,26 +66,27 @@
         <w:rPr>
           <w:rFonts w:ascii="Arial" w:hAnsi="Arial" w:cs="Arial"/>
           <w:b/>
+          <w:color w:val="EE0000"/>
           <w:sz w:val="20"/>
           <w:szCs w:val="20"/>
         </w:rPr>
         <w:t>“</w:t>
       </w:r>
-      <w:bookmarkStart w:id="0" w:name="_Hlk220071257"/>
       <w:r>
         <w:rPr>
           <w:rFonts w:ascii="Arial" w:hAnsi="Arial" w:cs="Arial"/>
           <w:b/>
+          <w:color w:val="EE0000"/>
           <w:sz w:val="18"/>
           <w:szCs w:val="18"/>
         </w:rPr>
-        <w:t>AÑO DE LA ESPERANZA Y EL FORTALECIMIENTO DE LA DEMOCRACIA</w:t>
-      </w:r>
-      <w:bookmarkEnd w:id="0"/>
+        <w:t>${ANIO_DESCRIP}</w:t>
+      </w:r>
       <w:r>
         <w:rPr>
           <w:rFonts w:ascii="Arial" w:hAnsi="Arial" w:cs="Arial"/>
           <w:b/>
+          <w:color w:val="EE0000"/>
           <w:sz w:val="18"/>
           <w:szCs w:val="18"/>
         </w:rPr>
@@ -123,6 +125,7 @@
         <w:rPr>
           <w:rFonts w:ascii="Arial" w:hAnsi="Arial" w:cs="Arial"/>
           <w:b/>
+          <w:color w:val="EE0000"/>
           <w:sz w:val="20"/>
           <w:szCs w:val="20"/>
           <w:u w:val="single"/>
@@ -133,67 +136,13 @@
         <w:rPr>
           <w:rFonts w:ascii="Arial" w:hAnsi="Arial" w:cs="Arial"/>
           <w:b/>
+          <w:color w:val="EE0000"/>
           <w:sz w:val="20"/>
           <w:szCs w:val="20"/>
           <w:u w:val="single"/>
           <w:lang w:val="en-US"/>
         </w:rPr>
-        <w:t xml:space="preserve">INFORME Nº </w:t>
-      </w:r>
-      <w:r>
-        <w:rPr>
-          <w:rFonts w:ascii="Arial" w:hAnsi="Arial" w:cs="Arial"/>
-          <w:b/>
-          <w:sz w:val="20"/>
-          <w:szCs w:val="20"/>
-          <w:u w:val="single"/>
-          <w:lang w:val="en-US"/>
-        </w:rPr>
-        <w:t>${</w:t>
-      </w:r>
-      <w:r>
-        <w:rPr>
-          <w:rFonts w:ascii="Arial" w:hAnsi="Arial" w:cs="Arial"/>
-          <w:b/>
-          <w:sz w:val="20"/>
-          <w:szCs w:val="20"/>
-          <w:u w:val="single"/>
-          <w:lang w:val="en-US"/>
-        </w:rPr>
-        <w:t>N_INFORME_TECNICO</w:t>
-      </w:r>
-      <w:r>
-        <w:rPr>
-          <w:rFonts w:ascii="Arial" w:hAnsi="Arial" w:cs="Arial"/>
-          <w:b/>
-          <w:sz w:val="20"/>
-          <w:szCs w:val="20"/>
-          <w:u w:val="single"/>
-          <w:lang w:val="en-US"/>
-        </w:rPr>
-        <w:t>}</w:t>
-      </w:r>
-      <w:r>
-        <w:rPr>
-          <w:rFonts w:ascii="Arial" w:hAnsi="Arial" w:cs="Arial"/>
-          <w:b/>
-          <w:sz w:val="20"/>
-          <w:szCs w:val="20"/>
-          <w:u w:val="single"/>
-          <w:lang w:val="en-US"/>
-        </w:rPr>
-        <w:t xml:space="preserve"> </w:t>
-      </w:r>
-      <w:r>
-        <w:rPr>
-          <w:rFonts w:ascii="Arial" w:hAnsi="Arial" w:cs="Arial"/>
-          <w:b/>
-          <w:sz w:val="20"/>
-          <w:szCs w:val="20"/>
-          <w:u w:val="single"/>
-          <w:lang w:val="en-US"/>
-        </w:rPr>
-        <w:t>-MDLM-GDEIP-SPEA-APBD</w:t>
+        <w:t>${NU_INFORM_COMPLETO}</w:t>
       </w:r>
     </w:p>
     <w:p>
@@ -325,6 +274,7 @@
               <w:rPr>
                 <w:rFonts w:ascii="Arial Narrow" w:eastAsia="Arial" w:hAnsi="Arial Narrow" w:cs="Arial"/>
                 <w:b/>
+                <w:color w:val="EE0000"/>
                 <w:sz w:val="20"/>
                 <w:szCs w:val="20"/>
               </w:rPr>
@@ -333,10 +283,32 @@
               <w:rPr>
                 <w:rFonts w:ascii="Arial Narrow" w:eastAsia="Arial" w:hAnsi="Arial Narrow" w:cs="Arial"/>
                 <w:b/>
+                <w:color w:val="EE0000"/>
                 <w:sz w:val="20"/>
                 <w:szCs w:val="20"/>
               </w:rPr>
-              <w:t>DIANA PATRICIA REYES CAMPOS</w:t>
+              <w:t>${USR_DESTINO}</w:t>
+            </w:r>
+          </w:p>
+          <w:p>
+            <w:pPr>
+              <w:widowControl/>
+              <w:rPr>
+                <w:rFonts w:ascii="Arial Narrow" w:eastAsia="Arial" w:hAnsi="Arial Narrow" w:cs="Arial"/>
+                <w:b/>
+                <w:sz w:val="20"/>
+                <w:szCs w:val="20"/>
+              </w:rPr>
+            </w:pPr>
+            <w:r>
+              <w:rPr>
+                <w:rFonts w:ascii="Arial Narrow" w:eastAsia="Arial" w:hAnsi="Arial Narrow" w:cs="Arial"/>
+                <w:bCs/>
+                <w:color w:val="EE0000"/>
+                <w:sz w:val="20"/>
+                <w:szCs w:val="20"/>
+              </w:rPr>
+              <w:t>${USR_DESTINO_CARGO}</w:t>
             </w:r>
             <w:r>
               <w:rPr>
@@ -468,20 +440,22 @@
               <w:rPr>
                 <w:rFonts w:ascii="Arial Narrow" w:eastAsia="Arial" w:hAnsi="Arial Narrow" w:cs="Arial"/>
                 <w:b/>
+                <w:color w:val="EE0000"/>
                 <w:sz w:val="20"/>
                 <w:szCs w:val="20"/>
               </w:rPr>
             </w:pPr>
-            <w:bookmarkStart w:id="1" w:name="_heading=h.gjdgxs" w:colFirst="0" w:colLast="0"/>
-            <w:bookmarkEnd w:id="1"/>
+            <w:bookmarkStart w:id="0" w:name="_heading=h.gjdgxs" w:colFirst="0" w:colLast="0"/>
+            <w:bookmarkEnd w:id="0"/>
             <w:r>
               <w:rPr>
                 <w:rFonts w:ascii="Arial Narrow" w:eastAsia="Arial" w:hAnsi="Arial Narrow" w:cs="Arial"/>
                 <w:b/>
+                <w:color w:val="EE0000"/>
                 <w:sz w:val="20"/>
                 <w:szCs w:val="20"/>
               </w:rPr>
-              <w:t>ALESSANDRA PAMELA BUSTAMANTE DURAND</w:t>
+              <w:t>${USR_ORIGEN}</w:t>
             </w:r>
           </w:p>
           <w:p>
@@ -503,10 +477,11 @@
             <w:r>
               <w:rPr>
                 <w:rFonts w:ascii="Arial Narrow" w:eastAsia="Arial" w:hAnsi="Arial Narrow" w:cs="Arial"/>
+                <w:color w:val="EE0000"/>
                 <w:sz w:val="20"/>
                 <w:szCs w:val="20"/>
               </w:rPr>
-              <w:t>Especialista en Procedimientos Comerciales y Publicidad Exterior</w:t>
+              <w:t>${USR_CARGO}</w:t>
             </w:r>
           </w:p>
         </w:tc>
@@ -1064,7 +1039,16 @@
           <w:sz w:val="20"/>
           <w:szCs w:val="20"/>
         </w:rPr>
-        <w:t xml:space="preserve"> ${DNI_RUC}/${DNI_CARNET_DE_EXT}; solicita la autorización para la ubicación e instalación de un (01) “Anuncio Simple”, en el frontis del predio, para lo cual se informa lo siguiente:</w:t>
+        <w:t xml:space="preserve"> ${DNI_RUC}/${DNI_CARNET_DE_EXT}; solicita la autorización para la ubicación e instalación de un </w:t>
+      </w:r>
+      <w:r>
+        <w:rPr>
+          <w:rFonts w:ascii="Arial Narrow" w:eastAsia="Arial" w:hAnsi="Arial Narrow" w:cs="Arial"/>
+          <w:sz w:val="20"/>
+          <w:szCs w:val="20"/>
+          <w:highlight w:val="yellow"/>
+        </w:rPr>
+        <w:t>(01) “Anuncio Simple”, en el frontis del predio, para lo cual se informa lo siguiente:</w:t>
       </w:r>
     </w:p>
     <w:p>
@@ -1454,8 +1438,16 @@
     <w:p>
       <w:pPr>
         <w:pStyle w:val="Prrafodelista"/>
-        <w:ind w:left="1080"/>
+        <w:ind w:left="1416" w:hanging="336"/>
         <w:jc w:val="both"/>
+        <w:rPr>
+          <w:rFonts w:ascii="Arial Narrow" w:hAnsi="Arial Narrow" w:cs="Arial"/>
+          <w:sz w:val="20"/>
+          <w:szCs w:val="20"/>
+          <w:lang w:bidi="hi-IN"/>
+        </w:rPr>
+      </w:pPr>
+      <w:r>
         <w:rPr>
           <w:rFonts w:ascii="Arial Narrow" w:eastAsia="Noto Sans CJK SC Regular" w:hAnsi="Arial Narrow" w:cs="Arial"/>
           <w:kern w:val="1"/>
@@ -1463,7 +1455,9 @@
           <w:szCs w:val="20"/>
           <w:lang w:eastAsia="hi-IN" w:bidi="hi-IN"/>
         </w:rPr>
-      </w:pPr>
+        <w:t>- Administrado</w:t>
+      </w:r>
+      <w:proofErr w:type="gramStart"/>
       <w:r>
         <w:rPr>
           <w:rFonts w:ascii="Arial Narrow" w:eastAsia="Noto Sans CJK SC Regular" w:hAnsi="Arial Narrow" w:cs="Arial"/>
@@ -1472,9 +1466,10 @@
           <w:szCs w:val="20"/>
           <w:lang w:eastAsia="hi-IN" w:bidi="hi-IN"/>
         </w:rPr>
-        <w:t>- Administrado</w:t>
-      </w:r>
-      <w:proofErr w:type="gramStart"/>
+        <w:tab/>
+        <w:t xml:space="preserve"> :</w:t>
+      </w:r>
+      <w:proofErr w:type="gramEnd"/>
       <w:r>
         <w:rPr>
           <w:rFonts w:ascii="Arial Narrow" w:eastAsia="Noto Sans CJK SC Regular" w:hAnsi="Arial Narrow" w:cs="Arial"/>
@@ -1483,10 +1478,8 @@
           <w:szCs w:val="20"/>
           <w:lang w:eastAsia="hi-IN" w:bidi="hi-IN"/>
         </w:rPr>
-        <w:tab/>
-        <w:t xml:space="preserve"> :</w:t>
-      </w:r>
-      <w:proofErr w:type="gramEnd"/>
+        <w:t xml:space="preserve"> </w:t>
+      </w:r>
       <w:r>
         <w:rPr>
           <w:rFonts w:ascii="Arial Narrow" w:eastAsia="Noto Sans CJK SC Regular" w:hAnsi="Arial Narrow" w:cs="Arial"/>
@@ -1495,7 +1488,35 @@
           <w:szCs w:val="20"/>
           <w:lang w:eastAsia="hi-IN" w:bidi="hi-IN"/>
         </w:rPr>
-        <w:t xml:space="preserve"> BRISA ASOCIADOS S.A.C.</w:t>
+        <w:t>${</w:t>
+      </w:r>
+      <w:r>
+        <w:rPr>
+          <w:rFonts w:ascii="Arial Narrow" w:hAnsi="Arial Narrow" w:cs="Arial"/>
+          <w:sz w:val="20"/>
+          <w:szCs w:val="20"/>
+          <w:lang w:bidi="hi-IN"/>
+        </w:rPr>
+        <w:t>SOLICITANTE</w:t>
+      </w:r>
+      <w:r>
+        <w:rPr>
+          <w:rFonts w:ascii="Arial Narrow" w:hAnsi="Arial Narrow" w:cs="Arial"/>
+          <w:sz w:val="20"/>
+          <w:szCs w:val="20"/>
+          <w:lang w:bidi="hi-IN"/>
+        </w:rPr>
+        <w:t>}</w:t>
+      </w:r>
+      <w:r>
+        <w:rPr>
+          <w:rFonts w:ascii="Arial Narrow" w:eastAsia="Noto Sans CJK SC Regular" w:hAnsi="Arial Narrow" w:cs="Arial"/>
+          <w:kern w:val="1"/>
+          <w:sz w:val="20"/>
+          <w:szCs w:val="20"/>
+          <w:lang w:eastAsia="hi-IN" w:bidi="hi-IN"/>
+        </w:rPr>
+        <w:t>.</w:t>
       </w:r>
     </w:p>
     <w:p>
@@ -2370,6 +2391,7 @@
           <w:rFonts w:ascii="Arial Narrow" w:eastAsia="Arial" w:hAnsi="Arial Narrow" w:cs="Arial"/>
           <w:sz w:val="20"/>
           <w:szCs w:val="20"/>
+          <w:highlight w:val="yellow"/>
         </w:rPr>
         <w:t>solicita la autorización para la ubicación e instalación de un (01) “aviso publicitario simple”</w:t>
       </w:r>
@@ -2379,8 +2401,18 @@
           <w:bCs/>
           <w:sz w:val="20"/>
           <w:szCs w:val="20"/>
-        </w:rPr>
-        <w:t>, para el predio ubicado en</w:t>
+          <w:highlight w:val="yellow"/>
+        </w:rPr>
+        <w:t>,</w:t>
+      </w:r>
+      <w:r>
+        <w:rPr>
+          <w:rFonts w:ascii="Arial Narrow" w:hAnsi="Arial Narrow" w:cs="Arial"/>
+          <w:bCs/>
+          <w:sz w:val="20"/>
+          <w:szCs w:val="20"/>
+        </w:rPr>
+        <w:t xml:space="preserve"> para el predio ubicado en</w:t>
       </w:r>
       <w:r>
         <w:rPr>
@@ -2541,7 +2573,7 @@
           <w:lang w:eastAsia="es-PE"/>
         </w:rPr>
       </w:pPr>
-      <w:bookmarkStart w:id="2" w:name="_Hlk71963377"/>
+      <w:bookmarkStart w:id="1" w:name="_Hlk71963377"/>
       <w:r>
         <w:rPr>
           <w:rFonts w:ascii="Arial Narrow" w:hAnsi="Arial Narrow" w:cs="Arial"/>
@@ -3147,7 +3179,7 @@
         </w:rPr>
         <w:t xml:space="preserve"> </w:t>
       </w:r>
-      <w:bookmarkEnd w:id="2"/>
+      <w:bookmarkEnd w:id="1"/>
       <w:r>
         <w:rPr>
           <w:rFonts w:ascii="Arial Narrow" w:hAnsi="Arial Narrow" w:cs="Arial"/>
@@ -3691,8 +3723,8 @@
           <w:szCs w:val="20"/>
         </w:rPr>
       </w:pPr>
-      <w:bookmarkStart w:id="3" w:name="_heading=h.30j0zll" w:colFirst="0" w:colLast="0"/>
-      <w:bookmarkEnd w:id="3"/>
+      <w:bookmarkStart w:id="2" w:name="_heading=h.30j0zll" w:colFirst="0" w:colLast="0"/>
+      <w:bookmarkEnd w:id="2"/>
       <w:r>
         <w:rPr>
           <w:rFonts w:ascii="Arial Narrow" w:eastAsia="Arial" w:hAnsi="Arial Narrow" w:cs="Arial"/>
@@ -4886,54 +4918,6 @@
     </w:p>
     <w:p>
       <w:pPr>
-        <w:tabs>
-          <w:tab w:val="left" w:pos="1985"/>
-          <w:tab w:val="left" w:pos="2127"/>
-        </w:tabs>
-        <w:jc w:val="center"/>
-        <w:rPr>
-          <w:rFonts w:ascii="Arial Narrow" w:hAnsi="Arial Narrow" w:cs="Arial"/>
-          <w:b/>
-          <w:sz w:val="18"/>
-          <w:szCs w:val="18"/>
-        </w:rPr>
-      </w:pPr>
-      <w:r>
-        <w:rPr>
-          <w:rFonts w:ascii="Arial Narrow" w:hAnsi="Arial Narrow" w:cs="Arial"/>
-          <w:b/>
-          <w:sz w:val="18"/>
-          <w:szCs w:val="18"/>
-        </w:rPr>
-        <w:t xml:space="preserve">ALESSANDRA PAMELA </w:t>
-      </w:r>
-    </w:p>
-    <w:p>
-      <w:pPr>
-        <w:tabs>
-          <w:tab w:val="left" w:pos="1985"/>
-          <w:tab w:val="left" w:pos="2127"/>
-        </w:tabs>
-        <w:jc w:val="center"/>
-        <w:rPr>
-          <w:rFonts w:ascii="Arial Narrow" w:hAnsi="Arial Narrow" w:cs="Arial"/>
-          <w:b/>
-          <w:sz w:val="18"/>
-          <w:szCs w:val="18"/>
-        </w:rPr>
-      </w:pPr>
-      <w:r>
-        <w:rPr>
-          <w:rFonts w:ascii="Arial Narrow" w:hAnsi="Arial Narrow" w:cs="Arial"/>
-          <w:b/>
-          <w:sz w:val="18"/>
-          <w:szCs w:val="18"/>
-        </w:rPr>
-        <w:t>BUSTAMANTE DURAND</w:t>
-      </w:r>
-    </w:p>
-    <w:p>
-      <w:pPr>
         <w:widowControl/>
         <w:pBdr>
           <w:top w:val="nil"/>
@@ -4948,8 +4932,19 @@
         <w:rPr>
           <w:rFonts w:ascii="Arial" w:eastAsia="Arial" w:hAnsi="Arial" w:cs="Arial"/>
           <w:b/>
-        </w:rPr>
-      </w:pPr>
+          <w:color w:val="EE0000"/>
+        </w:rPr>
+      </w:pPr>
+      <w:r>
+        <w:rPr>
+          <w:rFonts w:ascii="Arial Narrow" w:hAnsi="Arial Narrow" w:cs="Arial"/>
+          <w:b/>
+          <w:color w:val="EE0000"/>
+          <w:sz w:val="18"/>
+          <w:szCs w:val="18"/>
+        </w:rPr>
+        <w:t>${USR_ORIGEN}</w:t>
+      </w:r>
     </w:p>
     <w:sectPr>
       <w:headerReference w:type="default" r:id="rId10"/>
@@ -8425,7 +8420,6 @@
   <w:style w:type="character" w:default="1" w:styleId="Fuentedeprrafopredeter">
     <w:name w:val="Default Paragraph Font"/>
     <w:uiPriority w:val="1"/>
-    <w:semiHidden/>
     <w:unhideWhenUsed/>
   </w:style>
   <w:style w:type="table" w:default="1" w:styleId="Tablanormal">

</xml_diff>

<commit_message>
feat: implementar descarga e inserción de códigos QR desde SFTP para informes de anuncios
- Se agregó la dependencia 'league/flysystem-sftp-v3' para soporte de conexiones SFTP.
- Configuración del nuevo disco 'sftp_gestrad_qr' en 'config/filesystems.php' utilizando variables de entorno.
- Implementación del método 'getQrImageByInforme' en 'DatosTramiteService' para descargar temporalmente imágenes QR desde el servidor de Gestrad.
- Integración de la lógica de inserción de imagen QR en 'InformeAnuncioService', permitiendo incluir el código dinámicamente en el documento Word.
- Actualización de la plantilla 'template_informe_anuncio.docx' para soportar el marcador de posición de la imagen.
- Ajuste de versión de 'filament/filament' y actualización de 'composer.lock'.
</commit_message>
<xml_diff>
--- a/app/Filament/Clusters/Sil/Resources/Anuncios/Template/template_informe_anuncio.docx
+++ b/app/Filament/Clusters/Sil/Resources/Anuncios/Template/template_informe_anuncio.docx
@@ -944,15 +944,35 @@
           <w:sz w:val="20"/>
           <w:szCs w:val="20"/>
         </w:rPr>
-        <w:t>${SOLICITANTE}</w:t>
-      </w:r>
-      <w:r>
-        <w:rPr>
-          <w:rFonts w:ascii="Arial Narrow" w:eastAsia="Arial" w:hAnsi="Arial Narrow" w:cs="Arial"/>
-          <w:sz w:val="20"/>
-          <w:szCs w:val="20"/>
-        </w:rPr>
-        <w:t xml:space="preserve"> , con local comercial ubicado en ${DIRECCION_DEL_PREDIO_MATERIA_A_EVALUAR} Distrito de La Molina, representado por </w:t>
+        <w:t>${SOLICITANTE</w:t>
+      </w:r>
+      <w:proofErr w:type="gramStart"/>
+      <w:r>
+        <w:rPr>
+          <w:rFonts w:ascii="Arial Narrow" w:hAnsi="Arial Narrow" w:cs="Arial"/>
+          <w:b/>
+          <w:bCs/>
+          <w:sz w:val="20"/>
+          <w:szCs w:val="20"/>
+        </w:rPr>
+        <w:t>}</w:t>
+      </w:r>
+      <w:r>
+        <w:rPr>
+          <w:rFonts w:ascii="Arial Narrow" w:eastAsia="Arial" w:hAnsi="Arial Narrow" w:cs="Arial"/>
+          <w:sz w:val="20"/>
+          <w:szCs w:val="20"/>
+        </w:rPr>
+        <w:t xml:space="preserve"> ,</w:t>
+      </w:r>
+      <w:proofErr w:type="gramEnd"/>
+      <w:r>
+        <w:rPr>
+          <w:rFonts w:ascii="Arial Narrow" w:eastAsia="Arial" w:hAnsi="Arial Narrow" w:cs="Arial"/>
+          <w:sz w:val="20"/>
+          <w:szCs w:val="20"/>
+        </w:rPr>
+        <w:t xml:space="preserve"> con local comercial ubicado en ${DIRECCION_DEL_PREDIO_MATERIA_A_EVALUAR} Distrito de La Molina, representado por </w:t>
       </w:r>
       <w:r>
         <w:rPr>
@@ -1413,6 +1433,7 @@
         </w:rPr>
         <w:t>- Administrado</w:t>
       </w:r>
+      <w:proofErr w:type="gramStart"/>
       <w:r>
         <w:rPr>
           <w:rFonts w:ascii="Arial Narrow" w:eastAsia="Noto Sans CJK SC Regular" w:hAnsi="Arial Narrow" w:cs="Arial"/>
@@ -1422,7 +1443,18 @@
           <w:lang w:eastAsia="hi-IN" w:bidi="hi-IN"/>
         </w:rPr>
         <w:tab/>
-        <w:t xml:space="preserve"> : </w:t>
+        <w:t xml:space="preserve"> :</w:t>
+      </w:r>
+      <w:proofErr w:type="gramEnd"/>
+      <w:r>
+        <w:rPr>
+          <w:rFonts w:ascii="Arial Narrow" w:eastAsia="Noto Sans CJK SC Regular" w:hAnsi="Arial Narrow" w:cs="Arial"/>
+          <w:kern w:val="1"/>
+          <w:sz w:val="20"/>
+          <w:szCs w:val="20"/>
+          <w:lang w:eastAsia="hi-IN" w:bidi="hi-IN"/>
+        </w:rPr>
+        <w:t xml:space="preserve"> </w:t>
       </w:r>
       <w:r>
         <w:rPr>
@@ -1492,9 +1524,9 @@
           <w:szCs w:val="20"/>
           <w:lang w:eastAsia="hi-IN" w:bidi="hi-IN"/>
         </w:rPr>
-        <w:t>N°</w:t>
-      </w:r>
-      <w:proofErr w:type="spellEnd"/>
+        <w:t>N</w:t>
+      </w:r>
+      <w:proofErr w:type="gramStart"/>
       <w:r>
         <w:rPr>
           <w:rFonts w:ascii="Arial Narrow" w:eastAsia="Noto Sans CJK SC Regular" w:hAnsi="Arial Narrow" w:cs="Arial"/>
@@ -1503,7 +1535,29 @@
           <w:szCs w:val="20"/>
           <w:lang w:eastAsia="hi-IN" w:bidi="hi-IN"/>
         </w:rPr>
-        <w:t xml:space="preserve">  : ${DNI_RUC}</w:t>
+        <w:t>°</w:t>
+      </w:r>
+      <w:proofErr w:type="spellEnd"/>
+      <w:r>
+        <w:rPr>
+          <w:rFonts w:ascii="Arial Narrow" w:eastAsia="Noto Sans CJK SC Regular" w:hAnsi="Arial Narrow" w:cs="Arial"/>
+          <w:kern w:val="1"/>
+          <w:sz w:val="20"/>
+          <w:szCs w:val="20"/>
+          <w:lang w:eastAsia="hi-IN" w:bidi="hi-IN"/>
+        </w:rPr>
+        <w:t xml:space="preserve">  :</w:t>
+      </w:r>
+      <w:proofErr w:type="gramEnd"/>
+      <w:r>
+        <w:rPr>
+          <w:rFonts w:ascii="Arial Narrow" w:eastAsia="Noto Sans CJK SC Regular" w:hAnsi="Arial Narrow" w:cs="Arial"/>
+          <w:kern w:val="1"/>
+          <w:sz w:val="20"/>
+          <w:szCs w:val="20"/>
+          <w:lang w:eastAsia="hi-IN" w:bidi="hi-IN"/>
+        </w:rPr>
+        <w:t xml:space="preserve"> ${DNI_RUC}</w:t>
       </w:r>
     </w:p>
     <w:p>
@@ -1527,7 +1581,29 @@
           <w:szCs w:val="20"/>
           <w:lang w:eastAsia="hi-IN" w:bidi="hi-IN"/>
         </w:rPr>
-        <w:t xml:space="preserve">- Representante             : </w:t>
+        <w:t xml:space="preserve">- Representante           </w:t>
+      </w:r>
+      <w:proofErr w:type="gramStart"/>
+      <w:r>
+        <w:rPr>
+          <w:rFonts w:ascii="Arial Narrow" w:eastAsia="Noto Sans CJK SC Regular" w:hAnsi="Arial Narrow" w:cs="Arial"/>
+          <w:kern w:val="1"/>
+          <w:sz w:val="20"/>
+          <w:szCs w:val="20"/>
+          <w:lang w:eastAsia="hi-IN" w:bidi="hi-IN"/>
+        </w:rPr>
+        <w:t xml:space="preserve">  :</w:t>
+      </w:r>
+      <w:proofErr w:type="gramEnd"/>
+      <w:r>
+        <w:rPr>
+          <w:rFonts w:ascii="Arial Narrow" w:eastAsia="Noto Sans CJK SC Regular" w:hAnsi="Arial Narrow" w:cs="Arial"/>
+          <w:kern w:val="1"/>
+          <w:sz w:val="20"/>
+          <w:szCs w:val="20"/>
+          <w:lang w:eastAsia="hi-IN" w:bidi="hi-IN"/>
+        </w:rPr>
+        <w:t xml:space="preserve"> </w:t>
       </w:r>
       <w:r>
         <w:rPr>
@@ -1563,7 +1639,29 @@
           <w:szCs w:val="20"/>
           <w:lang w:eastAsia="hi-IN" w:bidi="hi-IN"/>
         </w:rPr>
-        <w:t>- DNI / C.E.                     : ${DNI_CARNET_DE_EXT}</w:t>
+        <w:t xml:space="preserve">- DNI / C.E.                   </w:t>
+      </w:r>
+      <w:proofErr w:type="gramStart"/>
+      <w:r>
+        <w:rPr>
+          <w:rFonts w:ascii="Arial Narrow" w:eastAsia="Noto Sans CJK SC Regular" w:hAnsi="Arial Narrow" w:cs="Arial"/>
+          <w:kern w:val="1"/>
+          <w:sz w:val="20"/>
+          <w:szCs w:val="20"/>
+          <w:lang w:eastAsia="hi-IN" w:bidi="hi-IN"/>
+        </w:rPr>
+        <w:t xml:space="preserve">  :</w:t>
+      </w:r>
+      <w:proofErr w:type="gramEnd"/>
+      <w:r>
+        <w:rPr>
+          <w:rFonts w:ascii="Arial Narrow" w:eastAsia="Noto Sans CJK SC Regular" w:hAnsi="Arial Narrow" w:cs="Arial"/>
+          <w:kern w:val="1"/>
+          <w:sz w:val="20"/>
+          <w:szCs w:val="20"/>
+          <w:lang w:eastAsia="hi-IN" w:bidi="hi-IN"/>
+        </w:rPr>
+        <w:t xml:space="preserve"> ${DNI_CARNET_DE_EXT}</w:t>
       </w:r>
     </w:p>
     <w:p>
@@ -1587,7 +1685,29 @@
           <w:szCs w:val="20"/>
           <w:lang w:eastAsia="hi-IN" w:bidi="hi-IN"/>
         </w:rPr>
-        <w:t>- Domicilio Legal            : ${DIRECCION_FISCAL}</w:t>
+        <w:t xml:space="preserve">- Domicilio Legal          </w:t>
+      </w:r>
+      <w:proofErr w:type="gramStart"/>
+      <w:r>
+        <w:rPr>
+          <w:rFonts w:ascii="Arial Narrow" w:eastAsia="Noto Sans CJK SC Regular" w:hAnsi="Arial Narrow" w:cs="Arial"/>
+          <w:kern w:val="1"/>
+          <w:sz w:val="20"/>
+          <w:szCs w:val="20"/>
+          <w:lang w:eastAsia="hi-IN" w:bidi="hi-IN"/>
+        </w:rPr>
+        <w:t xml:space="preserve">  :</w:t>
+      </w:r>
+      <w:proofErr w:type="gramEnd"/>
+      <w:r>
+        <w:rPr>
+          <w:rFonts w:ascii="Arial Narrow" w:eastAsia="Noto Sans CJK SC Regular" w:hAnsi="Arial Narrow" w:cs="Arial"/>
+          <w:kern w:val="1"/>
+          <w:sz w:val="20"/>
+          <w:szCs w:val="20"/>
+          <w:lang w:eastAsia="hi-IN" w:bidi="hi-IN"/>
+        </w:rPr>
+        <w:t xml:space="preserve"> ${DIRECCION_FISCAL}</w:t>
       </w:r>
     </w:p>
     <w:p>
@@ -1705,7 +1825,25 @@
           <w:szCs w:val="20"/>
         </w:rPr>
         <w:tab/>
-        <w:t xml:space="preserve">              : </w:t>
+        <w:t xml:space="preserve">            </w:t>
+      </w:r>
+      <w:proofErr w:type="gramStart"/>
+      <w:r>
+        <w:rPr>
+          <w:rFonts w:ascii="Arial Narrow" w:hAnsi="Arial Narrow" w:cs="Arial"/>
+          <w:sz w:val="20"/>
+          <w:szCs w:val="20"/>
+        </w:rPr>
+        <w:t xml:space="preserve">  :</w:t>
+      </w:r>
+      <w:proofErr w:type="gramEnd"/>
+      <w:r>
+        <w:rPr>
+          <w:rFonts w:ascii="Arial Narrow" w:hAnsi="Arial Narrow" w:cs="Arial"/>
+          <w:sz w:val="20"/>
+          <w:szCs w:val="20"/>
+        </w:rPr>
+        <w:t xml:space="preserve"> </w:t>
       </w:r>
       <w:r>
         <w:rPr>
@@ -1765,7 +1903,25 @@
           <w:szCs w:val="20"/>
         </w:rPr>
         <w:tab/>
-        <w:t xml:space="preserve">              : </w:t>
+        <w:t xml:space="preserve">            </w:t>
+      </w:r>
+      <w:proofErr w:type="gramStart"/>
+      <w:r>
+        <w:rPr>
+          <w:rFonts w:ascii="Arial Narrow" w:hAnsi="Arial Narrow" w:cs="Arial"/>
+          <w:sz w:val="20"/>
+          <w:szCs w:val="20"/>
+        </w:rPr>
+        <w:t xml:space="preserve">  :</w:t>
+      </w:r>
+      <w:proofErr w:type="gramEnd"/>
+      <w:r>
+        <w:rPr>
+          <w:rFonts w:ascii="Arial Narrow" w:hAnsi="Arial Narrow" w:cs="Arial"/>
+          <w:sz w:val="20"/>
+          <w:szCs w:val="20"/>
+        </w:rPr>
+        <w:t xml:space="preserve"> </w:t>
       </w:r>
       <w:r>
         <w:rPr>
@@ -1847,7 +2003,25 @@
           <w:sz w:val="20"/>
           <w:szCs w:val="20"/>
         </w:rPr>
-        <w:t xml:space="preserve">- RUC/TEL/CORREO    : </w:t>
+        <w:t xml:space="preserve">- RUC/TEL/CORREO  </w:t>
+      </w:r>
+      <w:proofErr w:type="gramStart"/>
+      <w:r>
+        <w:rPr>
+          <w:rFonts w:ascii="Arial Narrow" w:hAnsi="Arial Narrow" w:cs="Arial"/>
+          <w:sz w:val="20"/>
+          <w:szCs w:val="20"/>
+        </w:rPr>
+        <w:t xml:space="preserve">  :</w:t>
+      </w:r>
+      <w:proofErr w:type="gramEnd"/>
+      <w:r>
+        <w:rPr>
+          <w:rFonts w:ascii="Arial Narrow" w:hAnsi="Arial Narrow" w:cs="Arial"/>
+          <w:sz w:val="20"/>
+          <w:szCs w:val="20"/>
+        </w:rPr>
+        <w:t xml:space="preserve"> </w:t>
       </w:r>
       <w:r>
         <w:rPr>
@@ -2221,6 +2395,7 @@
           <w:sz w:val="20"/>
           <w:szCs w:val="20"/>
         </w:rPr>
+        <w:lastRenderedPageBreak/>
         <w:t>${</w:t>
       </w:r>
       <w:r>
@@ -2288,7 +2463,6 @@
           <w:sz w:val="20"/>
           <w:szCs w:val="20"/>
         </w:rPr>
-        <w:lastRenderedPageBreak/>
         <w:t xml:space="preserve">ANÁLISIS: </w:t>
       </w:r>
     </w:p>
@@ -3267,8 +3441,19 @@
           <w:sz w:val="20"/>
           <w:szCs w:val="20"/>
         </w:rPr>
-        <w:t>LEYENDA              :</w:t>
-      </w:r>
+        <w:t xml:space="preserve">LEYENDA            </w:t>
+      </w:r>
+      <w:proofErr w:type="gramStart"/>
+      <w:r>
+        <w:rPr>
+          <w:rFonts w:ascii="Arial Narrow" w:eastAsia="Arial" w:hAnsi="Arial Narrow" w:cs="Arial"/>
+          <w:b/>
+          <w:sz w:val="20"/>
+          <w:szCs w:val="20"/>
+        </w:rPr>
+        <w:t xml:space="preserve">  :</w:t>
+      </w:r>
+      <w:proofErr w:type="gramEnd"/>
       <w:r>
         <w:t xml:space="preserve"> </w:t>
       </w:r>
@@ -3462,6 +3647,7 @@
           <w:sz w:val="20"/>
           <w:szCs w:val="20"/>
         </w:rPr>
+        <w:lastRenderedPageBreak/>
         <w:t>COLOR</w:t>
       </w:r>
       <w:r>
@@ -3646,7 +3832,6 @@
           <w:sz w:val="20"/>
           <w:szCs w:val="20"/>
         </w:rPr>
-        <w:lastRenderedPageBreak/>
         <w:t xml:space="preserve">PANEL FOTOGRAFICO: </w:t>
       </w:r>
     </w:p>
@@ -3805,6 +3990,7 @@
                         <w:szCs w:val="18"/>
                       </w:rPr>
                     </w:pPr>
+                    <w:proofErr w:type="gramStart"/>
                     <w:r>
                       <w:rPr>
                         <w:rFonts w:ascii="Arial Narrow" w:hAnsi="Arial Narrow" w:cs="Arial"/>
@@ -3812,7 +3998,17 @@
                         <w:sz w:val="16"/>
                         <w:szCs w:val="16"/>
                       </w:rPr>
-                      <w:t xml:space="preserve">Vista  Frontal del Local Comercial </w:t>
+                      <w:t>Vista  Frontal</w:t>
+                    </w:r>
+                    <w:proofErr w:type="gramEnd"/>
+                    <w:r>
+                      <w:rPr>
+                        <w:rFonts w:ascii="Arial Narrow" w:hAnsi="Arial Narrow" w:cs="Arial"/>
+                        <w:bCs/>
+                        <w:sz w:val="16"/>
+                        <w:szCs w:val="16"/>
+                      </w:rPr>
+                      <w:t xml:space="preserve"> del Local Comercial </w:t>
                     </w:r>
                     <w:r>
                       <w:rPr>
@@ -4641,6 +4837,7 @@
           <w:sz w:val="18"/>
           <w:szCs w:val="18"/>
         </w:rPr>
+        <w:lastRenderedPageBreak/>
         <w:t xml:space="preserve">                                                                               __________________________________</w:t>
       </w:r>
     </w:p>
@@ -4673,8 +4870,12 @@
       </w:r>
     </w:p>
     <w:sectPr>
-      <w:headerReference w:type="default" r:id="rId10"/>
-      <w:footerReference w:type="default" r:id="rId11"/>
+      <w:headerReference w:type="even" r:id="rId10"/>
+      <w:headerReference w:type="default" r:id="rId11"/>
+      <w:footerReference w:type="even" r:id="rId12"/>
+      <w:footerReference w:type="default" r:id="rId13"/>
+      <w:headerReference w:type="first" r:id="rId14"/>
+      <w:footerReference w:type="first" r:id="rId15"/>
       <w:pgSz w:w="11906" w:h="16838"/>
       <w:pgMar w:top="1418" w:right="1274" w:bottom="1629" w:left="1417" w:header="567" w:footer="567" w:gutter="0"/>
       <w:pgNumType w:start="1"/>
@@ -4704,6 +4905,16 @@
 </file>
 
 <file path=word/footer1.xml><?xml version="1.0" encoding="utf-8"?>
+<w:ftr xmlns:wpc="http://schemas.microsoft.com/office/word/2010/wordprocessingCanvas" xmlns:cx="http://schemas.microsoft.com/office/drawing/2014/chartex" xmlns:cx1="http://schemas.microsoft.com/office/drawing/2015/9/8/chartex" xmlns:cx2="http://schemas.microsoft.com/office/drawing/2015/10/21/chartex" xmlns:cx3="http://schemas.microsoft.com/office/drawing/2016/5/9/chartex" xmlns:cx4="http://schemas.microsoft.com/office/drawing/2016/5/10/chartex" xmlns:cx5="http://schemas.microsoft.com/office/drawing/2016/5/11/chartex" xmlns:cx6="http://schemas.microsoft.com/office/drawing/2016/5/12/chartex" xmlns:cx7="http://schemas.microsoft.com/office/drawing/2016/5/13/chartex" xmlns:cx8="http://schemas.microsoft.com/office/drawing/2016/5/14/chartex" xmlns:mc="http://schemas.openxmlformats.org/markup-compatibility/2006" xmlns:aink="http://schemas.microsoft.com/office/drawing/2016/ink" xmlns:am3d="http://schemas.microsoft.com/office/drawing/2017/model3d" xmlns:o="urn:schemas-microsoft-com:office:office" xmlns:oel="http://schemas.microsoft.com/office/2019/extlst" xmlns:r="http://schemas.openxmlformats.org/officeDocument/2006/relationships" xmlns:m="http://schemas.openxmlformats.org/officeDocument/2006/math" xmlns:v="urn:schemas-microsoft-com:vml" xmlns:wp14="http://schemas.microsoft.com/office/word/2010/wordprocessingDrawing" xmlns:wp="http://schemas.openxmlformats.org/drawingml/2006/wordprocessingDrawing" xmlns:w10="urn:schemas-microsoft-com:office:word" xmlns:w="http://schemas.openxmlformats.org/wordprocessingml/2006/main" xmlns:w14="http://schemas.microsoft.com/office/word/2010/wordml" xmlns:w15="http://schemas.microsoft.com/office/word/2012/wordml" xmlns:w16cex="http://schemas.microsoft.com/office/word/2018/wordml/cex" xmlns:w16cid="http://schemas.microsoft.com/office/word/2016/wordml/cid" xmlns:w16="http://schemas.microsoft.com/office/word/2018/wordml" xmlns:w16du="http://schemas.microsoft.com/office/word/2023/wordml/word16du" xmlns:w16sdtdh="http://schemas.microsoft.com/office/word/2020/wordml/sdtdatahash" xmlns:w16sdtfl="http://schemas.microsoft.com/office/word/2024/wordml/sdtformatlock" xmlns:w16se="http://schemas.microsoft.com/office/word/2015/wordml/symex" xmlns:wpg="http://schemas.microsoft.com/office/word/2010/wordprocessingGroup" xmlns:wpi="http://schemas.microsoft.com/office/word/2010/wordprocessingInk" xmlns:wne="http://schemas.microsoft.com/office/word/2006/wordml" xmlns:wps="http://schemas.microsoft.com/office/word/2010/wordprocessingShape" mc:Ignorable="w14 w15 w16se w16cid w16 w16cex w16sdtdh w16sdtfl w16du wp14">
+  <w:p>
+    <w:pPr>
+      <w:pStyle w:val="Piedepgina"/>
+    </w:pPr>
+  </w:p>
+</w:ftr>
+</file>
+
+<file path=word/footer2.xml><?xml version="1.0" encoding="utf-8"?>
 <w:ftr xmlns:wpc="http://schemas.microsoft.com/office/word/2010/wordprocessingCanvas" xmlns:cx="http://schemas.microsoft.com/office/drawing/2014/chartex" xmlns:cx1="http://schemas.microsoft.com/office/drawing/2015/9/8/chartex" xmlns:cx2="http://schemas.microsoft.com/office/drawing/2015/10/21/chartex" xmlns:cx3="http://schemas.microsoft.com/office/drawing/2016/5/9/chartex" xmlns:cx4="http://schemas.microsoft.com/office/drawing/2016/5/10/chartex" xmlns:cx5="http://schemas.microsoft.com/office/drawing/2016/5/11/chartex" xmlns:cx6="http://schemas.microsoft.com/office/drawing/2016/5/12/chartex" xmlns:cx7="http://schemas.microsoft.com/office/drawing/2016/5/13/chartex" xmlns:cx8="http://schemas.microsoft.com/office/drawing/2016/5/14/chartex" xmlns:mc="http://schemas.openxmlformats.org/markup-compatibility/2006" xmlns:aink="http://schemas.microsoft.com/office/drawing/2016/ink" xmlns:am3d="http://schemas.microsoft.com/office/drawing/2017/model3d" xmlns:o="urn:schemas-microsoft-com:office:office" xmlns:oel="http://schemas.microsoft.com/office/2019/extlst" xmlns:r="http://schemas.openxmlformats.org/officeDocument/2006/relationships" xmlns:m="http://schemas.openxmlformats.org/officeDocument/2006/math" xmlns:v="urn:schemas-microsoft-com:vml" xmlns:wp14="http://schemas.microsoft.com/office/word/2010/wordprocessingDrawing" xmlns:wp="http://schemas.openxmlformats.org/drawingml/2006/wordprocessingDrawing" xmlns:w10="urn:schemas-microsoft-com:office:word" xmlns:w="http://schemas.openxmlformats.org/wordprocessingml/2006/main" xmlns:w14="http://schemas.microsoft.com/office/word/2010/wordml" xmlns:w15="http://schemas.microsoft.com/office/word/2012/wordml" xmlns:w16cex="http://schemas.microsoft.com/office/word/2018/wordml/cex" xmlns:w16cid="http://schemas.microsoft.com/office/word/2016/wordml/cid" xmlns:w16="http://schemas.microsoft.com/office/word/2018/wordml" xmlns:w16du="http://schemas.microsoft.com/office/word/2023/wordml/word16du" xmlns:w16sdtdh="http://schemas.microsoft.com/office/word/2020/wordml/sdtdatahash" xmlns:w16sdtfl="http://schemas.microsoft.com/office/word/2024/wordml/sdtformatlock" xmlns:w16se="http://schemas.microsoft.com/office/word/2015/wordml/symex" xmlns:wpg="http://schemas.microsoft.com/office/word/2010/wordprocessingGroup" xmlns:wpi="http://schemas.microsoft.com/office/word/2010/wordprocessingInk" xmlns:wne="http://schemas.microsoft.com/office/word/2006/wordml" xmlns:wps="http://schemas.microsoft.com/office/word/2010/wordprocessingShape" mc:Ignorable="w14 w15 w16se w16cid w16 w16cex w16sdtdh w16sdtfl w16du wp14">
   <w:p>
     <w:pPr>
@@ -4947,6 +5158,16 @@
 </w:ftr>
 </file>
 
+<file path=word/footer3.xml><?xml version="1.0" encoding="utf-8"?>
+<w:ftr xmlns:wpc="http://schemas.microsoft.com/office/word/2010/wordprocessingCanvas" xmlns:cx="http://schemas.microsoft.com/office/drawing/2014/chartex" xmlns:cx1="http://schemas.microsoft.com/office/drawing/2015/9/8/chartex" xmlns:cx2="http://schemas.microsoft.com/office/drawing/2015/10/21/chartex" xmlns:cx3="http://schemas.microsoft.com/office/drawing/2016/5/9/chartex" xmlns:cx4="http://schemas.microsoft.com/office/drawing/2016/5/10/chartex" xmlns:cx5="http://schemas.microsoft.com/office/drawing/2016/5/11/chartex" xmlns:cx6="http://schemas.microsoft.com/office/drawing/2016/5/12/chartex" xmlns:cx7="http://schemas.microsoft.com/office/drawing/2016/5/13/chartex" xmlns:cx8="http://schemas.microsoft.com/office/drawing/2016/5/14/chartex" xmlns:mc="http://schemas.openxmlformats.org/markup-compatibility/2006" xmlns:aink="http://schemas.microsoft.com/office/drawing/2016/ink" xmlns:am3d="http://schemas.microsoft.com/office/drawing/2017/model3d" xmlns:o="urn:schemas-microsoft-com:office:office" xmlns:oel="http://schemas.microsoft.com/office/2019/extlst" xmlns:r="http://schemas.openxmlformats.org/officeDocument/2006/relationships" xmlns:m="http://schemas.openxmlformats.org/officeDocument/2006/math" xmlns:v="urn:schemas-microsoft-com:vml" xmlns:wp14="http://schemas.microsoft.com/office/word/2010/wordprocessingDrawing" xmlns:wp="http://schemas.openxmlformats.org/drawingml/2006/wordprocessingDrawing" xmlns:w10="urn:schemas-microsoft-com:office:word" xmlns:w="http://schemas.openxmlformats.org/wordprocessingml/2006/main" xmlns:w14="http://schemas.microsoft.com/office/word/2010/wordml" xmlns:w15="http://schemas.microsoft.com/office/word/2012/wordml" xmlns:w16cex="http://schemas.microsoft.com/office/word/2018/wordml/cex" xmlns:w16cid="http://schemas.microsoft.com/office/word/2016/wordml/cid" xmlns:w16="http://schemas.microsoft.com/office/word/2018/wordml" xmlns:w16du="http://schemas.microsoft.com/office/word/2023/wordml/word16du" xmlns:w16sdtdh="http://schemas.microsoft.com/office/word/2020/wordml/sdtdatahash" xmlns:w16sdtfl="http://schemas.microsoft.com/office/word/2024/wordml/sdtformatlock" xmlns:w16se="http://schemas.microsoft.com/office/word/2015/wordml/symex" xmlns:wpg="http://schemas.microsoft.com/office/word/2010/wordprocessingGroup" xmlns:wpi="http://schemas.microsoft.com/office/word/2010/wordprocessingInk" xmlns:wne="http://schemas.microsoft.com/office/word/2006/wordml" xmlns:wps="http://schemas.microsoft.com/office/word/2010/wordprocessingShape" mc:Ignorable="w14 w15 w16se w16cid w16 w16cex w16sdtdh w16sdtfl w16du wp14">
+  <w:p>
+    <w:pPr>
+      <w:pStyle w:val="Piedepgina"/>
+    </w:pPr>
+  </w:p>
+</w:ftr>
+</file>
+
 <file path=word/footnotes.xml><?xml version="1.0" encoding="utf-8"?>
 <w:footnotes xmlns:wpc="http://schemas.microsoft.com/office/word/2010/wordprocessingCanvas" xmlns:cx="http://schemas.microsoft.com/office/drawing/2014/chartex" xmlns:cx1="http://schemas.microsoft.com/office/drawing/2015/9/8/chartex" xmlns:cx2="http://schemas.microsoft.com/office/drawing/2015/10/21/chartex" xmlns:cx3="http://schemas.microsoft.com/office/drawing/2016/5/9/chartex" xmlns:cx4="http://schemas.microsoft.com/office/drawing/2016/5/10/chartex" xmlns:cx5="http://schemas.microsoft.com/office/drawing/2016/5/11/chartex" xmlns:cx6="http://schemas.microsoft.com/office/drawing/2016/5/12/chartex" xmlns:cx7="http://schemas.microsoft.com/office/drawing/2016/5/13/chartex" xmlns:cx8="http://schemas.microsoft.com/office/drawing/2016/5/14/chartex" xmlns:mc="http://schemas.openxmlformats.org/markup-compatibility/2006" xmlns:aink="http://schemas.microsoft.com/office/drawing/2016/ink" xmlns:am3d="http://schemas.microsoft.com/office/drawing/2017/model3d" xmlns:o="urn:schemas-microsoft-com:office:office" xmlns:oel="http://schemas.microsoft.com/office/2019/extlst" xmlns:r="http://schemas.openxmlformats.org/officeDocument/2006/relationships" xmlns:m="http://schemas.openxmlformats.org/officeDocument/2006/math" xmlns:v="urn:schemas-microsoft-com:vml" xmlns:wp14="http://schemas.microsoft.com/office/word/2010/wordprocessingDrawing" xmlns:wp="http://schemas.openxmlformats.org/drawingml/2006/wordprocessingDrawing" xmlns:w10="urn:schemas-microsoft-com:office:word" xmlns:w="http://schemas.openxmlformats.org/wordprocessingml/2006/main" xmlns:w14="http://schemas.microsoft.com/office/word/2010/wordml" xmlns:w15="http://schemas.microsoft.com/office/word/2012/wordml" xmlns:w16cex="http://schemas.microsoft.com/office/word/2018/wordml/cex" xmlns:w16cid="http://schemas.microsoft.com/office/word/2016/wordml/cid" xmlns:w16="http://schemas.microsoft.com/office/word/2018/wordml" xmlns:w16du="http://schemas.microsoft.com/office/word/2023/wordml/word16du" xmlns:w16sdtdh="http://schemas.microsoft.com/office/word/2020/wordml/sdtdatahash" xmlns:w16sdtfl="http://schemas.microsoft.com/office/word/2024/wordml/sdtformatlock" xmlns:w16se="http://schemas.microsoft.com/office/word/2015/wordml/symex" xmlns:wpg="http://schemas.microsoft.com/office/word/2010/wordprocessingGroup" xmlns:wpi="http://schemas.microsoft.com/office/word/2010/wordprocessingInk" xmlns:wne="http://schemas.microsoft.com/office/word/2006/wordml" xmlns:wps="http://schemas.microsoft.com/office/word/2010/wordprocessingShape" mc:Ignorable="w14 w15 w16se w16cid w16 w16cex w16sdtdh w16sdtfl w16du wp14">
   <w:footnote w:type="separator" w:id="-1">
@@ -4970,196 +5191,235 @@
 <w:hdr xmlns:wpc="http://schemas.microsoft.com/office/word/2010/wordprocessingCanvas" xmlns:cx="http://schemas.microsoft.com/office/drawing/2014/chartex" xmlns:cx1="http://schemas.microsoft.com/office/drawing/2015/9/8/chartex" xmlns:cx2="http://schemas.microsoft.com/office/drawing/2015/10/21/chartex" xmlns:cx3="http://schemas.microsoft.com/office/drawing/2016/5/9/chartex" xmlns:cx4="http://schemas.microsoft.com/office/drawing/2016/5/10/chartex" xmlns:cx5="http://schemas.microsoft.com/office/drawing/2016/5/11/chartex" xmlns:cx6="http://schemas.microsoft.com/office/drawing/2016/5/12/chartex" xmlns:cx7="http://schemas.microsoft.com/office/drawing/2016/5/13/chartex" xmlns:cx8="http://schemas.microsoft.com/office/drawing/2016/5/14/chartex" xmlns:mc="http://schemas.openxmlformats.org/markup-compatibility/2006" xmlns:aink="http://schemas.microsoft.com/office/drawing/2016/ink" xmlns:am3d="http://schemas.microsoft.com/office/drawing/2017/model3d" xmlns:o="urn:schemas-microsoft-com:office:office" xmlns:oel="http://schemas.microsoft.com/office/2019/extlst" xmlns:r="http://schemas.openxmlformats.org/officeDocument/2006/relationships" xmlns:m="http://schemas.openxmlformats.org/officeDocument/2006/math" xmlns:v="urn:schemas-microsoft-com:vml" xmlns:wp14="http://schemas.microsoft.com/office/word/2010/wordprocessingDrawing" xmlns:wp="http://schemas.openxmlformats.org/drawingml/2006/wordprocessingDrawing" xmlns:w10="urn:schemas-microsoft-com:office:word" xmlns:w="http://schemas.openxmlformats.org/wordprocessingml/2006/main" xmlns:w14="http://schemas.microsoft.com/office/word/2010/wordml" xmlns:w15="http://schemas.microsoft.com/office/word/2012/wordml" xmlns:w16cex="http://schemas.microsoft.com/office/word/2018/wordml/cex" xmlns:w16cid="http://schemas.microsoft.com/office/word/2016/wordml/cid" xmlns:w16="http://schemas.microsoft.com/office/word/2018/wordml" xmlns:w16du="http://schemas.microsoft.com/office/word/2023/wordml/word16du" xmlns:w16sdtdh="http://schemas.microsoft.com/office/word/2020/wordml/sdtdatahash" xmlns:w16sdtfl="http://schemas.microsoft.com/office/word/2024/wordml/sdtformatlock" xmlns:w16se="http://schemas.microsoft.com/office/word/2015/wordml/symex" xmlns:wpg="http://schemas.microsoft.com/office/word/2010/wordprocessingGroup" xmlns:wpi="http://schemas.microsoft.com/office/word/2010/wordprocessingInk" xmlns:wne="http://schemas.microsoft.com/office/word/2006/wordml" xmlns:wps="http://schemas.microsoft.com/office/word/2010/wordprocessingShape" mc:Ignorable="w14 w15 w16se w16cid w16 w16cex w16sdtdh w16sdtfl w16du wp14">
   <w:p>
     <w:pPr>
-      <w:pStyle w:val="Normal1"/>
-      <w:tabs>
-        <w:tab w:val="left" w:pos="6765"/>
-      </w:tabs>
-      <w:ind w:right="332"/>
+      <w:pStyle w:val="Encabezado"/>
     </w:pPr>
-    <w:r>
-      <w:rPr>
-        <w:noProof/>
-        <w:color w:val="FFFFFF" w:themeColor="background1"/>
-      </w:rPr>
-      <w:drawing>
-        <wp:anchor distT="0" distB="0" distL="114300" distR="114300" simplePos="0" relativeHeight="251660288" behindDoc="1" locked="0" layoutInCell="1" allowOverlap="1" wp14:anchorId="7DBE68E6" wp14:editId="0CCB4A7A">
-          <wp:simplePos x="0" y="0"/>
-          <wp:positionH relativeFrom="column">
-            <wp:posOffset>-756920</wp:posOffset>
-          </wp:positionH>
-          <wp:positionV relativeFrom="paragraph">
-            <wp:posOffset>-255270</wp:posOffset>
-          </wp:positionV>
-          <wp:extent cx="2275840" cy="1043305"/>
-          <wp:effectExtent l="0" t="0" r="0" b="4445"/>
-          <wp:wrapNone/>
-          <wp:docPr id="7" name="Imagen 7"/>
-          <wp:cNvGraphicFramePr>
-            <a:graphicFrameLocks xmlns:a="http://schemas.openxmlformats.org/drawingml/2006/main" noChangeAspect="1"/>
-          </wp:cNvGraphicFramePr>
-          <a:graphic xmlns:a="http://schemas.openxmlformats.org/drawingml/2006/main">
-            <a:graphicData uri="http://schemas.openxmlformats.org/drawingml/2006/picture">
-              <pic:pic xmlns:pic="http://schemas.openxmlformats.org/drawingml/2006/picture">
-                <pic:nvPicPr>
-                  <pic:cNvPr id="3" name="Imagen 3"/>
-                  <pic:cNvPicPr/>
-                </pic:nvPicPr>
-                <pic:blipFill>
-                  <a:blip r:embed="rId1">
-                    <a:extLst>
-                      <a:ext uri="{28A0092B-C50C-407E-A947-70E740481C1C}">
-                        <a14:useLocalDpi xmlns:a14="http://schemas.microsoft.com/office/drawing/2010/main" val="0"/>
-                      </a:ext>
-                    </a:extLst>
-                  </a:blip>
-                  <a:stretch>
-                    <a:fillRect/>
-                  </a:stretch>
-                </pic:blipFill>
-                <pic:spPr>
-                  <a:xfrm>
-                    <a:off x="0" y="0"/>
-                    <a:ext cx="2275840" cy="1043305"/>
-                  </a:xfrm>
-                  <a:prstGeom prst="rect">
-                    <a:avLst/>
-                  </a:prstGeom>
-                </pic:spPr>
-              </pic:pic>
-            </a:graphicData>
-          </a:graphic>
-        </wp:anchor>
-      </w:drawing>
-    </w:r>
   </w:p>
-  <w:p>
-    <w:pPr>
-      <w:pStyle w:val="Normal1"/>
-      <w:ind w:left="567" w:right="332"/>
-      <w:rPr>
-        <w:rStyle w:val="Fuentedeprrafopredeter1"/>
-        <w:rFonts w:ascii="Arial" w:hAnsi="Arial" w:cs="Arial"/>
-        <w:b/>
-        <w:sz w:val="20"/>
-        <w:szCs w:val="23"/>
-      </w:rPr>
-    </w:pPr>
-    <w:r>
-      <w:rPr>
-        <w:noProof/>
-      </w:rPr>
-      <w:pict w14:anchorId="4DBF6688">
-        <v:shape id="5 Rectángulo" o:spid="_x0000_s1025" style="position:absolute;left:0;text-align:left;margin-left:2.15pt;margin-top:.85pt;width:132pt;height:49.5pt;z-index:251671552;visibility:visible;mso-wrap-style:square;mso-width-percent:0;mso-height-percent:0;mso-wrap-distance-left:9pt;mso-wrap-distance-top:0;mso-wrap-distance-right:9pt;mso-wrap-distance-bottom:0;mso-position-horizontal:absolute;mso-position-horizontal-relative:margin;mso-position-vertical:absolute;mso-position-vertical-relative:text;mso-width-percent:0;mso-height-percent:0;mso-width-relative:page;mso-height-relative:page;v-text-anchor:top" coordsize="21600,21600" o:spt="100" o:gfxdata="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" adj="-11796480,,5400" path="m,l21600,r,21600l,21600,,xe" filled="f" fillcolor="white [3212]" stroked="f" strokecolor="white [3212]" strokeweight=".71mm">
-          <v:stroke joinstyle="round"/>
-          <v:formulas/>
-          <v:path o:connecttype="custom" o:connectlocs="0,0;1676400,0;1676400,628650;0,628650" o:connectangles="0,0,0,0" textboxrect="0,0,21600,21600"/>
-          <v:textbox>
-            <w:txbxContent>
-              <w:p>
-                <w:pPr>
-                  <w:rPr>
-                    <w:rFonts w:ascii="Brandon Grotesque Black" w:hAnsi="Brandon Grotesque Black" w:cs="Arial"/>
-                    <w:color w:val="595959" w:themeColor="text1" w:themeTint="A6"/>
-                    <w:sz w:val="16"/>
-                    <w:szCs w:val="16"/>
-                  </w:rPr>
-                </w:pPr>
-                <w:r>
-                  <w:rPr>
-                    <w:rFonts w:ascii="Brandon Grotesque Black" w:hAnsi="Brandon Grotesque Black" w:cs="Arial"/>
-                    <w:color w:val="595959" w:themeColor="text1" w:themeTint="A6"/>
-                    <w:sz w:val="16"/>
-                    <w:szCs w:val="16"/>
-                  </w:rPr>
-                  <w:t>SUBGERENCIA DE PROMOCION EMPRESARIAL Y AUTORIZACIONES</w:t>
-                </w:r>
-              </w:p>
-            </w:txbxContent>
-          </v:textbox>
-          <w10:wrap anchorx="margin"/>
-        </v:shape>
-      </w:pict>
-    </w:r>
-    <w:r>
-      <w:rPr>
-        <w:rStyle w:val="Fuentedeprrafopredeter1"/>
-        <w:rFonts w:ascii="Arial" w:hAnsi="Arial" w:cs="Arial"/>
-        <w:b/>
-        <w:sz w:val="20"/>
-        <w:szCs w:val="23"/>
-      </w:rPr>
-      <w:tab/>
-      <w:t xml:space="preserve"> </w:t>
-    </w:r>
-    <w:r>
-      <w:rPr>
-        <w:rStyle w:val="Fuentedeprrafopredeter1"/>
-        <w:rFonts w:ascii="Arial" w:hAnsi="Arial" w:cs="Arial"/>
-        <w:b/>
-        <w:sz w:val="20"/>
-        <w:szCs w:val="23"/>
-      </w:rPr>
-      <w:tab/>
-    </w:r>
-  </w:p>
-  <w:p>
-    <w:pPr>
-      <w:pStyle w:val="Normal1"/>
-      <w:spacing w:line="360" w:lineRule="auto"/>
-      <w:ind w:left="567" w:right="332"/>
-    </w:pPr>
-    <w:r>
-      <w:rPr>
-        <w:rStyle w:val="Fuentedeprrafopredeter1"/>
-        <w:rFonts w:ascii="Arial" w:hAnsi="Arial" w:cs="Arial"/>
-        <w:b/>
-        <w:sz w:val="20"/>
-        <w:szCs w:val="23"/>
-      </w:rPr>
-      <w:tab/>
-    </w:r>
-    <w:r>
-      <w:rPr>
-        <w:rStyle w:val="Fuentedeprrafopredeter1"/>
-        <w:rFonts w:ascii="Arial" w:hAnsi="Arial" w:cs="Arial"/>
-        <w:b/>
-        <w:sz w:val="20"/>
-        <w:szCs w:val="23"/>
-      </w:rPr>
-      <w:tab/>
-    </w:r>
-    <w:r>
-      <w:rPr>
-        <w:rStyle w:val="Fuentedeprrafopredeter1"/>
-        <w:rFonts w:ascii="Arial" w:hAnsi="Arial" w:cs="Arial"/>
-        <w:b/>
-        <w:sz w:val="20"/>
-        <w:szCs w:val="23"/>
-      </w:rPr>
-      <w:tab/>
-    </w:r>
-    <w:r>
-      <w:rPr>
-        <w:rStyle w:val="Fuentedeprrafopredeter1"/>
-        <w:rFonts w:ascii="Arial" w:hAnsi="Arial" w:cs="Arial"/>
-        <w:b/>
-        <w:sz w:val="20"/>
-        <w:szCs w:val="23"/>
-      </w:rPr>
-      <w:tab/>
-    </w:r>
-    <w:r>
-      <w:rPr>
-        <w:rStyle w:val="Fuentedeprrafopredeter1"/>
-        <w:rFonts w:ascii="Arial" w:hAnsi="Arial" w:cs="Arial"/>
-        <w:b/>
-        <w:sz w:val="20"/>
-        <w:szCs w:val="23"/>
-      </w:rPr>
-      <w:tab/>
-      <w:t xml:space="preserve">     </w:t>
-    </w:r>
-  </w:p>
+</w:hdr>
+</file>
+
+<file path=word/header2.xml><?xml version="1.0" encoding="utf-8"?>
+<w:hdr xmlns:wpc="http://schemas.microsoft.com/office/word/2010/wordprocessingCanvas" xmlns:cx="http://schemas.microsoft.com/office/drawing/2014/chartex" xmlns:cx1="http://schemas.microsoft.com/office/drawing/2015/9/8/chartex" xmlns:cx2="http://schemas.microsoft.com/office/drawing/2015/10/21/chartex" xmlns:cx3="http://schemas.microsoft.com/office/drawing/2016/5/9/chartex" xmlns:cx4="http://schemas.microsoft.com/office/drawing/2016/5/10/chartex" xmlns:cx5="http://schemas.microsoft.com/office/drawing/2016/5/11/chartex" xmlns:cx6="http://schemas.microsoft.com/office/drawing/2016/5/12/chartex" xmlns:cx7="http://schemas.microsoft.com/office/drawing/2016/5/13/chartex" xmlns:cx8="http://schemas.microsoft.com/office/drawing/2016/5/14/chartex" xmlns:mc="http://schemas.openxmlformats.org/markup-compatibility/2006" xmlns:aink="http://schemas.microsoft.com/office/drawing/2016/ink" xmlns:am3d="http://schemas.microsoft.com/office/drawing/2017/model3d" xmlns:o="urn:schemas-microsoft-com:office:office" xmlns:oel="http://schemas.microsoft.com/office/2019/extlst" xmlns:r="http://schemas.openxmlformats.org/officeDocument/2006/relationships" xmlns:m="http://schemas.openxmlformats.org/officeDocument/2006/math" xmlns:v="urn:schemas-microsoft-com:vml" xmlns:wp14="http://schemas.microsoft.com/office/word/2010/wordprocessingDrawing" xmlns:wp="http://schemas.openxmlformats.org/drawingml/2006/wordprocessingDrawing" xmlns:w10="urn:schemas-microsoft-com:office:word" xmlns:w="http://schemas.openxmlformats.org/wordprocessingml/2006/main" xmlns:w14="http://schemas.microsoft.com/office/word/2010/wordml" xmlns:w15="http://schemas.microsoft.com/office/word/2012/wordml" xmlns:w16cex="http://schemas.microsoft.com/office/word/2018/wordml/cex" xmlns:w16cid="http://schemas.microsoft.com/office/word/2016/wordml/cid" xmlns:w16="http://schemas.microsoft.com/office/word/2018/wordml" xmlns:w16du="http://schemas.microsoft.com/office/word/2023/wordml/word16du" xmlns:w16sdtdh="http://schemas.microsoft.com/office/word/2020/wordml/sdtdatahash" xmlns:w16sdtfl="http://schemas.microsoft.com/office/word/2024/wordml/sdtformatlock" xmlns:w16se="http://schemas.microsoft.com/office/word/2015/wordml/symex" xmlns:wpg="http://schemas.microsoft.com/office/word/2010/wordprocessingGroup" xmlns:wpi="http://schemas.microsoft.com/office/word/2010/wordprocessingInk" xmlns:wne="http://schemas.microsoft.com/office/word/2006/wordml" xmlns:wps="http://schemas.microsoft.com/office/word/2010/wordprocessingShape" mc:Ignorable="w14 w15 w16se w16cid w16 w16cex w16sdtdh w16sdtfl w16du wp14">
+  <w:tbl>
+    <w:tblPr>
+      <w:tblStyle w:val="Tablaconcuadrcula"/>
+      <w:tblW w:w="11502" w:type="dxa"/>
+      <w:tblInd w:w="-1061" w:type="dxa"/>
+      <w:tblBorders>
+        <w:top w:val="none" w:sz="0" w:space="0" w:color="auto"/>
+        <w:left w:val="none" w:sz="0" w:space="0" w:color="auto"/>
+        <w:bottom w:val="none" w:sz="0" w:space="0" w:color="auto"/>
+        <w:right w:val="none" w:sz="0" w:space="0" w:color="auto"/>
+        <w:insideH w:val="none" w:sz="0" w:space="0" w:color="auto"/>
+        <w:insideV w:val="none" w:sz="0" w:space="0" w:color="auto"/>
+      </w:tblBorders>
+      <w:tblLook w:val="04A0" w:firstRow="1" w:lastRow="0" w:firstColumn="1" w:lastColumn="0" w:noHBand="0" w:noVBand="1"/>
+    </w:tblPr>
+    <w:tblGrid>
+      <w:gridCol w:w="3863"/>
+      <w:gridCol w:w="3819"/>
+      <w:gridCol w:w="3820"/>
+    </w:tblGrid>
+    <w:tr>
+      <w:trPr>
+        <w:trHeight w:val="1408"/>
+      </w:trPr>
+      <w:tc>
+        <w:tcPr>
+          <w:tcW w:w="3863" w:type="dxa"/>
+        </w:tcPr>
+        <w:p>
+          <w:pPr>
+            <w:pStyle w:val="Normal1"/>
+            <w:spacing w:line="360" w:lineRule="auto"/>
+            <w:ind w:right="332"/>
+          </w:pPr>
+          <w:r>
+            <w:rPr>
+              <w:rFonts w:eastAsiaTheme="minorEastAsia" w:cs="Times New Roman"/>
+              <w:kern w:val="0"/>
+            </w:rPr>
+            <w:pict w14:anchorId="7B37AB60">
+              <v:shape id="5 Rectángulo" o:spid="_x0000_s1031" style="position:absolute;margin-left:59.6pt;margin-top:35.55pt;width:132pt;height:49.5pt;z-index:251661312;visibility:visible;mso-wrap-style:square;mso-width-percent:0;mso-height-percent:0;mso-wrap-distance-left:9pt;mso-wrap-distance-top:0;mso-wrap-distance-right:9pt;mso-wrap-distance-bottom:0;mso-position-horizontal-relative:margin;mso-position-vertical-relative:text;mso-width-percent:0;mso-height-percent:0;mso-width-relative:page;mso-height-relative:page;v-text-anchor:top" coordsize="21600,21600" o:spt="100" o:gfxdata="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" adj="-11796480,,5400" path="m,l21600,r,21600l,21600,,xe" filled="f" fillcolor="white [3212]" stroked="f" strokecolor="white [3212]" strokeweight=".71mm">
+                <v:stroke joinstyle="round"/>
+                <v:formulas/>
+                <v:path o:connecttype="custom" o:connectlocs="0,0;1676400,0;1676400,628650;0,628650" o:connectangles="0,0,0,0" textboxrect="0,0,21600,21600"/>
+                <v:textbox style="mso-next-textbox:#5 Rectángulo">
+                  <w:txbxContent>
+                    <w:p>
+                      <w:pPr>
+                        <w:rPr>
+                          <w:rFonts w:ascii="Brandon Grotesque Black" w:hAnsi="Brandon Grotesque Black" w:cs="Arial"/>
+                          <w:color w:val="595959" w:themeColor="text1" w:themeTint="A6"/>
+                          <w:sz w:val="16"/>
+                          <w:szCs w:val="16"/>
+                        </w:rPr>
+                      </w:pPr>
+                      <w:r>
+                        <w:rPr>
+                          <w:rFonts w:ascii="Brandon Grotesque Black" w:hAnsi="Brandon Grotesque Black" w:cs="Arial"/>
+                          <w:color w:val="595959" w:themeColor="text1" w:themeTint="A6"/>
+                          <w:sz w:val="16"/>
+                          <w:szCs w:val="16"/>
+                        </w:rPr>
+                        <w:t>SUBGERENCIA DE PROMOCION EMPRESARIAL Y AUTORIZACIONES</w:t>
+                      </w:r>
+                    </w:p>
+                  </w:txbxContent>
+                </v:textbox>
+                <w10:wrap anchorx="margin"/>
+              </v:shape>
+            </w:pict>
+          </w:r>
+          <w:r>
+            <w:rPr>
+              <w:rStyle w:val="Fuentedeprrafopredeter1"/>
+              <w:rFonts w:ascii="Arial" w:hAnsi="Arial" w:cs="Arial"/>
+              <w:b/>
+              <w:sz w:val="20"/>
+              <w:szCs w:val="23"/>
+            </w:rPr>
+            <w:tab/>
+            <w:t xml:space="preserve"> </w:t>
+          </w:r>
+          <w:r>
+            <w:rPr>
+              <w:rStyle w:val="Fuentedeprrafopredeter1"/>
+              <w:rFonts w:ascii="Arial" w:hAnsi="Arial" w:cs="Arial"/>
+              <w:b/>
+              <w:sz w:val="20"/>
+              <w:szCs w:val="23"/>
+            </w:rPr>
+            <w:tab/>
+          </w:r>
+          <w:r>
+            <w:rPr>
+              <w:rStyle w:val="Fuentedeprrafopredeter1"/>
+              <w:rFonts w:ascii="Arial" w:hAnsi="Arial" w:cs="Arial"/>
+              <w:b/>
+              <w:sz w:val="20"/>
+              <w:szCs w:val="23"/>
+            </w:rPr>
+            <w:tab/>
+          </w:r>
+          <w:r>
+            <w:rPr>
+              <w:rStyle w:val="Fuentedeprrafopredeter1"/>
+              <w:rFonts w:ascii="Arial" w:hAnsi="Arial" w:cs="Arial"/>
+              <w:b/>
+              <w:sz w:val="20"/>
+              <w:szCs w:val="23"/>
+            </w:rPr>
+            <w:tab/>
+          </w:r>
+          <w:r>
+            <w:rPr>
+              <w:rStyle w:val="Fuentedeprrafopredeter1"/>
+              <w:rFonts w:ascii="Arial" w:hAnsi="Arial" w:cs="Arial"/>
+              <w:b/>
+              <w:sz w:val="20"/>
+              <w:szCs w:val="23"/>
+            </w:rPr>
+            <w:tab/>
+          </w:r>
+          <w:r>
+            <w:rPr>
+              <w:rStyle w:val="Fuentedeprrafopredeter1"/>
+              <w:rFonts w:ascii="Arial" w:hAnsi="Arial" w:cs="Arial"/>
+              <w:b/>
+              <w:sz w:val="20"/>
+              <w:szCs w:val="23"/>
+            </w:rPr>
+            <w:tab/>
+          </w:r>
+          <w:r>
+            <w:rPr>
+              <w:noProof/>
+              <w:color w:val="FFFFFF" w:themeColor="background1"/>
+            </w:rPr>
+            <w:drawing>
+              <wp:anchor distT="0" distB="0" distL="114300" distR="114300" simplePos="0" relativeHeight="251662336" behindDoc="1" locked="0" layoutInCell="1" allowOverlap="1" wp14:anchorId="716E983F" wp14:editId="10AE1BCC">
+                <wp:simplePos x="0" y="0"/>
+                <wp:positionH relativeFrom="column">
+                  <wp:posOffset>-4445</wp:posOffset>
+                </wp:positionH>
+                <wp:positionV relativeFrom="paragraph">
+                  <wp:posOffset>635</wp:posOffset>
+                </wp:positionV>
+                <wp:extent cx="2275840" cy="1043305"/>
+                <wp:effectExtent l="0" t="0" r="0" b="4445"/>
+                <wp:wrapNone/>
+                <wp:docPr id="7" name="Imagen 7"/>
+                <wp:cNvGraphicFramePr>
+                  <a:graphicFrameLocks xmlns:a="http://schemas.openxmlformats.org/drawingml/2006/main" noChangeAspect="1"/>
+                </wp:cNvGraphicFramePr>
+                <a:graphic xmlns:a="http://schemas.openxmlformats.org/drawingml/2006/main">
+                  <a:graphicData uri="http://schemas.openxmlformats.org/drawingml/2006/picture">
+                    <pic:pic xmlns:pic="http://schemas.openxmlformats.org/drawingml/2006/picture">
+                      <pic:nvPicPr>
+                        <pic:cNvPr id="3" name="Imagen 3"/>
+                        <pic:cNvPicPr/>
+                      </pic:nvPicPr>
+                      <pic:blipFill>
+                        <a:blip r:embed="rId1">
+                          <a:extLst>
+                            <a:ext uri="{28A0092B-C50C-407E-A947-70E740481C1C}">
+                              <a14:useLocalDpi xmlns:a14="http://schemas.microsoft.com/office/drawing/2010/main" val="0"/>
+                            </a:ext>
+                          </a:extLst>
+                        </a:blip>
+                        <a:stretch>
+                          <a:fillRect/>
+                        </a:stretch>
+                      </pic:blipFill>
+                      <pic:spPr>
+                        <a:xfrm>
+                          <a:off x="0" y="0"/>
+                          <a:ext cx="2275840" cy="1043305"/>
+                        </a:xfrm>
+                        <a:prstGeom prst="rect">
+                          <a:avLst/>
+                        </a:prstGeom>
+                      </pic:spPr>
+                    </pic:pic>
+                  </a:graphicData>
+                </a:graphic>
+              </wp:anchor>
+            </w:drawing>
+          </w:r>
+        </w:p>
+      </w:tc>
+      <w:tc>
+        <w:tcPr>
+          <w:tcW w:w="3819" w:type="dxa"/>
+        </w:tcPr>
+        <w:p>
+          <w:pPr>
+            <w:pStyle w:val="Normal1"/>
+            <w:tabs>
+              <w:tab w:val="left" w:pos="6765"/>
+            </w:tabs>
+            <w:ind w:right="332"/>
+            <w:jc w:val="center"/>
+          </w:pPr>
+          <w:r>
+            <w:t>${IMAGEN_QR}</w:t>
+          </w:r>
+        </w:p>
+      </w:tc>
+      <w:tc>
+        <w:tcPr>
+          <w:tcW w:w="3820" w:type="dxa"/>
+        </w:tcPr>
+        <w:p>
+          <w:pPr>
+            <w:pStyle w:val="Normal1"/>
+            <w:spacing w:line="360" w:lineRule="auto"/>
+            <w:ind w:right="332"/>
+          </w:pPr>
+        </w:p>
+      </w:tc>
+    </w:tr>
+  </w:tbl>
   <w:p>
     <w:pPr>
       <w:ind w:right="332"/>
@@ -5168,6 +5428,16 @@
         <w:sz w:val="20"/>
         <w:szCs w:val="20"/>
       </w:rPr>
+    </w:pPr>
+  </w:p>
+</w:hdr>
+</file>
+
+<file path=word/header3.xml><?xml version="1.0" encoding="utf-8"?>
+<w:hdr xmlns:wpc="http://schemas.microsoft.com/office/word/2010/wordprocessingCanvas" xmlns:cx="http://schemas.microsoft.com/office/drawing/2014/chartex" xmlns:cx1="http://schemas.microsoft.com/office/drawing/2015/9/8/chartex" xmlns:cx2="http://schemas.microsoft.com/office/drawing/2015/10/21/chartex" xmlns:cx3="http://schemas.microsoft.com/office/drawing/2016/5/9/chartex" xmlns:cx4="http://schemas.microsoft.com/office/drawing/2016/5/10/chartex" xmlns:cx5="http://schemas.microsoft.com/office/drawing/2016/5/11/chartex" xmlns:cx6="http://schemas.microsoft.com/office/drawing/2016/5/12/chartex" xmlns:cx7="http://schemas.microsoft.com/office/drawing/2016/5/13/chartex" xmlns:cx8="http://schemas.microsoft.com/office/drawing/2016/5/14/chartex" xmlns:mc="http://schemas.openxmlformats.org/markup-compatibility/2006" xmlns:aink="http://schemas.microsoft.com/office/drawing/2016/ink" xmlns:am3d="http://schemas.microsoft.com/office/drawing/2017/model3d" xmlns:o="urn:schemas-microsoft-com:office:office" xmlns:oel="http://schemas.microsoft.com/office/2019/extlst" xmlns:r="http://schemas.openxmlformats.org/officeDocument/2006/relationships" xmlns:m="http://schemas.openxmlformats.org/officeDocument/2006/math" xmlns:v="urn:schemas-microsoft-com:vml" xmlns:wp14="http://schemas.microsoft.com/office/word/2010/wordprocessingDrawing" xmlns:wp="http://schemas.openxmlformats.org/drawingml/2006/wordprocessingDrawing" xmlns:w10="urn:schemas-microsoft-com:office:word" xmlns:w="http://schemas.openxmlformats.org/wordprocessingml/2006/main" xmlns:w14="http://schemas.microsoft.com/office/word/2010/wordml" xmlns:w15="http://schemas.microsoft.com/office/word/2012/wordml" xmlns:w16cex="http://schemas.microsoft.com/office/word/2018/wordml/cex" xmlns:w16cid="http://schemas.microsoft.com/office/word/2016/wordml/cid" xmlns:w16="http://schemas.microsoft.com/office/word/2018/wordml" xmlns:w16du="http://schemas.microsoft.com/office/word/2023/wordml/word16du" xmlns:w16sdtdh="http://schemas.microsoft.com/office/word/2020/wordml/sdtdatahash" xmlns:w16sdtfl="http://schemas.microsoft.com/office/word/2024/wordml/sdtformatlock" xmlns:w16se="http://schemas.microsoft.com/office/word/2015/wordml/symex" xmlns:wpg="http://schemas.microsoft.com/office/word/2010/wordprocessingGroup" xmlns:wpi="http://schemas.microsoft.com/office/word/2010/wordprocessingInk" xmlns:wne="http://schemas.microsoft.com/office/word/2006/wordml" xmlns:wps="http://schemas.microsoft.com/office/word/2010/wordprocessingShape" mc:Ignorable="w14 w15 w16se w16cid w16 w16cex w16sdtdh w16sdtfl w16du wp14">
+  <w:p>
+    <w:pPr>
+      <w:pStyle w:val="Encabezado"/>
     </w:pPr>
   </w:p>
 </w:hdr>

</xml_diff>